<commit_message>
docs: update cv content
</commit_message>
<xml_diff>
--- a/Denisenko_Dmitry_CV.docx
+++ b/Denisenko_Dmitry_CV.docx
@@ -511,7 +511,23 @@
         <w:br/>
         <w:t>• 15+ years of professional experience in the IT industry - proficient developer on popular web and backend platforms (Spring Boot, Symfony, Magento, React, etc);</w:t>
         <w:br/>
-        <w:t>• Domain expert in e-commerce, retail, and  travel industries;</w:t>
+        <w:t>• Domain expert</w:t>
+      </w:r>
+      <w:r>
+        <w:rPr/>
+        <w:t>ise</w:t>
+      </w:r>
+      <w:r>
+        <w:rPr/>
+        <w:t xml:space="preserve"> in e-commerce, </w:t>
+      </w:r>
+      <w:r>
+        <w:rPr/>
+        <w:t>finance,</w:t>
+      </w:r>
+      <w:r>
+        <w:rPr/>
+        <w:t xml:space="preserve"> retail, and  travel industries;</w:t>
         <w:br/>
         <w:t>• Consulted global retail, investment companies as an IT industry expert in digital transformation and cloud computing;</w:t>
         <w:br/>
@@ -562,15 +578,7 @@
         <w:br/>
         <w:t>- team motivation, assistance on team member technical growth;</w:t>
         <w:br/>
-        <w:t xml:space="preserve">- </w:t>
-      </w:r>
-      <w:r>
-        <w:rPr/>
-        <w:t>f</w:t>
-      </w:r>
-      <w:r>
-        <w:rPr/>
-        <w:t xml:space="preserve">ollowing development methodology and processes (Agile, Scrum, SAFe, Kanban); </w:t>
+        <w:t xml:space="preserve">- following development methodology and processes (Agile, Scrum, SAFe, Kanban); </w:t>
       </w:r>
     </w:p>
     <w:p>
@@ -4702,15 +4710,15 @@
       <w:u w:val="single"/>
     </w:rPr>
   </w:style>
-  <w:style w:type="character" w:styleId="Bulletsuser">
-    <w:name w:val="Bullets (user)"/>
+  <w:style w:type="character" w:styleId="Bullets">
+    <w:name w:val="Bullets"/>
     <w:qFormat/>
     <w:rPr>
       <w:rFonts w:ascii="OpenSymbol" w:hAnsi="OpenSymbol" w:eastAsia="OpenSymbol" w:cs="OpenSymbol"/>
     </w:rPr>
   </w:style>
-  <w:style w:type="character" w:styleId="Bullets">
-    <w:name w:val="Bullets"/>
+  <w:style w:type="character" w:styleId="Bulletsuser">
+    <w:name w:val="Bullets (user)"/>
     <w:qFormat/>
     <w:rPr>
       <w:rFonts w:ascii="OpenSymbol" w:hAnsi="OpenSymbol" w:eastAsia="OpenSymbol" w:cs="OpenSymbol"/>

</xml_diff>

<commit_message>
docs: update cv docs content
</commit_message>
<xml_diff>
--- a/Denisenko_Dmitry_CV.docx
+++ b/Denisenko_Dmitry_CV.docx
@@ -511,25 +511,16 @@
         <w:br/>
         <w:t>• 15+ years of professional experience in the IT industry - proficient developer on popular web and backend platforms (Spring Boot, Symfony, Magento, React, etc);</w:t>
         <w:br/>
-        <w:t>• Domain expert</w:t>
-      </w:r>
-      <w:r>
-        <w:rPr/>
-        <w:t>ise</w:t>
-      </w:r>
-      <w:r>
-        <w:rPr/>
-        <w:t xml:space="preserve"> in e-commerce, </w:t>
-      </w:r>
-      <w:r>
-        <w:rPr/>
-        <w:t>finance,</w:t>
-      </w:r>
-      <w:r>
-        <w:rPr/>
-        <w:t xml:space="preserve"> retail, and  travel industries;</w:t>
+        <w:t>• Domain expertise in e-commerce, finance, retail, and  travel industries;</w:t>
         <w:br/>
         <w:t>• Consulted global retail, investment companies as an IT industry expert in digital transformation and cloud computing;</w:t>
+        <w:br/>
+        <w:t>• Experienced in building software development, QA/QA Automation, DevOps processes from scratch, and optimizing existing ones;</w:t>
+        <w:br/>
+        <w:t>• Business-oriented: I know how to balance between business needs and tech efforts to maximize the business value;</w:t>
+        <w:br/>
+        <w:t>• I am passionate about sharing some nice and suitable solutions to open source;</w:t>
+        <w:br/>
         <w:br/>
         <w:t>• Solid knowledge and hands-on experience in development for the Java platform and related technologies;</w:t>
         <w:br/>
@@ -556,19 +547,6 @@
         <w:t>• Deep understanding and hands-on experience with microservice architecture (autonomy, deployability, load balancing, fault tolerance, monitoring, etc.);</w:t>
         <w:br/>
         <w:t>• Experience with CI/CD (Jenkins, GitLab pipelines, Drone CI, GitHub Actions, etc.);</w:t>
-      </w:r>
-      <w:r>
-        <w:br w:type="page"/>
-      </w:r>
-    </w:p>
-    <w:p>
-      <w:pPr>
-        <w:pStyle w:val="Normal"/>
-        <w:spacing w:before="0" w:after="160"/>
-        <w:rPr/>
-      </w:pPr>
-      <w:r>
-        <w:rPr/>
         <w:br/>
         <w:t>• Team management skills:</w:t>
         <w:br/>
@@ -4710,15 +4688,15 @@
       <w:u w:val="single"/>
     </w:rPr>
   </w:style>
-  <w:style w:type="character" w:styleId="Bullets">
-    <w:name w:val="Bullets"/>
+  <w:style w:type="character" w:styleId="Bulletsuser">
+    <w:name w:val="Bullets (user)"/>
     <w:qFormat/>
     <w:rPr>
       <w:rFonts w:ascii="OpenSymbol" w:hAnsi="OpenSymbol" w:eastAsia="OpenSymbol" w:cs="OpenSymbol"/>
     </w:rPr>
   </w:style>
-  <w:style w:type="character" w:styleId="Bulletsuser">
-    <w:name w:val="Bullets (user)"/>
+  <w:style w:type="character" w:styleId="Bullets">
+    <w:name w:val="Bullets"/>
     <w:qFormat/>
     <w:rPr>
       <w:rFonts w:ascii="OpenSymbol" w:hAnsi="OpenSymbol" w:eastAsia="OpenSymbol" w:cs="OpenSymbol"/>

</xml_diff>

<commit_message>
docs: update cv docs
</commit_message>
<xml_diff>
--- a/Denisenko_Dmitry_CV.docx
+++ b/Denisenko_Dmitry_CV.docx
@@ -534,7 +534,7 @@
         <w:br/>
         <w:t>• Experience in gathering requirements, establishing development goals, estimating tasks and projects;</w:t>
         <w:br/>
-        <w:t>• Experience with DB abstraction layers and messaging services (Apache Kafka, RabbitMQ, JMS, etc.);</w:t>
+        <w:t>• Experience with DB abstraction layers (JDBC, Hibernate, JOOQ, + Liquibase, Flyway) and messaging services (Apache Kafka, RabbitMQ, JMS), etc.;</w:t>
         <w:br/>
         <w:t>• Experience with different modules of Spring Framework like Web, Webflux, Batch, JDBC, Data Couchbase, REST, Security, Spring Cloud (Task, Gateway, Config, Vault, Sleuth);</w:t>
         <w:br/>
@@ -4688,15 +4688,15 @@
       <w:u w:val="single"/>
     </w:rPr>
   </w:style>
-  <w:style w:type="character" w:styleId="Bulletsuser">
-    <w:name w:val="Bullets (user)"/>
+  <w:style w:type="character" w:styleId="Bullets">
+    <w:name w:val="Bullets"/>
     <w:qFormat/>
     <w:rPr>
       <w:rFonts w:ascii="OpenSymbol" w:hAnsi="OpenSymbol" w:eastAsia="OpenSymbol" w:cs="OpenSymbol"/>
     </w:rPr>
   </w:style>
-  <w:style w:type="character" w:styleId="Bullets">
-    <w:name w:val="Bullets"/>
+  <w:style w:type="character" w:styleId="Bulletsuser">
+    <w:name w:val="Bullets (user)"/>
     <w:qFormat/>
     <w:rPr>
       <w:rFonts w:ascii="OpenSymbol" w:hAnsi="OpenSymbol" w:eastAsia="OpenSymbol" w:cs="OpenSymbol"/>

</xml_diff>

<commit_message>
docs: update cv version for word
</commit_message>
<xml_diff>
--- a/Denisenko_Dmitry_CV.docx
+++ b/Denisenko_Dmitry_CV.docx
@@ -540,15 +540,7 @@
         <w:br/>
         <w:t>• Working experience in building ELT using Spring Boot, Kafka Streams, Apache Camel 4, Mapstruct, Commons HttpClient;</w:t>
         <w:br/>
-        <w:t>• Designing and implementing various REST API</w:t>
-      </w:r>
-      <w:r>
-        <w:rPr/>
-        <w:t>s</w:t>
-      </w:r>
-      <w:r>
-        <w:rPr/>
-        <w:t xml:space="preserve"> using best practices like idempotence, security, content negotiation, HATEOAS, versioning, etc.</w:t>
+        <w:t>• Designing and implementing various REST APIs using best practices like idempotence, security, content negotiation, HATEOAS, versioning, etc.</w:t>
         <w:br/>
         <w:t>• Experience with Kubernetes, OpenShift environments, AWS cloud services like EC2, S3, Cloudfront, EKS, and Fargate, and a capability with Google Cloud Run for multi-cloud;</w:t>
         <w:br/>
@@ -1250,6 +1242,81 @@
           <w:sz w:val="20"/>
         </w:rPr>
         <w:t>Analyzing, designing, and developing the in-house ETL engine and its modules;</w:t>
+      </w:r>
+    </w:p>
+    <w:p>
+      <w:pPr>
+        <w:pStyle w:val="Normal"/>
+        <w:numPr>
+          <w:ilvl w:val="0"/>
+          <w:numId w:val="1"/>
+        </w:numPr>
+        <w:spacing w:lineRule="auto" w:line="264" w:before="0" w:after="0"/>
+        <w:contextualSpacing/>
+        <w:jc w:val="both"/>
+        <w:rPr>
+          <w:rFonts w:ascii="Arial" w:hAnsi="Arial" w:eastAsia="Arial" w:cs="Arial"/>
+          <w:color w:val="231F20"/>
+          <w:sz w:val="20"/>
+        </w:rPr>
+      </w:pPr>
+      <w:r>
+        <w:rPr>
+          <w:rFonts w:eastAsia="Arial" w:cs="Arial" w:ascii="Arial" w:hAnsi="Arial"/>
+          <w:color w:val="231F20"/>
+          <w:sz w:val="20"/>
+        </w:rPr>
+        <w:t>Migrated 20+ applications from legacy Kubernetes instances to OpenShift 4, improving system scalability and reducing server costs</w:t>
+      </w:r>
+    </w:p>
+    <w:p>
+      <w:pPr>
+        <w:pStyle w:val="Normal"/>
+        <w:numPr>
+          <w:ilvl w:val="0"/>
+          <w:numId w:val="1"/>
+        </w:numPr>
+        <w:spacing w:lineRule="auto" w:line="264" w:before="0" w:after="0"/>
+        <w:contextualSpacing/>
+        <w:jc w:val="both"/>
+        <w:rPr>
+          <w:rFonts w:ascii="Arial" w:hAnsi="Arial" w:eastAsia="Arial" w:cs="Arial"/>
+          <w:color w:val="231F20"/>
+          <w:sz w:val="20"/>
+        </w:rPr>
+      </w:pPr>
+      <w:r>
+        <w:rPr>
+          <w:rFonts w:eastAsia="Arial" w:cs="Arial" w:ascii="Arial" w:hAnsi="Arial"/>
+          <w:color w:val="231F20"/>
+          <w:sz w:val="20"/>
+        </w:rPr>
+        <w:t>Implemented containerization strategies with a variety of Jenkinsfiles, Dockerfiles, podman</w:t>
+      </w:r>
+    </w:p>
+    <w:p>
+      <w:pPr>
+        <w:pStyle w:val="Normal"/>
+        <w:numPr>
+          <w:ilvl w:val="0"/>
+          <w:numId w:val="1"/>
+        </w:numPr>
+        <w:spacing w:lineRule="auto" w:line="264" w:before="0" w:after="0"/>
+        <w:contextualSpacing/>
+        <w:jc w:val="both"/>
+        <w:rPr>
+          <w:rFonts w:ascii="Arial" w:hAnsi="Arial" w:eastAsia="Arial" w:cs="Arial"/>
+          <w:color w:val="231F20"/>
+          <w:sz w:val="20"/>
+        </w:rPr>
+      </w:pPr>
+      <w:r>
+        <w:rPr>
+          <w:rFonts w:eastAsia="Arial" w:cs="Arial" w:ascii="Arial" w:hAnsi="Arial"/>
+          <w:color w:val="231F20"/>
+          <w:sz w:val="20"/>
+        </w:rPr>
+        <w:t>Developed monitoring and logging systems with Prometheus+Grafana+Loki+Promtail</w:t>
       </w:r>
     </w:p>
     <w:p>
@@ -4696,6 +4763,13 @@
       <w:u w:val="single"/>
     </w:rPr>
   </w:style>
+  <w:style w:type="character" w:styleId="Bullets">
+    <w:name w:val="Bullets"/>
+    <w:qFormat/>
+    <w:rPr>
+      <w:rFonts w:ascii="OpenSymbol" w:hAnsi="OpenSymbol" w:eastAsia="OpenSymbol" w:cs="OpenSymbol"/>
+    </w:rPr>
+  </w:style>
   <w:style w:type="character" w:styleId="Bulletsuser">
     <w:name w:val="Bullets (user)"/>
     <w:qFormat/>
@@ -4703,11 +4777,12 @@
       <w:rFonts w:ascii="OpenSymbol" w:hAnsi="OpenSymbol" w:eastAsia="OpenSymbol" w:cs="OpenSymbol"/>
     </w:rPr>
   </w:style>
-  <w:style w:type="character" w:styleId="Bullets">
-    <w:name w:val="Bullets"/>
+  <w:style w:type="character" w:styleId="Emphasis">
+    <w:name w:val="Emphasis"/>
     <w:qFormat/>
     <w:rPr>
-      <w:rFonts w:ascii="OpenSymbol" w:hAnsi="OpenSymbol" w:eastAsia="OpenSymbol" w:cs="OpenSymbol"/>
+      <w:i/>
+      <w:iCs/>
     </w:rPr>
   </w:style>
   <w:style w:type="paragraph" w:styleId="Heading">

</xml_diff>

<commit_message>
feat: update CV with the note about MCP
</commit_message>
<xml_diff>
--- a/Denisenko_Dmitry_CV.docx
+++ b/Denisenko_Dmitry_CV.docx
@@ -59,7 +59,7 @@
           <w:rFonts w:ascii="Arial" w:eastAsia="Arial" w:hAnsi="Arial" w:cs="Arial"/>
           <w:color w:val="999997"/>
         </w:rPr>
-        <w:t>Java Developer (API Integration/Development, eCommerce, ETL, SOA)</w:t>
+        <w:t>Backend Engineer | Team Lead | Java, ReactJS, DesOps, K8s, AWS</w:t>
       </w:r>
     </w:p>
     <w:p>
@@ -456,7 +456,13 @@
     <w:p>
       <w:r>
         <w:br/>
-        <w:t xml:space="preserve">• 15+ years of professional experience in the IT industry - proficient developer on popular web and backend platforms (Spring Boot, Symfony, Magento, React, </w:t>
+        <w:t xml:space="preserve">• 15+ years of professional experience in the IT industry - proficient developer on popular web and backend platforms (Spring </w:t>
+      </w:r>
+      <w:r>
+        <w:t>Framework ecosystem</w:t>
+      </w:r>
+      <w:r>
+        <w:t xml:space="preserve">, Symfony, Magento, React, </w:t>
       </w:r>
       <w:proofErr w:type="spellStart"/>
       <w:r>
@@ -465,6 +471,21 @@
       <w:proofErr w:type="spellEnd"/>
       <w:r>
         <w:t>);</w:t>
+      </w:r>
+      <w:r>
+        <w:br/>
+      </w:r>
+      <w:r>
+        <w:t xml:space="preserve">• 5 </w:t>
+      </w:r>
+      <w:r>
+        <w:t>years’ experience</w:t>
+      </w:r>
+      <w:r>
+        <w:t xml:space="preserve"> </w:t>
+      </w:r>
+      <w:r>
+        <w:t>with Java 11, 17, 21, Spring Boot 2 and 3, Spring Cloud, Camel 4, Kafka, Hibernate, microservices, etc.</w:t>
       </w:r>
       <w:r>
         <w:br/>
@@ -484,7 +505,10 @@
       </w:r>
       <w:r>
         <w:br/>
-        <w:t>• I am passionate about sharing some nice and suitable solutions to open source;</w:t>
+        <w:t>• I am passionate about sharing some nice and suitable solutions to open source</w:t>
+      </w:r>
+      <w:r>
+        <w:t>;</w:t>
       </w:r>
       <w:r>
         <w:br/>
@@ -583,6 +607,7 @@
       </w:r>
       <w:proofErr w:type="spellStart"/>
       <w:r>
+        <w:lastRenderedPageBreak/>
         <w:t>Fargate</w:t>
       </w:r>
       <w:proofErr w:type="spellEnd"/>
@@ -599,11 +624,7 @@
       </w:r>
       <w:proofErr w:type="spellEnd"/>
       <w:r>
-        <w:t xml:space="preserve">, load </w:t>
-      </w:r>
-      <w:r>
-        <w:lastRenderedPageBreak/>
-        <w:t>balancing, fault tolerance, monitoring, etc.);</w:t>
+        <w:t>, load balancing, fault tolerance, monitoring, etc.);</w:t>
       </w:r>
       <w:r>
         <w:br/>
@@ -2167,7 +2188,18 @@
           <w:szCs w:val="20"/>
           <w:shd w:val="clear" w:color="auto" w:fill="FFFFFF"/>
         </w:rPr>
-        <w:t>implements event-sourcing &amp; saga design patterns to manage distributed transactions across microservices. Also, a key point in development is that the application must be ready for a multi-cloud environment, so we have a restricted list of infrastructure tools &amp; instruments.</w:t>
+        <w:t>implements event-</w:t>
+      </w:r>
+      <w:r>
+        <w:rPr>
+          <w:rFonts w:ascii="Arial" w:eastAsia="Arial" w:hAnsi="Arial" w:cs="Arial"/>
+          <w:color w:val="061018"/>
+          <w:sz w:val="20"/>
+          <w:szCs w:val="20"/>
+          <w:shd w:val="clear" w:color="auto" w:fill="FFFFFF"/>
+        </w:rPr>
+        <w:lastRenderedPageBreak/>
+        <w:t>sourcing &amp; saga design patterns to manage distributed transactions across microservices. Also, a key point in development is that the application must be ready for a multi-cloud environment, so we have a restricted list of infrastructure tools &amp; instruments.</w:t>
       </w:r>
     </w:p>
     <w:p>
@@ -2192,7 +2224,6 @@
           <w:color w:val="231F20"/>
           <w:sz w:val="20"/>
         </w:rPr>
-        <w:lastRenderedPageBreak/>
         <w:t xml:space="preserve">Languages: </w:t>
       </w:r>
       <w:r>
@@ -3714,7 +3745,6 @@
           <w:color w:val="231F20"/>
           <w:sz w:val="20"/>
         </w:rPr>
-        <w:lastRenderedPageBreak/>
         <w:t>Client:</w:t>
       </w:r>
       <w:r>

</xml_diff>

<commit_message>
docs: update cv for printing
</commit_message>
<xml_diff>
--- a/Denisenko_Dmitry_CV.docx
+++ b/Denisenko_Dmitry_CV.docx
@@ -97,7 +97,14 @@
           <w:rFonts w:ascii="Arial" w:eastAsia="Arial" w:hAnsi="Arial" w:cs="Arial"/>
           <w:color w:val="231F20"/>
         </w:rPr>
-        <w:t>I'm a web developer interested in full-stack, event-driven microservices, DevOps, K8s architecture, and more</w:t>
+        <w:t>Results-driven Software Engineer with 5+ years of experience architecting, developing, and optimizing Java-based SaaS web applications, ETL pipelines, batch/stream processing, and API-driven integrations.</w:t>
+      </w:r>
+      <w:r>
+        <w:rPr>
+          <w:rFonts w:ascii="Arial" w:eastAsia="Arial" w:hAnsi="Arial" w:cs="Arial"/>
+          <w:color w:val="231F20"/>
+        </w:rPr>
+        <w:t xml:space="preserve"> </w:t>
       </w:r>
     </w:p>
     <w:p>
@@ -108,13 +115,42 @@
           <w:color w:val="231F20"/>
         </w:rPr>
       </w:pPr>
-      <w:r>
-        <w:rPr>
-          <w:rFonts w:ascii="Arial" w:eastAsia="Arial" w:hAnsi="Arial" w:cs="Arial"/>
-          <w:color w:val="231F20"/>
-        </w:rPr>
-        <w:br/>
-        <w:t>I really enjoy building open-source software, specializing in creating RESTful APIs, distributed services, ETL, batch data processing, and cloud-native apps.</w:t>
+    </w:p>
+    <w:p>
+      <w:pPr>
+        <w:spacing w:after="0" w:line="264" w:lineRule="auto"/>
+        <w:rPr>
+          <w:rFonts w:ascii="Arial" w:eastAsia="Arial" w:hAnsi="Arial" w:cs="Arial"/>
+          <w:color w:val="231F20"/>
+        </w:rPr>
+      </w:pPr>
+      <w:r>
+        <w:rPr>
+          <w:rFonts w:ascii="Arial" w:eastAsia="Arial" w:hAnsi="Arial" w:cs="Arial"/>
+          <w:color w:val="231F20"/>
+        </w:rPr>
+        <w:t>I'm interested in full-stack, event-driven microservices, DevOps, K8s architecture,</w:t>
+      </w:r>
+      <w:r>
+        <w:rPr>
+          <w:rFonts w:ascii="Arial" w:eastAsia="Arial" w:hAnsi="Arial" w:cs="Arial"/>
+          <w:color w:val="231F20"/>
+        </w:rPr>
+        <w:t xml:space="preserve"> AI-driven apps,</w:t>
+      </w:r>
+      <w:r>
+        <w:rPr>
+          <w:rFonts w:ascii="Arial" w:eastAsia="Arial" w:hAnsi="Arial" w:cs="Arial"/>
+          <w:color w:val="231F20"/>
+        </w:rPr>
+        <w:t xml:space="preserve"> and more</w:t>
+      </w:r>
+      <w:r>
+        <w:rPr>
+          <w:rFonts w:ascii="Arial" w:eastAsia="Arial" w:hAnsi="Arial" w:cs="Arial"/>
+          <w:color w:val="231F20"/>
+        </w:rPr>
+        <w:t>.</w:t>
       </w:r>
     </w:p>
     <w:p>
@@ -334,19 +370,8 @@
                   <w:bCs/>
                   <w:color w:val="1F4E79"/>
                 </w:rPr>
-                <w:t>github.com/</w:t>
+                <w:t>github.com/dimdnk</w:t>
               </w:r>
-              <w:proofErr w:type="spellStart"/>
-              <w:r>
-                <w:rPr>
-                  <w:rFonts w:ascii="Arial" w:eastAsia="Arial" w:hAnsi="Arial" w:cs="Arial"/>
-                  <w:b/>
-                  <w:bCs/>
-                  <w:color w:val="1F4E79"/>
-                </w:rPr>
-                <w:t>dimdnk</w:t>
-              </w:r>
-              <w:proofErr w:type="spellEnd"/>
             </w:hyperlink>
           </w:p>
         </w:tc>
@@ -412,19 +437,8 @@
                   <w:bCs/>
                   <w:color w:val="1F4E79"/>
                 </w:rPr>
-                <w:t>linkedin.com/in/</w:t>
+                <w:t>linkedin.com/in/dimdnk</w:t>
               </w:r>
-              <w:proofErr w:type="spellStart"/>
-              <w:r>
-                <w:rPr>
-                  <w:rFonts w:ascii="Arial" w:eastAsia="Arial" w:hAnsi="Arial" w:cs="Arial"/>
-                  <w:b/>
-                  <w:bCs/>
-                  <w:color w:val="1F4E79"/>
-                </w:rPr>
-                <w:t>dimdnk</w:t>
-              </w:r>
-              <w:proofErr w:type="spellEnd"/>
             </w:hyperlink>
           </w:p>
         </w:tc>
@@ -462,30 +476,11 @@
         <w:t>Framework ecosystem</w:t>
       </w:r>
       <w:r>
-        <w:t xml:space="preserve">, Symfony, Magento, React, </w:t>
-      </w:r>
-      <w:proofErr w:type="spellStart"/>
-      <w:r>
-        <w:t>etc</w:t>
-      </w:r>
-      <w:proofErr w:type="spellEnd"/>
-      <w:r>
-        <w:t>);</w:t>
+        <w:t>, Symfony, Magento, React, etc);</w:t>
       </w:r>
       <w:r>
         <w:br/>
-      </w:r>
-      <w:r>
-        <w:t xml:space="preserve">• 5 </w:t>
-      </w:r>
-      <w:r>
-        <w:t>years’ experience</w:t>
-      </w:r>
-      <w:r>
-        <w:t xml:space="preserve"> </w:t>
-      </w:r>
-      <w:r>
-        <w:t>with Java 11, 17, 21, Spring Boot 2 and 3, Spring Cloud, Camel 4, Kafka, Hibernate, microservices, etc.</w:t>
+        <w:t>• 5 years’ experience with Java 11, 17, 21, Spring Boot 2 and 3, Spring Cloud, Camel 4, Kafka, Hibernate, microservices, etc.</w:t>
       </w:r>
       <w:r>
         <w:br/>
@@ -523,23 +518,7 @@
       </w:r>
       <w:r>
         <w:br/>
-        <w:t xml:space="preserve">• Experience with Spring, </w:t>
-      </w:r>
-      <w:proofErr w:type="spellStart"/>
-      <w:r>
-        <w:t>Quarkus</w:t>
-      </w:r>
-      <w:proofErr w:type="spellEnd"/>
-      <w:r>
-        <w:t xml:space="preserve">, </w:t>
-      </w:r>
-      <w:proofErr w:type="spellStart"/>
-      <w:r>
-        <w:t>Vaadin</w:t>
-      </w:r>
-      <w:proofErr w:type="spellEnd"/>
-      <w:r>
-        <w:t>, Angular, Zend, and other MVC frameworks;</w:t>
+        <w:t>• Experience with Spring, Quarkus, Vaadin, Angular, Zend, and other MVC frameworks;</w:t>
       </w:r>
       <w:r>
         <w:br/>
@@ -559,35 +538,11 @@
       </w:r>
       <w:r>
         <w:br/>
-        <w:t xml:space="preserve">• Experience with different modules of Spring Framework like Web, </w:t>
-      </w:r>
-      <w:proofErr w:type="spellStart"/>
-      <w:r>
-        <w:t>Webflux</w:t>
-      </w:r>
-      <w:proofErr w:type="spellEnd"/>
-      <w:r>
-        <w:t>, Batch, JDBC, Data Couchbase, REST, Security, Spring Cloud (Task, Gateway, Config, Vault, Sleuth);</w:t>
+        <w:t>• Experience with different modules of Spring Framework like Web, Webflux, Batch, JDBC, Data Couchbase, REST, Security, Spring Cloud (Task, Gateway, Config, Vault, Sleuth);</w:t>
       </w:r>
       <w:r>
         <w:br/>
-        <w:t xml:space="preserve">• Working experience in building ELT using Spring Boot, Kafka Streams, Apache Camel 4, </w:t>
-      </w:r>
-      <w:proofErr w:type="spellStart"/>
-      <w:r>
-        <w:t>Mapstruct</w:t>
-      </w:r>
-      <w:proofErr w:type="spellEnd"/>
-      <w:r>
-        <w:t xml:space="preserve">, Commons </w:t>
-      </w:r>
-      <w:proofErr w:type="spellStart"/>
-      <w:r>
-        <w:t>HttpClient</w:t>
-      </w:r>
-      <w:proofErr w:type="spellEnd"/>
-      <w:r>
-        <w:t>;</w:t>
+        <w:t>• Working experience in building ELT using Spring Boot, Kafka Streams, Apache Camel 4, Mapstruct, Commons HttpClient;</w:t>
       </w:r>
       <w:r>
         <w:br/>
@@ -595,36 +550,15 @@
       </w:r>
       <w:r>
         <w:br/>
-        <w:t xml:space="preserve">• Experience with Kubernetes, OpenShift environments, AWS cloud services like EC2, S3, </w:t>
-      </w:r>
-      <w:proofErr w:type="spellStart"/>
-      <w:r>
-        <w:t>Cloudfront</w:t>
-      </w:r>
-      <w:proofErr w:type="spellEnd"/>
-      <w:r>
-        <w:t xml:space="preserve">, EKS, and </w:t>
-      </w:r>
-      <w:proofErr w:type="spellStart"/>
+        <w:t xml:space="preserve">• Experience with Kubernetes, OpenShift environments, AWS cloud services like EC2, S3, Cloudfront, EKS, and </w:t>
+      </w:r>
       <w:r>
         <w:lastRenderedPageBreak/>
-        <w:t>Fargate</w:t>
-      </w:r>
-      <w:proofErr w:type="spellEnd"/>
-      <w:r>
-        <w:t>, and a capability with Google Cloud Run for multi-cloud;</w:t>
+        <w:t>Fargate, and a capability with Google Cloud Run for multi-cloud;</w:t>
       </w:r>
       <w:r>
         <w:br/>
-        <w:t xml:space="preserve">• Deep understanding and hands-on experience with microservice architecture (autonomy, </w:t>
-      </w:r>
-      <w:proofErr w:type="spellStart"/>
-      <w:r>
-        <w:t>deployability</w:t>
-      </w:r>
-      <w:proofErr w:type="spellEnd"/>
-      <w:r>
-        <w:t>, load balancing, fault tolerance, monitoring, etc.);</w:t>
+        <w:t>• Deep understanding and hands-on experience with microservice architecture (autonomy, deployability, load balancing, fault tolerance, monitoring, etc.);</w:t>
       </w:r>
       <w:r>
         <w:br/>
@@ -648,15 +582,7 @@
       </w:r>
       <w:r>
         <w:br/>
-        <w:t xml:space="preserve">- following development methodology and processes (Agile, Scrum, </w:t>
-      </w:r>
-      <w:proofErr w:type="spellStart"/>
-      <w:r>
-        <w:t>SAFe</w:t>
-      </w:r>
-      <w:proofErr w:type="spellEnd"/>
-      <w:r>
-        <w:t xml:space="preserve">, Kanban); </w:t>
+        <w:t xml:space="preserve">- following development methodology and processes (Agile, Scrum, SAFe, Kanban); </w:t>
       </w:r>
     </w:p>
     <w:p>
@@ -946,7 +872,6 @@
           <w:sz w:val="20"/>
         </w:rPr>
       </w:pPr>
-      <w:proofErr w:type="spellStart"/>
       <w:r>
         <w:rPr>
           <w:rFonts w:ascii="Arial" w:eastAsia="Arial" w:hAnsi="Arial" w:cs="Arial"/>
@@ -957,7 +882,6 @@
         </w:rPr>
         <w:t>WellCart</w:t>
       </w:r>
-      <w:proofErr w:type="spellEnd"/>
     </w:p>
     <w:p>
       <w:pPr>
@@ -1252,47 +1176,26 @@
           <w:color w:val="231F20"/>
           <w:sz w:val="20"/>
         </w:rPr>
-        <w:t>Client</w:t>
-      </w:r>
-      <w:proofErr w:type="gramStart"/>
-      <w:r>
-        <w:rPr>
-          <w:rFonts w:ascii="Arial" w:eastAsia="Arial" w:hAnsi="Arial" w:cs="Arial"/>
-          <w:b/>
-          <w:bCs/>
-          <w:color w:val="231F20"/>
-          <w:sz w:val="20"/>
-        </w:rPr>
-        <w:t xml:space="preserve">: </w:t>
-      </w:r>
-      <w:r>
-        <w:rPr>
-          <w:rFonts w:ascii="Arial" w:eastAsia="Arial" w:hAnsi="Arial" w:cs="Arial"/>
-          <w:b/>
-          <w:bCs/>
-          <w:color w:val="231F20"/>
-          <w:sz w:val="20"/>
-        </w:rPr>
-        <w:tab/>
-      </w:r>
-      <w:r>
-        <w:rPr>
-          <w:rFonts w:ascii="Arial" w:eastAsia="Arial" w:hAnsi="Arial" w:cs="Arial"/>
-          <w:bCs/>
-          <w:color w:val="231F20"/>
-          <w:sz w:val="20"/>
-        </w:rPr>
-        <w:t>One</w:t>
-      </w:r>
-      <w:proofErr w:type="gramEnd"/>
-      <w:r>
-        <w:rPr>
-          <w:rFonts w:ascii="Arial" w:eastAsia="Arial" w:hAnsi="Arial" w:cs="Arial"/>
-          <w:bCs/>
-          <w:color w:val="231F20"/>
-          <w:sz w:val="20"/>
-        </w:rPr>
-        <w:t xml:space="preserve"> of Europe's largest asset managers</w:t>
+        <w:t xml:space="preserve">Client: </w:t>
+      </w:r>
+      <w:r>
+        <w:rPr>
+          <w:rFonts w:ascii="Arial" w:eastAsia="Arial" w:hAnsi="Arial" w:cs="Arial"/>
+          <w:b/>
+          <w:bCs/>
+          <w:color w:val="231F20"/>
+          <w:sz w:val="20"/>
+        </w:rPr>
+        <w:tab/>
+      </w:r>
+      <w:r>
+        <w:rPr>
+          <w:rFonts w:ascii="Arial" w:eastAsia="Arial" w:hAnsi="Arial" w:cs="Arial"/>
+          <w:bCs/>
+          <w:color w:val="231F20"/>
+          <w:sz w:val="20"/>
+        </w:rPr>
+        <w:t>One of Europe's largest asset managers</w:t>
       </w:r>
     </w:p>
     <w:p>
@@ -1316,47 +1219,26 @@
           <w:color w:val="231F20"/>
           <w:sz w:val="20"/>
         </w:rPr>
-        <w:t>Overview</w:t>
-      </w:r>
-      <w:proofErr w:type="gramStart"/>
-      <w:r>
-        <w:rPr>
-          <w:rFonts w:ascii="Arial" w:eastAsia="Arial" w:hAnsi="Arial" w:cs="Arial"/>
-          <w:b/>
-          <w:bCs/>
-          <w:color w:val="231F20"/>
-          <w:sz w:val="20"/>
-        </w:rPr>
-        <w:t xml:space="preserve">: </w:t>
-      </w:r>
-      <w:r>
-        <w:rPr>
-          <w:rFonts w:ascii="Arial" w:eastAsia="Arial" w:hAnsi="Arial" w:cs="Arial"/>
-          <w:b/>
-          <w:bCs/>
-          <w:color w:val="231F20"/>
-          <w:sz w:val="20"/>
-        </w:rPr>
-        <w:tab/>
-      </w:r>
-      <w:r>
-        <w:rPr>
-          <w:rFonts w:ascii="Arial" w:eastAsia="Arial" w:hAnsi="Arial" w:cs="Arial"/>
-          <w:bCs/>
-          <w:color w:val="231F20"/>
-          <w:sz w:val="20"/>
-        </w:rPr>
-        <w:t>The</w:t>
-      </w:r>
-      <w:proofErr w:type="gramEnd"/>
-      <w:r>
-        <w:rPr>
-          <w:rFonts w:ascii="Arial" w:eastAsia="Arial" w:hAnsi="Arial" w:cs="Arial"/>
-          <w:bCs/>
-          <w:color w:val="231F20"/>
-          <w:sz w:val="20"/>
-        </w:rPr>
-        <w:t xml:space="preserve"> project’s goal was to build, test, and maintain event-driven microservices using the Apache Camel framework, Kafka Streams, and Hibernate.</w:t>
+        <w:t xml:space="preserve">Overview: </w:t>
+      </w:r>
+      <w:r>
+        <w:rPr>
+          <w:rFonts w:ascii="Arial" w:eastAsia="Arial" w:hAnsi="Arial" w:cs="Arial"/>
+          <w:b/>
+          <w:bCs/>
+          <w:color w:val="231F20"/>
+          <w:sz w:val="20"/>
+        </w:rPr>
+        <w:tab/>
+      </w:r>
+      <w:r>
+        <w:rPr>
+          <w:rFonts w:ascii="Arial" w:eastAsia="Arial" w:hAnsi="Arial" w:cs="Arial"/>
+          <w:bCs/>
+          <w:color w:val="231F20"/>
+          <w:sz w:val="20"/>
+        </w:rPr>
+        <w:t>The project’s goal was to build, test, and maintain event-driven microservices using the Apache Camel framework, Kafka Streams, and Hibernate.</w:t>
       </w:r>
     </w:p>
     <w:p>
@@ -1393,25 +1275,14 @@
         </w:rPr>
         <w:tab/>
       </w:r>
-      <w:proofErr w:type="gramStart"/>
-      <w:r>
-        <w:rPr>
-          <w:rFonts w:ascii="Arial" w:eastAsia="Arial" w:hAnsi="Arial" w:cs="Arial"/>
-          <w:bCs/>
-          <w:color w:val="231F20"/>
-          <w:sz w:val="20"/>
-        </w:rPr>
-        <w:t>Java,  PL</w:t>
-      </w:r>
-      <w:proofErr w:type="gramEnd"/>
-      <w:r>
-        <w:rPr>
-          <w:rFonts w:ascii="Arial" w:eastAsia="Arial" w:hAnsi="Arial" w:cs="Arial"/>
-          <w:bCs/>
-          <w:color w:val="231F20"/>
-          <w:sz w:val="20"/>
-        </w:rPr>
-        <w:t>\SQL</w:t>
+      <w:r>
+        <w:rPr>
+          <w:rFonts w:ascii="Arial" w:eastAsia="Arial" w:hAnsi="Arial" w:cs="Arial"/>
+          <w:bCs/>
+          <w:color w:val="231F20"/>
+          <w:sz w:val="20"/>
+        </w:rPr>
+        <w:t>Java,  PL\SQL</w:t>
       </w:r>
     </w:p>
     <w:p>
@@ -1468,47 +1339,7 @@
           <w:color w:val="231F20"/>
           <w:sz w:val="20"/>
         </w:rPr>
-        <w:t xml:space="preserve">Spring Framework (Boot, Data), PostgreSQL, Hibernate, Apache Kafka, </w:t>
-      </w:r>
-      <w:proofErr w:type="spellStart"/>
-      <w:r>
-        <w:rPr>
-          <w:rFonts w:ascii="Arial" w:eastAsia="Arial" w:hAnsi="Arial" w:cs="Arial"/>
-          <w:bCs/>
-          <w:color w:val="231F20"/>
-          <w:sz w:val="20"/>
-        </w:rPr>
-        <w:t>Mapstruct</w:t>
-      </w:r>
-      <w:proofErr w:type="spellEnd"/>
-      <w:r>
-        <w:rPr>
-          <w:rFonts w:ascii="Arial" w:eastAsia="Arial" w:hAnsi="Arial" w:cs="Arial"/>
-          <w:bCs/>
-          <w:color w:val="231F20"/>
-          <w:sz w:val="20"/>
-        </w:rPr>
-        <w:t xml:space="preserve">, Apache Camel, JUnit, Mockito, Docker (Compose), OpenShift, Jenkins, SonarQube, </w:t>
-      </w:r>
-      <w:proofErr w:type="spellStart"/>
-      <w:r>
-        <w:rPr>
-          <w:rFonts w:ascii="Arial" w:eastAsia="Arial" w:hAnsi="Arial" w:cs="Arial"/>
-          <w:bCs/>
-          <w:color w:val="231F20"/>
-          <w:sz w:val="20"/>
-        </w:rPr>
-        <w:t>SpotBugs</w:t>
-      </w:r>
-      <w:proofErr w:type="spellEnd"/>
-      <w:r>
-        <w:rPr>
-          <w:rFonts w:ascii="Arial" w:eastAsia="Arial" w:hAnsi="Arial" w:cs="Arial"/>
-          <w:bCs/>
-          <w:color w:val="231F20"/>
-          <w:sz w:val="20"/>
-        </w:rPr>
-        <w:t>, PMD, Maven, etc.</w:t>
+        <w:t>Spring Framework (Boot, Data), PostgreSQL, Hibernate, Apache Kafka, Mapstruct, Apache Camel, JUnit, Mockito, Docker (Compose), OpenShift, Jenkins, SonarQube, SpotBugs, PMD, Maven, etc.</w:t>
       </w:r>
     </w:p>
     <w:p>
@@ -1533,18 +1364,7 @@
           <w:color w:val="231F20"/>
           <w:sz w:val="20"/>
         </w:rPr>
-        <w:t>Position</w:t>
-      </w:r>
-      <w:proofErr w:type="gramStart"/>
-      <w:r>
-        <w:rPr>
-          <w:rFonts w:ascii="Arial" w:eastAsia="Arial" w:hAnsi="Arial" w:cs="Arial"/>
-          <w:b/>
-          <w:bCs/>
-          <w:color w:val="231F20"/>
-          <w:sz w:val="20"/>
-        </w:rPr>
-        <w:t xml:space="preserve">: </w:t>
+        <w:t xml:space="preserve">Position: </w:t>
       </w:r>
       <w:r>
         <w:rPr>
@@ -1565,7 +1385,6 @@
         </w:rPr>
         <w:t>Senior</w:t>
       </w:r>
-      <w:proofErr w:type="gramEnd"/>
       <w:r>
         <w:rPr>
           <w:rFonts w:ascii="Arial" w:eastAsia="Arial" w:hAnsi="Arial" w:cs="Arial"/>
@@ -1649,18 +1468,8 @@
           <w:color w:val="231F20"/>
           <w:sz w:val="20"/>
         </w:rPr>
-        <w:t xml:space="preserve"> </w:t>
-      </w:r>
-      <w:proofErr w:type="gramStart"/>
-      <w:r>
-        <w:rPr>
-          <w:rFonts w:ascii="Arial" w:eastAsia="Arial" w:hAnsi="Arial" w:cs="Arial"/>
-          <w:color w:val="231F20"/>
-          <w:sz w:val="20"/>
-        </w:rPr>
-        <w:t>specifics;</w:t>
-      </w:r>
-      <w:proofErr w:type="gramEnd"/>
+        <w:t xml:space="preserve"> specifics;</w:t>
+      </w:r>
     </w:p>
     <w:p>
       <w:pPr>
@@ -1683,18 +1492,8 @@
           <w:color w:val="231F20"/>
           <w:sz w:val="20"/>
         </w:rPr>
-        <w:t xml:space="preserve">Constructing a business rules system from </w:t>
-      </w:r>
-      <w:proofErr w:type="gramStart"/>
-      <w:r>
-        <w:rPr>
-          <w:rFonts w:ascii="Arial" w:eastAsia="Arial" w:hAnsi="Arial" w:cs="Arial"/>
-          <w:color w:val="231F20"/>
-          <w:sz w:val="20"/>
-        </w:rPr>
-        <w:t>scratch;</w:t>
-      </w:r>
-      <w:proofErr w:type="gramEnd"/>
+        <w:t>Constructing a business rules system from scratch;</w:t>
+      </w:r>
     </w:p>
     <w:p>
       <w:pPr>
@@ -1717,18 +1516,8 @@
           <w:color w:val="231F20"/>
           <w:sz w:val="20"/>
         </w:rPr>
-        <w:t xml:space="preserve">Analyzing, designing, and developing the in-house ETL engine and its </w:t>
-      </w:r>
-      <w:proofErr w:type="gramStart"/>
-      <w:r>
-        <w:rPr>
-          <w:rFonts w:ascii="Arial" w:eastAsia="Arial" w:hAnsi="Arial" w:cs="Arial"/>
-          <w:color w:val="231F20"/>
-          <w:sz w:val="20"/>
-        </w:rPr>
-        <w:t>modules;</w:t>
-      </w:r>
-      <w:proofErr w:type="gramEnd"/>
+        <w:t>Analyzing, designing, and developing the in-house ETL engine and its modules;</w:t>
+      </w:r>
     </w:p>
     <w:p>
       <w:pPr>
@@ -1775,54 +1564,8 @@
           <w:color w:val="231F20"/>
           <w:sz w:val="20"/>
         </w:rPr>
-        <w:t xml:space="preserve">Implemented containerization strategies with a variety of </w:t>
-      </w:r>
-      <w:proofErr w:type="spellStart"/>
-      <w:r>
-        <w:rPr>
-          <w:rFonts w:ascii="Arial" w:eastAsia="Arial" w:hAnsi="Arial" w:cs="Arial"/>
-          <w:color w:val="231F20"/>
-          <w:sz w:val="20"/>
-        </w:rPr>
-        <w:t>Jenkinsfiles</w:t>
-      </w:r>
-      <w:proofErr w:type="spellEnd"/>
-      <w:r>
-        <w:rPr>
-          <w:rFonts w:ascii="Arial" w:eastAsia="Arial" w:hAnsi="Arial" w:cs="Arial"/>
-          <w:color w:val="231F20"/>
-          <w:sz w:val="20"/>
-        </w:rPr>
-        <w:t xml:space="preserve">, </w:t>
-      </w:r>
-      <w:proofErr w:type="spellStart"/>
-      <w:r>
-        <w:rPr>
-          <w:rFonts w:ascii="Arial" w:eastAsia="Arial" w:hAnsi="Arial" w:cs="Arial"/>
-          <w:color w:val="231F20"/>
-          <w:sz w:val="20"/>
-        </w:rPr>
-        <w:t>Dockerfiles</w:t>
-      </w:r>
-      <w:proofErr w:type="spellEnd"/>
-      <w:r>
-        <w:rPr>
-          <w:rFonts w:ascii="Arial" w:eastAsia="Arial" w:hAnsi="Arial" w:cs="Arial"/>
-          <w:color w:val="231F20"/>
-          <w:sz w:val="20"/>
-        </w:rPr>
-        <w:t xml:space="preserve">, </w:t>
-      </w:r>
-      <w:proofErr w:type="spellStart"/>
-      <w:r>
-        <w:rPr>
-          <w:rFonts w:ascii="Arial" w:eastAsia="Arial" w:hAnsi="Arial" w:cs="Arial"/>
-          <w:color w:val="231F20"/>
-          <w:sz w:val="20"/>
-        </w:rPr>
-        <w:t>podman</w:t>
-      </w:r>
-      <w:proofErr w:type="spellEnd"/>
+        <w:t>Implemented containerization strategies with a variety of Jenkinsfiles, Dockerfiles, podman</w:t>
+      </w:r>
     </w:p>
     <w:p>
       <w:pPr>
@@ -1845,18 +1588,8 @@
           <w:color w:val="231F20"/>
           <w:sz w:val="20"/>
         </w:rPr>
-        <w:t xml:space="preserve">Developed monitoring and logging systems with </w:t>
-      </w:r>
-      <w:proofErr w:type="spellStart"/>
-      <w:r>
-        <w:rPr>
-          <w:rFonts w:ascii="Arial" w:eastAsia="Arial" w:hAnsi="Arial" w:cs="Arial"/>
-          <w:color w:val="231F20"/>
-          <w:sz w:val="20"/>
-        </w:rPr>
-        <w:t>Prometheus+Grafana+Loki+Promtail</w:t>
-      </w:r>
-      <w:proofErr w:type="spellEnd"/>
+        <w:t>Developed monitoring and logging systems with Prometheus+Grafana+Loki+Promtail</w:t>
+      </w:r>
     </w:p>
     <w:p>
       <w:pPr>
@@ -1879,18 +1612,8 @@
           <w:color w:val="231F20"/>
           <w:sz w:val="20"/>
         </w:rPr>
-        <w:t xml:space="preserve">Keeping compliance with the code quality measurements and industry best </w:t>
-      </w:r>
-      <w:proofErr w:type="gramStart"/>
-      <w:r>
-        <w:rPr>
-          <w:rFonts w:ascii="Arial" w:eastAsia="Arial" w:hAnsi="Arial" w:cs="Arial"/>
-          <w:color w:val="231F20"/>
-          <w:sz w:val="20"/>
-        </w:rPr>
-        <w:t>practices;</w:t>
-      </w:r>
-      <w:proofErr w:type="gramEnd"/>
+        <w:t>Keeping compliance with the code quality measurements and industry best practices;</w:t>
+      </w:r>
     </w:p>
     <w:p>
       <w:pPr>
@@ -1913,18 +1636,8 @@
           <w:color w:val="231F20"/>
           <w:sz w:val="20"/>
         </w:rPr>
-        <w:t xml:space="preserve">Documenting of practice, processes, and </w:t>
-      </w:r>
-      <w:proofErr w:type="gramStart"/>
-      <w:r>
-        <w:rPr>
-          <w:rFonts w:ascii="Arial" w:eastAsia="Arial" w:hAnsi="Arial" w:cs="Arial"/>
-          <w:color w:val="231F20"/>
-          <w:sz w:val="20"/>
-        </w:rPr>
-        <w:t>software;</w:t>
-      </w:r>
-      <w:proofErr w:type="gramEnd"/>
+        <w:t>Documenting of practice, processes, and software;</w:t>
+      </w:r>
     </w:p>
     <w:p>
       <w:pPr>
@@ -1947,18 +1660,8 @@
           <w:color w:val="231F20"/>
           <w:sz w:val="20"/>
         </w:rPr>
-        <w:t xml:space="preserve">Ensuring proper implementation of changes in accordance with agreed Change Management </w:t>
-      </w:r>
-      <w:proofErr w:type="gramStart"/>
-      <w:r>
-        <w:rPr>
-          <w:rFonts w:ascii="Arial" w:eastAsia="Arial" w:hAnsi="Arial" w:cs="Arial"/>
-          <w:color w:val="231F20"/>
-          <w:sz w:val="20"/>
-        </w:rPr>
-        <w:t>procedures;</w:t>
-      </w:r>
-      <w:proofErr w:type="gramEnd"/>
+        <w:t>Ensuring proper implementation of changes in accordance with agreed Change Management procedures;</w:t>
+      </w:r>
     </w:p>
     <w:p>
       <w:pPr>
@@ -2052,47 +1755,26 @@
           <w:color w:val="231F20"/>
           <w:sz w:val="20"/>
         </w:rPr>
-        <w:t>Client</w:t>
-      </w:r>
-      <w:proofErr w:type="gramStart"/>
-      <w:r>
-        <w:rPr>
-          <w:rFonts w:ascii="Arial" w:eastAsia="Arial" w:hAnsi="Arial" w:cs="Arial"/>
-          <w:b/>
-          <w:bCs/>
-          <w:color w:val="231F20"/>
-          <w:sz w:val="20"/>
-        </w:rPr>
-        <w:t xml:space="preserve">: </w:t>
-      </w:r>
-      <w:r>
-        <w:rPr>
-          <w:rFonts w:ascii="Arial" w:eastAsia="Arial" w:hAnsi="Arial" w:cs="Arial"/>
-          <w:b/>
-          <w:bCs/>
-          <w:color w:val="231F20"/>
-          <w:sz w:val="20"/>
-        </w:rPr>
-        <w:tab/>
-      </w:r>
-      <w:r>
-        <w:rPr>
-          <w:rFonts w:ascii="Arial" w:eastAsia="Arial" w:hAnsi="Arial" w:cs="Arial"/>
-          <w:bCs/>
-          <w:color w:val="231F20"/>
-          <w:sz w:val="20"/>
-        </w:rPr>
-        <w:t>Home</w:t>
-      </w:r>
-      <w:proofErr w:type="gramEnd"/>
-      <w:r>
-        <w:rPr>
-          <w:rFonts w:ascii="Arial" w:eastAsia="Arial" w:hAnsi="Arial" w:cs="Arial"/>
-          <w:bCs/>
-          <w:color w:val="231F20"/>
-          <w:sz w:val="20"/>
-        </w:rPr>
-        <w:t xml:space="preserve"> improvement and gardening retailer</w:t>
+        <w:t xml:space="preserve">Client: </w:t>
+      </w:r>
+      <w:r>
+        <w:rPr>
+          <w:rFonts w:ascii="Arial" w:eastAsia="Arial" w:hAnsi="Arial" w:cs="Arial"/>
+          <w:b/>
+          <w:bCs/>
+          <w:color w:val="231F20"/>
+          <w:sz w:val="20"/>
+        </w:rPr>
+        <w:tab/>
+      </w:r>
+      <w:r>
+        <w:rPr>
+          <w:rFonts w:ascii="Arial" w:eastAsia="Arial" w:hAnsi="Arial" w:cs="Arial"/>
+          <w:bCs/>
+          <w:color w:val="231F20"/>
+          <w:sz w:val="20"/>
+        </w:rPr>
+        <w:t>Home improvement and gardening retailer</w:t>
       </w:r>
       <w:r>
         <w:rPr>
@@ -2128,47 +1810,26 @@
           <w:color w:val="231F20"/>
           <w:sz w:val="20"/>
         </w:rPr>
-        <w:t>Overview</w:t>
-      </w:r>
-      <w:proofErr w:type="gramStart"/>
-      <w:r>
-        <w:rPr>
-          <w:rFonts w:ascii="Arial" w:eastAsia="Arial" w:hAnsi="Arial" w:cs="Arial"/>
-          <w:b/>
-          <w:bCs/>
-          <w:color w:val="231F20"/>
-          <w:sz w:val="20"/>
-        </w:rPr>
-        <w:t xml:space="preserve">: </w:t>
-      </w:r>
-      <w:r>
-        <w:rPr>
-          <w:rFonts w:ascii="Arial" w:eastAsia="Arial" w:hAnsi="Arial" w:cs="Arial"/>
-          <w:b/>
-          <w:bCs/>
-          <w:color w:val="231F20"/>
-          <w:sz w:val="20"/>
-        </w:rPr>
-        <w:tab/>
-      </w:r>
-      <w:r>
-        <w:rPr>
-          <w:rFonts w:ascii="Arial" w:eastAsia="Arial" w:hAnsi="Arial" w:cs="Arial"/>
-          <w:bCs/>
-          <w:color w:val="231F20"/>
-          <w:sz w:val="20"/>
-        </w:rPr>
-        <w:t>Enterprise</w:t>
-      </w:r>
-      <w:proofErr w:type="gramEnd"/>
-      <w:r>
-        <w:rPr>
-          <w:rFonts w:ascii="Arial" w:eastAsia="Arial" w:hAnsi="Arial" w:cs="Arial"/>
-          <w:bCs/>
-          <w:color w:val="231F20"/>
-          <w:sz w:val="20"/>
-        </w:rPr>
-        <w:t xml:space="preserve"> product information management (PIM) software provides a single place to collect, manage, and enrich product information, create a product catalog, and distribute it to sales and eCommerce channels. </w:t>
+        <w:t xml:space="preserve">Overview: </w:t>
+      </w:r>
+      <w:r>
+        <w:rPr>
+          <w:rFonts w:ascii="Arial" w:eastAsia="Arial" w:hAnsi="Arial" w:cs="Arial"/>
+          <w:b/>
+          <w:bCs/>
+          <w:color w:val="231F20"/>
+          <w:sz w:val="20"/>
+        </w:rPr>
+        <w:tab/>
+      </w:r>
+      <w:r>
+        <w:rPr>
+          <w:rFonts w:ascii="Arial" w:eastAsia="Arial" w:hAnsi="Arial" w:cs="Arial"/>
+          <w:bCs/>
+          <w:color w:val="231F20"/>
+          <w:sz w:val="20"/>
+        </w:rPr>
+        <w:t xml:space="preserve">Enterprise product information management (PIM) software provides a single place to collect, manage, and enrich product information, create a product catalog, and distribute it to sales and eCommerce channels. </w:t>
       </w:r>
       <w:r>
         <w:rPr>
@@ -2236,25 +1897,14 @@
         </w:rPr>
         <w:tab/>
       </w:r>
-      <w:proofErr w:type="gramStart"/>
-      <w:r>
-        <w:rPr>
-          <w:rFonts w:ascii="Arial" w:eastAsia="Arial" w:hAnsi="Arial" w:cs="Arial"/>
-          <w:bCs/>
-          <w:color w:val="231F20"/>
-          <w:sz w:val="20"/>
-        </w:rPr>
-        <w:t>Java,  PL</w:t>
-      </w:r>
-      <w:proofErr w:type="gramEnd"/>
-      <w:r>
-        <w:rPr>
-          <w:rFonts w:ascii="Arial" w:eastAsia="Arial" w:hAnsi="Arial" w:cs="Arial"/>
-          <w:bCs/>
-          <w:color w:val="231F20"/>
-          <w:sz w:val="20"/>
-        </w:rPr>
-        <w:t>\SQL, Node, JavaScript, TypeScript</w:t>
+      <w:r>
+        <w:rPr>
+          <w:rFonts w:ascii="Arial" w:eastAsia="Arial" w:hAnsi="Arial" w:cs="Arial"/>
+          <w:bCs/>
+          <w:color w:val="231F20"/>
+          <w:sz w:val="20"/>
+        </w:rPr>
+        <w:t>Java,  PL\SQL, Node, JavaScript, TypeScript</w:t>
       </w:r>
     </w:p>
     <w:p>
@@ -2284,7 +1934,6 @@
         </w:rPr>
         <w:t>Technologies</w:t>
       </w:r>
-      <w:proofErr w:type="gramStart"/>
       <w:r>
         <w:rPr>
           <w:rFonts w:ascii="Arial" w:eastAsia="Arial" w:hAnsi="Arial" w:cs="Arial"/>
@@ -2312,77 +1961,7 @@
           <w:color w:val="231F20"/>
           <w:sz w:val="20"/>
         </w:rPr>
-        <w:t>Spring</w:t>
-      </w:r>
-      <w:proofErr w:type="gramEnd"/>
-      <w:r>
-        <w:rPr>
-          <w:rFonts w:ascii="Arial" w:eastAsia="Arial" w:hAnsi="Arial" w:cs="Arial"/>
-          <w:bCs/>
-          <w:color w:val="231F20"/>
-          <w:sz w:val="20"/>
-        </w:rPr>
-        <w:t xml:space="preserve"> Framework (Boot, Security, Data), PostgreSQL, Hibernate, Apache Kafka, Apache Avro, </w:t>
-      </w:r>
-      <w:proofErr w:type="spellStart"/>
-      <w:r>
-        <w:rPr>
-          <w:rFonts w:ascii="Arial" w:eastAsia="Arial" w:hAnsi="Arial" w:cs="Arial"/>
-          <w:bCs/>
-          <w:color w:val="231F20"/>
-          <w:sz w:val="20"/>
-        </w:rPr>
-        <w:t>ElasticSearch</w:t>
-      </w:r>
-      <w:proofErr w:type="spellEnd"/>
-      <w:r>
-        <w:rPr>
-          <w:rFonts w:ascii="Arial" w:eastAsia="Arial" w:hAnsi="Arial" w:cs="Arial"/>
-          <w:bCs/>
-          <w:color w:val="231F20"/>
-          <w:sz w:val="20"/>
-        </w:rPr>
-        <w:t xml:space="preserve">, Kibana, JUnit, Mockito, </w:t>
-      </w:r>
-      <w:proofErr w:type="spellStart"/>
-      <w:r>
-        <w:rPr>
-          <w:rFonts w:ascii="Arial" w:eastAsia="Arial" w:hAnsi="Arial" w:cs="Arial"/>
-          <w:bCs/>
-          <w:color w:val="231F20"/>
-          <w:sz w:val="20"/>
-        </w:rPr>
-        <w:t>WireMock</w:t>
-      </w:r>
-      <w:proofErr w:type="spellEnd"/>
-      <w:r>
-        <w:rPr>
-          <w:rFonts w:ascii="Arial" w:eastAsia="Arial" w:hAnsi="Arial" w:cs="Arial"/>
-          <w:bCs/>
-          <w:color w:val="231F20"/>
-          <w:sz w:val="20"/>
-        </w:rPr>
-        <w:t xml:space="preserve">, Docker (Compose), Kubernetes, Jenkins, Helm, Vault, SonarQube, </w:t>
-      </w:r>
-      <w:proofErr w:type="spellStart"/>
-      <w:r>
-        <w:rPr>
-          <w:rFonts w:ascii="Arial" w:eastAsia="Arial" w:hAnsi="Arial" w:cs="Arial"/>
-          <w:bCs/>
-          <w:color w:val="231F20"/>
-          <w:sz w:val="20"/>
-        </w:rPr>
-        <w:t>SpotBugs</w:t>
-      </w:r>
-      <w:proofErr w:type="spellEnd"/>
-      <w:r>
-        <w:rPr>
-          <w:rFonts w:ascii="Arial" w:eastAsia="Arial" w:hAnsi="Arial" w:cs="Arial"/>
-          <w:bCs/>
-          <w:color w:val="231F20"/>
-          <w:sz w:val="20"/>
-        </w:rPr>
-        <w:t>, PMD, Maven, etc.</w:t>
+        <w:t>Spring Framework (Boot, Security, Data), PostgreSQL, Hibernate, Apache Kafka, Apache Avro, ElasticSearch, Kibana, JUnit, Mockito, WireMock, Docker (Compose), Kubernetes, Jenkins, Helm, Vault, SonarQube, SpotBugs, PMD, Maven, etc.</w:t>
       </w:r>
     </w:p>
     <w:p>
@@ -2407,47 +1986,26 @@
           <w:color w:val="231F20"/>
           <w:sz w:val="20"/>
         </w:rPr>
-        <w:t>Position</w:t>
-      </w:r>
-      <w:proofErr w:type="gramStart"/>
-      <w:r>
-        <w:rPr>
-          <w:rFonts w:ascii="Arial" w:eastAsia="Arial" w:hAnsi="Arial" w:cs="Arial"/>
-          <w:b/>
-          <w:bCs/>
-          <w:color w:val="231F20"/>
-          <w:sz w:val="20"/>
-        </w:rPr>
-        <w:t xml:space="preserve">: </w:t>
-      </w:r>
-      <w:r>
-        <w:rPr>
-          <w:rFonts w:ascii="Arial" w:eastAsia="Arial" w:hAnsi="Arial" w:cs="Arial"/>
-          <w:b/>
-          <w:bCs/>
-          <w:color w:val="231F20"/>
-          <w:sz w:val="20"/>
-        </w:rPr>
-        <w:tab/>
-      </w:r>
-      <w:r>
-        <w:rPr>
-          <w:rFonts w:ascii="Arial" w:eastAsia="Arial" w:hAnsi="Arial" w:cs="Arial"/>
-          <w:bCs/>
-          <w:color w:val="231F20"/>
-          <w:sz w:val="20"/>
-        </w:rPr>
-        <w:t>Software</w:t>
-      </w:r>
-      <w:proofErr w:type="gramEnd"/>
-      <w:r>
-        <w:rPr>
-          <w:rFonts w:ascii="Arial" w:eastAsia="Arial" w:hAnsi="Arial" w:cs="Arial"/>
-          <w:bCs/>
-          <w:color w:val="231F20"/>
-          <w:sz w:val="20"/>
-        </w:rPr>
-        <w:t xml:space="preserve"> Developer</w:t>
+        <w:t xml:space="preserve">Position: </w:t>
+      </w:r>
+      <w:r>
+        <w:rPr>
+          <w:rFonts w:ascii="Arial" w:eastAsia="Arial" w:hAnsi="Arial" w:cs="Arial"/>
+          <w:b/>
+          <w:bCs/>
+          <w:color w:val="231F20"/>
+          <w:sz w:val="20"/>
+        </w:rPr>
+        <w:tab/>
+      </w:r>
+      <w:r>
+        <w:rPr>
+          <w:rFonts w:ascii="Arial" w:eastAsia="Arial" w:hAnsi="Arial" w:cs="Arial"/>
+          <w:bCs/>
+          <w:color w:val="231F20"/>
+          <w:sz w:val="20"/>
+        </w:rPr>
+        <w:t>Software Developer</w:t>
       </w:r>
     </w:p>
     <w:p>
@@ -2497,18 +2055,8 @@
           <w:color w:val="231F20"/>
           <w:sz w:val="20"/>
         </w:rPr>
-        <w:t xml:space="preserve">Designing, implementing, and maintaining Java microservices that follow corporate standards of quality, 12 factors, well-tested by </w:t>
-      </w:r>
-      <w:proofErr w:type="gramStart"/>
-      <w:r>
-        <w:rPr>
-          <w:rFonts w:ascii="Arial" w:eastAsia="Arial" w:hAnsi="Arial" w:cs="Arial"/>
-          <w:color w:val="231F20"/>
-          <w:sz w:val="20"/>
-        </w:rPr>
-        <w:t>JUnit;</w:t>
-      </w:r>
-      <w:proofErr w:type="gramEnd"/>
+        <w:t>Designing, implementing, and maintaining Java microservices that follow corporate standards of quality, 12 factors, well-tested by JUnit;</w:t>
+      </w:r>
     </w:p>
     <w:p>
       <w:pPr>
@@ -2531,18 +2079,8 @@
           <w:color w:val="231F20"/>
           <w:sz w:val="20"/>
         </w:rPr>
-        <w:t xml:space="preserve">Correcting assessment of the customer’s </w:t>
-      </w:r>
-      <w:proofErr w:type="gramStart"/>
-      <w:r>
-        <w:rPr>
-          <w:rFonts w:ascii="Arial" w:eastAsia="Arial" w:hAnsi="Arial" w:cs="Arial"/>
-          <w:color w:val="231F20"/>
-          <w:sz w:val="20"/>
-        </w:rPr>
-        <w:t>requirements;</w:t>
-      </w:r>
-      <w:proofErr w:type="gramEnd"/>
+        <w:t>Correcting assessment of the customer’s requirements;</w:t>
+      </w:r>
     </w:p>
     <w:p>
       <w:pPr>
@@ -2565,18 +2103,8 @@
           <w:color w:val="231F20"/>
           <w:sz w:val="20"/>
         </w:rPr>
-        <w:t xml:space="preserve">Ensuring application designs conform to business </w:t>
-      </w:r>
-      <w:proofErr w:type="gramStart"/>
-      <w:r>
-        <w:rPr>
-          <w:rFonts w:ascii="Arial" w:eastAsia="Arial" w:hAnsi="Arial" w:cs="Arial"/>
-          <w:color w:val="231F20"/>
-          <w:sz w:val="20"/>
-        </w:rPr>
-        <w:t>goals;</w:t>
-      </w:r>
-      <w:proofErr w:type="gramEnd"/>
+        <w:t>Ensuring application designs conform to business goals;</w:t>
+      </w:r>
     </w:p>
     <w:p>
       <w:pPr>
@@ -2599,18 +2127,8 @@
           <w:color w:val="231F20"/>
           <w:sz w:val="20"/>
         </w:rPr>
-        <w:t xml:space="preserve">Contributing to all phases of the development lifecycle - writing, testing &amp; reviewing </w:t>
-      </w:r>
-      <w:proofErr w:type="gramStart"/>
-      <w:r>
-        <w:rPr>
-          <w:rFonts w:ascii="Arial" w:eastAsia="Arial" w:hAnsi="Arial" w:cs="Arial"/>
-          <w:color w:val="231F20"/>
-          <w:sz w:val="20"/>
-        </w:rPr>
-        <w:t>code;</w:t>
-      </w:r>
-      <w:proofErr w:type="gramEnd"/>
+        <w:t>Contributing to all phases of the development lifecycle - writing, testing &amp; reviewing code;</w:t>
+      </w:r>
     </w:p>
     <w:p>
       <w:pPr>
@@ -2694,47 +2212,26 @@
           <w:color w:val="231F20"/>
           <w:sz w:val="20"/>
         </w:rPr>
-        <w:t>Client</w:t>
-      </w:r>
-      <w:proofErr w:type="gramStart"/>
-      <w:r>
-        <w:rPr>
-          <w:rFonts w:ascii="Arial" w:eastAsia="Arial" w:hAnsi="Arial" w:cs="Arial"/>
-          <w:b/>
-          <w:bCs/>
-          <w:color w:val="231F20"/>
-          <w:sz w:val="20"/>
-        </w:rPr>
-        <w:t xml:space="preserve">: </w:t>
-      </w:r>
-      <w:r>
-        <w:rPr>
-          <w:rFonts w:ascii="Arial" w:eastAsia="Arial" w:hAnsi="Arial" w:cs="Arial"/>
-          <w:b/>
-          <w:bCs/>
-          <w:color w:val="231F20"/>
-          <w:sz w:val="20"/>
-        </w:rPr>
-        <w:tab/>
-      </w:r>
-      <w:r>
-        <w:rPr>
-          <w:rFonts w:ascii="Arial" w:eastAsia="Arial" w:hAnsi="Arial" w:cs="Arial"/>
-          <w:bCs/>
-          <w:color w:val="231F20"/>
-          <w:sz w:val="20"/>
-        </w:rPr>
-        <w:t>Global</w:t>
-      </w:r>
-      <w:proofErr w:type="gramEnd"/>
-      <w:r>
-        <w:rPr>
-          <w:rFonts w:ascii="Arial" w:eastAsia="Arial" w:hAnsi="Arial" w:cs="Arial"/>
-          <w:bCs/>
-          <w:color w:val="231F20"/>
-          <w:sz w:val="20"/>
-        </w:rPr>
-        <w:t xml:space="preserve"> IT solutions provider in the travel industry</w:t>
+        <w:t xml:space="preserve">Client: </w:t>
+      </w:r>
+      <w:r>
+        <w:rPr>
+          <w:rFonts w:ascii="Arial" w:eastAsia="Arial" w:hAnsi="Arial" w:cs="Arial"/>
+          <w:b/>
+          <w:bCs/>
+          <w:color w:val="231F20"/>
+          <w:sz w:val="20"/>
+        </w:rPr>
+        <w:tab/>
+      </w:r>
+      <w:r>
+        <w:rPr>
+          <w:rFonts w:ascii="Arial" w:eastAsia="Arial" w:hAnsi="Arial" w:cs="Arial"/>
+          <w:bCs/>
+          <w:color w:val="231F20"/>
+          <w:sz w:val="20"/>
+        </w:rPr>
+        <w:t>Global IT solutions provider in the travel industry</w:t>
       </w:r>
       <w:r>
         <w:rPr>
@@ -2770,47 +2267,26 @@
           <w:color w:val="231F20"/>
           <w:sz w:val="20"/>
         </w:rPr>
-        <w:t>Overview</w:t>
-      </w:r>
-      <w:proofErr w:type="gramStart"/>
-      <w:r>
-        <w:rPr>
-          <w:rFonts w:ascii="Arial" w:eastAsia="Arial" w:hAnsi="Arial" w:cs="Arial"/>
-          <w:b/>
-          <w:bCs/>
-          <w:color w:val="231F20"/>
-          <w:sz w:val="20"/>
-        </w:rPr>
-        <w:t xml:space="preserve">: </w:t>
-      </w:r>
-      <w:r>
-        <w:rPr>
-          <w:rFonts w:ascii="Arial" w:eastAsia="Arial" w:hAnsi="Arial" w:cs="Arial"/>
-          <w:b/>
-          <w:bCs/>
-          <w:color w:val="231F20"/>
-          <w:sz w:val="20"/>
-        </w:rPr>
-        <w:tab/>
-      </w:r>
-      <w:r>
-        <w:rPr>
-          <w:rFonts w:ascii="Arial" w:eastAsia="Arial" w:hAnsi="Arial" w:cs="Arial"/>
-          <w:bCs/>
-          <w:color w:val="231F20"/>
-          <w:sz w:val="20"/>
-        </w:rPr>
-        <w:t>Internal</w:t>
-      </w:r>
-      <w:proofErr w:type="gramEnd"/>
-      <w:r>
-        <w:rPr>
-          <w:rFonts w:ascii="Arial" w:eastAsia="Arial" w:hAnsi="Arial" w:cs="Arial"/>
-          <w:bCs/>
-          <w:color w:val="231F20"/>
-          <w:sz w:val="20"/>
-        </w:rPr>
-        <w:t xml:space="preserve"> </w:t>
+        <w:t xml:space="preserve">Overview: </w:t>
+      </w:r>
+      <w:r>
+        <w:rPr>
+          <w:rFonts w:ascii="Arial" w:eastAsia="Arial" w:hAnsi="Arial" w:cs="Arial"/>
+          <w:b/>
+          <w:bCs/>
+          <w:color w:val="231F20"/>
+          <w:sz w:val="20"/>
+        </w:rPr>
+        <w:tab/>
+      </w:r>
+      <w:r>
+        <w:rPr>
+          <w:rFonts w:ascii="Arial" w:eastAsia="Arial" w:hAnsi="Arial" w:cs="Arial"/>
+          <w:bCs/>
+          <w:color w:val="231F20"/>
+          <w:sz w:val="20"/>
+        </w:rPr>
+        <w:t xml:space="preserve">Internal </w:t>
       </w:r>
       <w:r>
         <w:rPr>
@@ -2820,29 +2296,7 @@
           <w:color w:val="231F20"/>
           <w:sz w:val="20"/>
         </w:rPr>
-        <w:t xml:space="preserve">extract-transform-load tool that ran in batch mode to gather descriptive static content from different sources (like REST APIs, </w:t>
-      </w:r>
-      <w:proofErr w:type="spellStart"/>
-      <w:r>
-        <w:rPr>
-          <w:rFonts w:ascii="Arial" w:eastAsia="Arial" w:hAnsi="Arial" w:cs="Arial"/>
-          <w:bCs/>
-          <w:iCs/>
-          <w:color w:val="231F20"/>
-          <w:sz w:val="20"/>
-        </w:rPr>
-        <w:t>sFTP</w:t>
-      </w:r>
-      <w:proofErr w:type="spellEnd"/>
-      <w:r>
-        <w:rPr>
-          <w:rFonts w:ascii="Arial" w:eastAsia="Arial" w:hAnsi="Arial" w:cs="Arial"/>
-          <w:bCs/>
-          <w:iCs/>
-          <w:color w:val="231F20"/>
-          <w:sz w:val="20"/>
-        </w:rPr>
-        <w:t>, SOAP servers), transform it using XQuery and finally load it to the third-party consumer.</w:t>
+        <w:t>extract-transform-load tool that ran in batch mode to gather descriptive static content from different sources (like REST APIs, sFTP, SOAP servers), transform it using XQuery and finally load it to the third-party consumer.</w:t>
       </w:r>
     </w:p>
     <w:p>
@@ -2867,47 +2321,26 @@
           <w:color w:val="231F20"/>
           <w:sz w:val="20"/>
         </w:rPr>
-        <w:t>Languages</w:t>
-      </w:r>
-      <w:proofErr w:type="gramStart"/>
-      <w:r>
-        <w:rPr>
-          <w:rFonts w:ascii="Arial" w:eastAsia="Arial" w:hAnsi="Arial" w:cs="Arial"/>
-          <w:b/>
-          <w:bCs/>
-          <w:color w:val="231F20"/>
-          <w:sz w:val="20"/>
-        </w:rPr>
-        <w:t xml:space="preserve">: </w:t>
-      </w:r>
-      <w:r>
-        <w:rPr>
-          <w:rFonts w:ascii="Arial" w:eastAsia="Arial" w:hAnsi="Arial" w:cs="Arial"/>
-          <w:b/>
-          <w:bCs/>
-          <w:color w:val="231F20"/>
-          <w:sz w:val="20"/>
-        </w:rPr>
-        <w:tab/>
-      </w:r>
-      <w:r>
-        <w:rPr>
-          <w:rFonts w:ascii="Arial" w:eastAsia="Arial" w:hAnsi="Arial" w:cs="Arial"/>
-          <w:bCs/>
-          <w:color w:val="231F20"/>
-          <w:sz w:val="20"/>
-        </w:rPr>
-        <w:t>Java</w:t>
-      </w:r>
-      <w:proofErr w:type="gramEnd"/>
-      <w:r>
-        <w:rPr>
-          <w:rFonts w:ascii="Arial" w:eastAsia="Arial" w:hAnsi="Arial" w:cs="Arial"/>
-          <w:bCs/>
-          <w:color w:val="231F20"/>
-          <w:sz w:val="20"/>
-        </w:rPr>
-        <w:t>, PL\SQL, Node, JavaScript</w:t>
+        <w:t xml:space="preserve">Languages: </w:t>
+      </w:r>
+      <w:r>
+        <w:rPr>
+          <w:rFonts w:ascii="Arial" w:eastAsia="Arial" w:hAnsi="Arial" w:cs="Arial"/>
+          <w:b/>
+          <w:bCs/>
+          <w:color w:val="231F20"/>
+          <w:sz w:val="20"/>
+        </w:rPr>
+        <w:tab/>
+      </w:r>
+      <w:r>
+        <w:rPr>
+          <w:rFonts w:ascii="Arial" w:eastAsia="Arial" w:hAnsi="Arial" w:cs="Arial"/>
+          <w:bCs/>
+          <w:color w:val="231F20"/>
+          <w:sz w:val="20"/>
+        </w:rPr>
+        <w:t>Java, PL\SQL, Node, JavaScript</w:t>
       </w:r>
     </w:p>
     <w:p>
@@ -2965,51 +2398,7 @@
           <w:color w:val="231F20"/>
           <w:sz w:val="20"/>
         </w:rPr>
-        <w:t>Spring – Core / Batch / MVC / Data, Hibernate, various HTTP/</w:t>
-      </w:r>
-      <w:proofErr w:type="spellStart"/>
-      <w:r>
-        <w:rPr>
-          <w:rFonts w:ascii="Arial" w:eastAsia="Arial" w:hAnsi="Arial" w:cs="Arial"/>
-          <w:bCs/>
-          <w:iCs/>
-          <w:color w:val="231F20"/>
-          <w:sz w:val="20"/>
-        </w:rPr>
-        <w:t>sFTP</w:t>
-      </w:r>
-      <w:proofErr w:type="spellEnd"/>
-      <w:r>
-        <w:rPr>
-          <w:rFonts w:ascii="Arial" w:eastAsia="Arial" w:hAnsi="Arial" w:cs="Arial"/>
-          <w:bCs/>
-          <w:iCs/>
-          <w:color w:val="231F20"/>
-          <w:sz w:val="20"/>
-        </w:rPr>
-        <w:t xml:space="preserve">/SOAP clients, JUnit, Mockito, </w:t>
-      </w:r>
-      <w:proofErr w:type="spellStart"/>
-      <w:r>
-        <w:rPr>
-          <w:rFonts w:ascii="Arial" w:eastAsia="Arial" w:hAnsi="Arial" w:cs="Arial"/>
-          <w:bCs/>
-          <w:iCs/>
-          <w:color w:val="231F20"/>
-          <w:sz w:val="20"/>
-        </w:rPr>
-        <w:t>AssertJ</w:t>
-      </w:r>
-      <w:proofErr w:type="spellEnd"/>
-      <w:r>
-        <w:rPr>
-          <w:rFonts w:ascii="Arial" w:eastAsia="Arial" w:hAnsi="Arial" w:cs="Arial"/>
-          <w:bCs/>
-          <w:iCs/>
-          <w:color w:val="231F20"/>
-          <w:sz w:val="20"/>
-        </w:rPr>
-        <w:t xml:space="preserve">, Kafka, Apache Camel, Karaf, Couchbase, MariaDB, Maven, Consul, Docker, Kubernetes, OpenShift, </w:t>
+        <w:t xml:space="preserve">Spring – Core / Batch / MVC / Data, Hibernate, various HTTP/sFTP/SOAP clients, JUnit, Mockito, AssertJ, Kafka, Apache Camel, Karaf, Couchbase, MariaDB, Maven, Consul, Docker, Kubernetes, OpenShift, </w:t>
       </w:r>
       <w:r>
         <w:rPr>
@@ -3042,47 +2431,26 @@
           <w:color w:val="231F20"/>
           <w:sz w:val="20"/>
         </w:rPr>
-        <w:t>Position</w:t>
-      </w:r>
-      <w:proofErr w:type="gramStart"/>
-      <w:r>
-        <w:rPr>
-          <w:rFonts w:ascii="Arial" w:eastAsia="Arial" w:hAnsi="Arial" w:cs="Arial"/>
-          <w:b/>
-          <w:bCs/>
-          <w:color w:val="231F20"/>
-          <w:sz w:val="20"/>
-        </w:rPr>
-        <w:t xml:space="preserve">: </w:t>
-      </w:r>
-      <w:r>
-        <w:rPr>
-          <w:rFonts w:ascii="Arial" w:eastAsia="Arial" w:hAnsi="Arial" w:cs="Arial"/>
-          <w:b/>
-          <w:bCs/>
-          <w:color w:val="231F20"/>
-          <w:sz w:val="20"/>
-        </w:rPr>
-        <w:tab/>
-      </w:r>
-      <w:r>
-        <w:rPr>
-          <w:rFonts w:ascii="Arial" w:eastAsia="Arial" w:hAnsi="Arial" w:cs="Arial"/>
-          <w:bCs/>
-          <w:color w:val="231F20"/>
-          <w:sz w:val="20"/>
-        </w:rPr>
-        <w:t>Software</w:t>
-      </w:r>
-      <w:proofErr w:type="gramEnd"/>
-      <w:r>
-        <w:rPr>
-          <w:rFonts w:ascii="Arial" w:eastAsia="Arial" w:hAnsi="Arial" w:cs="Arial"/>
-          <w:bCs/>
-          <w:color w:val="231F20"/>
-          <w:sz w:val="20"/>
-        </w:rPr>
-        <w:t xml:space="preserve"> Developer</w:t>
+        <w:t xml:space="preserve">Position: </w:t>
+      </w:r>
+      <w:r>
+        <w:rPr>
+          <w:rFonts w:ascii="Arial" w:eastAsia="Arial" w:hAnsi="Arial" w:cs="Arial"/>
+          <w:b/>
+          <w:bCs/>
+          <w:color w:val="231F20"/>
+          <w:sz w:val="20"/>
+        </w:rPr>
+        <w:tab/>
+      </w:r>
+      <w:r>
+        <w:rPr>
+          <w:rFonts w:ascii="Arial" w:eastAsia="Arial" w:hAnsi="Arial" w:cs="Arial"/>
+          <w:bCs/>
+          <w:color w:val="231F20"/>
+          <w:sz w:val="20"/>
+        </w:rPr>
+        <w:t>Software Developer</w:t>
       </w:r>
     </w:p>
     <w:p>
@@ -3416,18 +2784,8 @@
           <w:color w:val="231F20"/>
           <w:sz w:val="20"/>
         </w:rPr>
-        <w:t xml:space="preserve">Creating a cloud-native platform from scratch using Java/Spring-stack </w:t>
-      </w:r>
-      <w:proofErr w:type="gramStart"/>
-      <w:r>
-        <w:rPr>
-          <w:rFonts w:ascii="Arial" w:eastAsia="Arial" w:hAnsi="Arial" w:cs="Arial"/>
-          <w:color w:val="231F20"/>
-          <w:sz w:val="20"/>
-        </w:rPr>
-        <w:t>technologies;</w:t>
-      </w:r>
-      <w:proofErr w:type="gramEnd"/>
+        <w:t>Creating a cloud-native platform from scratch using Java/Spring-stack technologies;</w:t>
+      </w:r>
     </w:p>
     <w:p>
       <w:pPr>
@@ -3450,18 +2808,8 @@
           <w:color w:val="231F20"/>
           <w:sz w:val="20"/>
         </w:rPr>
-        <w:t xml:space="preserve">Leading in the technical content of the system/functional/design </w:t>
-      </w:r>
-      <w:proofErr w:type="gramStart"/>
-      <w:r>
-        <w:rPr>
-          <w:rFonts w:ascii="Arial" w:eastAsia="Arial" w:hAnsi="Arial" w:cs="Arial"/>
-          <w:color w:val="231F20"/>
-          <w:sz w:val="20"/>
-        </w:rPr>
-        <w:t>specifications;</w:t>
-      </w:r>
-      <w:proofErr w:type="gramEnd"/>
+        <w:t>Leading in the technical content of the system/functional/design specifications;</w:t>
+      </w:r>
     </w:p>
     <w:p>
       <w:pPr>
@@ -3484,18 +2832,8 @@
           <w:color w:val="231F20"/>
           <w:sz w:val="20"/>
         </w:rPr>
-        <w:t xml:space="preserve">Building an ETL platform on top of the Spring Batch </w:t>
-      </w:r>
-      <w:proofErr w:type="gramStart"/>
-      <w:r>
-        <w:rPr>
-          <w:rFonts w:ascii="Arial" w:eastAsia="Arial" w:hAnsi="Arial" w:cs="Arial"/>
-          <w:color w:val="231F20"/>
-          <w:sz w:val="20"/>
-        </w:rPr>
-        <w:t>framework;</w:t>
-      </w:r>
-      <w:proofErr w:type="gramEnd"/>
+        <w:t>Building an ETL platform on top of the Spring Batch framework;</w:t>
+      </w:r>
     </w:p>
     <w:p>
       <w:pPr>
@@ -3975,39 +3313,8 @@
           <w:color w:val="231F20"/>
           <w:sz w:val="20"/>
         </w:rPr>
-        <w:t xml:space="preserve">MariaDB, Docker, Composer, RabbitMQ, Redis, sockets, streams, </w:t>
-      </w:r>
-      <w:proofErr w:type="spellStart"/>
-      <w:r>
-        <w:rPr>
-          <w:rFonts w:ascii="Arial" w:eastAsia="Arial" w:hAnsi="Arial" w:cs="Arial"/>
-          <w:bCs/>
-          <w:color w:val="231F20"/>
-          <w:sz w:val="20"/>
-        </w:rPr>
-        <w:t>ElasticSearch</w:t>
-      </w:r>
-      <w:proofErr w:type="spellEnd"/>
-      <w:r>
-        <w:rPr>
-          <w:rFonts w:ascii="Arial" w:eastAsia="Arial" w:hAnsi="Arial" w:cs="Arial"/>
-          <w:bCs/>
-          <w:color w:val="231F20"/>
-          <w:sz w:val="20"/>
-        </w:rPr>
-        <w:t xml:space="preserve">, MongoDB, Memcached, Cassandra, CouchDB, </w:t>
-      </w:r>
-      <w:proofErr w:type="spellStart"/>
-      <w:r>
-        <w:rPr>
-          <w:rFonts w:ascii="Arial" w:eastAsia="Arial" w:hAnsi="Arial" w:cs="Arial"/>
-          <w:bCs/>
-          <w:color w:val="231F20"/>
-          <w:sz w:val="20"/>
-        </w:rPr>
-        <w:t>InfluxDB</w:t>
-      </w:r>
-      <w:proofErr w:type="spellEnd"/>
+        <w:t>MariaDB, Docker, Composer, RabbitMQ, Redis, sockets, streams, ElasticSearch, MongoDB, Memcached, Cassandra, CouchDB, InfluxDB</w:t>
+      </w:r>
     </w:p>
     <w:p>
       <w:pPr>
@@ -4108,25 +3415,7 @@
           <w:color w:val="231F20"/>
           <w:sz w:val="20"/>
         </w:rPr>
-        <w:t xml:space="preserve">Supporting technology versatility and high technical </w:t>
-      </w:r>
-      <w:proofErr w:type="gramStart"/>
-      <w:r>
-        <w:rPr>
-          <w:rFonts w:ascii="Arial" w:eastAsia="Arial" w:hAnsi="Arial" w:cs="Arial"/>
-          <w:color w:val="231F20"/>
-          <w:sz w:val="20"/>
-        </w:rPr>
-        <w:t>skills;</w:t>
-      </w:r>
-      <w:proofErr w:type="gramEnd"/>
-      <w:r>
-        <w:rPr>
-          <w:rFonts w:ascii="Arial" w:eastAsia="Arial" w:hAnsi="Arial" w:cs="Arial"/>
-          <w:color w:val="231F20"/>
-          <w:sz w:val="20"/>
-        </w:rPr>
-        <w:t xml:space="preserve">  </w:t>
+        <w:t xml:space="preserve">Supporting technology versatility and high technical skills;  </w:t>
       </w:r>
     </w:p>
     <w:p>
@@ -4144,18 +3433,8 @@
           <w:color w:val="231F20"/>
           <w:sz w:val="20"/>
         </w:rPr>
-        <w:t xml:space="preserve">Software design, technical and architectural </w:t>
-      </w:r>
-      <w:proofErr w:type="gramStart"/>
-      <w:r>
-        <w:rPr>
-          <w:rFonts w:ascii="Arial" w:eastAsia="Arial" w:hAnsi="Arial" w:cs="Arial"/>
-          <w:color w:val="231F20"/>
-          <w:sz w:val="20"/>
-        </w:rPr>
-        <w:t>solutions;</w:t>
-      </w:r>
-      <w:proofErr w:type="gramEnd"/>
+        <w:t>Software design, technical and architectural solutions;</w:t>
+      </w:r>
     </w:p>
     <w:p>
       <w:pPr>
@@ -4172,18 +3451,8 @@
           <w:color w:val="231F20"/>
           <w:sz w:val="20"/>
         </w:rPr>
-        <w:t xml:space="preserve">Developing new features and maintaining existing </w:t>
-      </w:r>
-      <w:proofErr w:type="gramStart"/>
-      <w:r>
-        <w:rPr>
-          <w:rFonts w:ascii="Arial" w:eastAsia="Arial" w:hAnsi="Arial" w:cs="Arial"/>
-          <w:color w:val="231F20"/>
-          <w:sz w:val="20"/>
-        </w:rPr>
-        <w:t>extensions;</w:t>
-      </w:r>
-      <w:proofErr w:type="gramEnd"/>
+        <w:t>Developing new features and maintaining existing extensions;</w:t>
+      </w:r>
     </w:p>
     <w:p>
       <w:pPr>
@@ -4200,18 +3469,8 @@
           <w:color w:val="231F20"/>
           <w:sz w:val="20"/>
         </w:rPr>
-        <w:t xml:space="preserve">Designing and estimating </w:t>
-      </w:r>
-      <w:proofErr w:type="gramStart"/>
-      <w:r>
-        <w:rPr>
-          <w:rFonts w:ascii="Arial" w:eastAsia="Arial" w:hAnsi="Arial" w:cs="Arial"/>
-          <w:color w:val="231F20"/>
-          <w:sz w:val="20"/>
-        </w:rPr>
-        <w:t>solutions;</w:t>
-      </w:r>
-      <w:proofErr w:type="gramEnd"/>
+        <w:t>Designing and estimating solutions;</w:t>
+      </w:r>
     </w:p>
     <w:p>
       <w:pPr>
@@ -4228,18 +3487,8 @@
           <w:color w:val="231F20"/>
           <w:sz w:val="20"/>
         </w:rPr>
-        <w:t xml:space="preserve">Writing unit tests and working with CI </w:t>
-      </w:r>
-      <w:proofErr w:type="gramStart"/>
-      <w:r>
-        <w:rPr>
-          <w:rFonts w:ascii="Arial" w:eastAsia="Arial" w:hAnsi="Arial" w:cs="Arial"/>
-          <w:color w:val="231F20"/>
-          <w:sz w:val="20"/>
-        </w:rPr>
-        <w:t>tools;</w:t>
-      </w:r>
-      <w:proofErr w:type="gramEnd"/>
+        <w:t>Writing unit tests and working with CI tools;</w:t>
+      </w:r>
     </w:p>
     <w:p>
       <w:pPr>
@@ -4274,25 +3523,7 @@
           <w:color w:val="231F20"/>
           <w:sz w:val="20"/>
         </w:rPr>
-        <w:t xml:space="preserve">Facilitated the transition of 8+ engineers, moved a full-scale project, and increased resource </w:t>
-      </w:r>
-      <w:proofErr w:type="spellStart"/>
-      <w:r>
-        <w:rPr>
-          <w:rFonts w:ascii="Arial" w:eastAsia="Arial" w:hAnsi="Arial" w:cs="Arial"/>
-          <w:color w:val="231F20"/>
-          <w:sz w:val="20"/>
-        </w:rPr>
-        <w:t>utilisation</w:t>
-      </w:r>
-      <w:proofErr w:type="spellEnd"/>
-      <w:r>
-        <w:rPr>
-          <w:rFonts w:ascii="Arial" w:eastAsia="Arial" w:hAnsi="Arial" w:cs="Arial"/>
-          <w:color w:val="231F20"/>
-          <w:sz w:val="20"/>
-        </w:rPr>
-        <w:t xml:space="preserve"> by 90%.</w:t>
+        <w:t>Facilitated the transition of 8+ engineers, moved a full-scale project, and increased resource utilisation by 90%.</w:t>
       </w:r>
     </w:p>
     <w:p>
@@ -4488,25 +3719,7 @@
           <w:color w:val="231F20"/>
           <w:sz w:val="20"/>
         </w:rPr>
-        <w:t xml:space="preserve">Angular13+, Bootstrap, Apache Camel, Apache Karaf, Jackson, </w:t>
-      </w:r>
-      <w:proofErr w:type="spellStart"/>
-      <w:r>
-        <w:rPr>
-          <w:rFonts w:ascii="Arial" w:eastAsia="Arial" w:hAnsi="Arial" w:cs="Arial"/>
-          <w:color w:val="231F20"/>
-          <w:sz w:val="20"/>
-        </w:rPr>
-        <w:t>MapStruct</w:t>
-      </w:r>
-      <w:proofErr w:type="spellEnd"/>
-      <w:r>
-        <w:rPr>
-          <w:rFonts w:ascii="Arial" w:eastAsia="Arial" w:hAnsi="Arial" w:cs="Arial"/>
-          <w:color w:val="231F20"/>
-          <w:sz w:val="20"/>
-        </w:rPr>
-        <w:t>, Swagger 2, Flyway, Liquibase, Symfony 4+, Zend, Laravel, Kafka (with Avro), RabbitMQ</w:t>
+        <w:t>Angular13+, Bootstrap, Apache Camel, Apache Karaf, Jackson, MapStruct, Swagger 2, Flyway, Liquibase, Symfony 4+, Zend, Laravel, Kafka (with Avro), RabbitMQ</w:t>
       </w:r>
     </w:p>
     <w:p>
@@ -4633,36 +3846,8 @@
           <w:color w:val="231F20"/>
           <w:sz w:val="20"/>
         </w:rPr>
-        <w:t xml:space="preserve">IntelliJ IDEA, </w:t>
-      </w:r>
-      <w:proofErr w:type="spellStart"/>
-      <w:r>
-        <w:rPr>
-          <w:rFonts w:ascii="Arial" w:eastAsia="Arial" w:hAnsi="Arial" w:cs="Arial"/>
-          <w:color w:val="231F20"/>
-          <w:sz w:val="20"/>
-        </w:rPr>
-        <w:t>PHPStorm</w:t>
-      </w:r>
-      <w:proofErr w:type="spellEnd"/>
-      <w:r>
-        <w:rPr>
-          <w:rFonts w:ascii="Arial" w:eastAsia="Arial" w:hAnsi="Arial" w:cs="Arial"/>
-          <w:color w:val="231F20"/>
-          <w:sz w:val="20"/>
-        </w:rPr>
-        <w:t xml:space="preserve">, WebStorm, </w:t>
-      </w:r>
-      <w:proofErr w:type="spellStart"/>
-      <w:r>
-        <w:rPr>
-          <w:rFonts w:ascii="Arial" w:eastAsia="Arial" w:hAnsi="Arial" w:cs="Arial"/>
-          <w:color w:val="231F20"/>
-          <w:sz w:val="20"/>
-        </w:rPr>
-        <w:t>VSCode</w:t>
-      </w:r>
-      <w:proofErr w:type="spellEnd"/>
+        <w:t>IntelliJ IDEA, PHPStorm, WebStorm, VSCode</w:t>
+      </w:r>
     </w:p>
     <w:p>
       <w:pPr>
@@ -4705,65 +3890,14 @@
         </w:rPr>
         <w:t xml:space="preserve">JUnit, Mockito, </w:t>
       </w:r>
-      <w:proofErr w:type="spellStart"/>
-      <w:r>
-        <w:rPr>
-          <w:rFonts w:ascii="Arial" w:eastAsia="Arial" w:hAnsi="Arial" w:cs="Arial"/>
-          <w:bCs/>
-          <w:color w:val="231F20"/>
-          <w:sz w:val="20"/>
-        </w:rPr>
-        <w:t>WireMock</w:t>
-      </w:r>
-      <w:proofErr w:type="spellEnd"/>
-      <w:r>
-        <w:rPr>
-          <w:rFonts w:ascii="Arial" w:eastAsia="Arial" w:hAnsi="Arial" w:cs="Arial"/>
-          <w:bCs/>
-          <w:color w:val="231F20"/>
-          <w:sz w:val="20"/>
-        </w:rPr>
-        <w:t xml:space="preserve">, Cucumber, </w:t>
-      </w:r>
-      <w:proofErr w:type="spellStart"/>
-      <w:r>
-        <w:rPr>
-          <w:rFonts w:ascii="Arial" w:eastAsia="Arial" w:hAnsi="Arial" w:cs="Arial"/>
-          <w:bCs/>
-          <w:color w:val="231F20"/>
-          <w:sz w:val="20"/>
-        </w:rPr>
-        <w:t>Vitest</w:t>
-      </w:r>
-      <w:proofErr w:type="spellEnd"/>
-      <w:r>
-        <w:rPr>
-          <w:rFonts w:ascii="Arial" w:eastAsia="Arial" w:hAnsi="Arial" w:cs="Arial"/>
-          <w:bCs/>
-          <w:color w:val="231F20"/>
-          <w:sz w:val="20"/>
-        </w:rPr>
-        <w:t xml:space="preserve">, Cypress, </w:t>
-      </w:r>
-      <w:proofErr w:type="spellStart"/>
-      <w:r>
-        <w:rPr>
-          <w:rFonts w:ascii="Arial" w:eastAsia="Arial" w:hAnsi="Arial" w:cs="Arial"/>
-          <w:bCs/>
-          <w:color w:val="231F20"/>
-          <w:sz w:val="20"/>
-        </w:rPr>
-        <w:t>PHPUnit</w:t>
-      </w:r>
-      <w:proofErr w:type="spellEnd"/>
-      <w:r>
-        <w:rPr>
-          <w:rFonts w:ascii="Arial" w:eastAsia="Arial" w:hAnsi="Arial" w:cs="Arial"/>
-          <w:bCs/>
-          <w:color w:val="231F20"/>
-          <w:sz w:val="20"/>
-        </w:rPr>
-        <w:t>, Mockery</w:t>
+      <w:r>
+        <w:rPr>
+          <w:rFonts w:ascii="Arial" w:eastAsia="Arial" w:hAnsi="Arial" w:cs="Arial"/>
+          <w:bCs/>
+          <w:color w:val="231F20"/>
+          <w:sz w:val="20"/>
+        </w:rPr>
+        <w:t>WireMock, Cucumber, Vitest, Cypress, PHPUnit, Mockery</w:t>
       </w:r>
     </w:p>
     <w:p>
@@ -4880,36 +4014,8 @@
           <w:color w:val="231F20"/>
           <w:sz w:val="20"/>
         </w:rPr>
-        <w:t xml:space="preserve">Maven, Gradle, Jenkins, Drone CI, Composer PHP, </w:t>
-      </w:r>
-      <w:proofErr w:type="spellStart"/>
-      <w:r>
-        <w:rPr>
-          <w:rFonts w:ascii="Arial" w:eastAsia="Arial" w:hAnsi="Arial" w:cs="Arial"/>
-          <w:color w:val="231F20"/>
-          <w:sz w:val="20"/>
-        </w:rPr>
-        <w:t>npm</w:t>
-      </w:r>
-      <w:proofErr w:type="spellEnd"/>
-      <w:r>
-        <w:rPr>
-          <w:rFonts w:ascii="Arial" w:eastAsia="Arial" w:hAnsi="Arial" w:cs="Arial"/>
-          <w:color w:val="231F20"/>
-          <w:sz w:val="20"/>
-        </w:rPr>
-        <w:t xml:space="preserve">, </w:t>
-      </w:r>
-      <w:proofErr w:type="spellStart"/>
-      <w:r>
-        <w:rPr>
-          <w:rFonts w:ascii="Arial" w:eastAsia="Arial" w:hAnsi="Arial" w:cs="Arial"/>
-          <w:color w:val="231F20"/>
-          <w:sz w:val="20"/>
-        </w:rPr>
-        <w:t>WebPack</w:t>
-      </w:r>
-      <w:proofErr w:type="spellEnd"/>
+        <w:t>Maven, Gradle, Jenkins, Drone CI, Composer PHP, npm, WebPack</w:t>
+      </w:r>
     </w:p>
     <w:sectPr>
       <w:pgSz w:w="11906" w:h="16838"/>

</xml_diff>

<commit_message>
docs: make highly-optimized version on CV
</commit_message>
<xml_diff>
--- a/Denisenko_Dmitry_CV.docx
+++ b/Denisenko_Dmitry_CV.docx
@@ -13,15 +13,28 @@
       </w:pPr>
       <w:r>
         <w:rPr>
+          <w:b/>
+          <w:bCs/>
           <w:sz w:val="44"/>
           <w:szCs w:val="44"/>
         </w:rPr>
-        <w:t>Dmitry Denisenko – Platform Engineer</w:t>
+        <w:t>Dmitry Denisenko</w:t>
+      </w:r>
+      <w:r>
+        <w:rPr>
+          <w:sz w:val="44"/>
+          <w:szCs w:val="44"/>
+        </w:rPr>
+        <w:t xml:space="preserve"> – Platform Engineer</w:t>
       </w:r>
     </w:p>
     <w:p>
       <w:pPr>
         <w:pStyle w:val="Subtitle"/>
+        <w:rPr>
+          <w:b/>
+          <w:bCs/>
+        </w:rPr>
       </w:pPr>
       <w:r>
         <w:t>Java, ReactJS, De</w:t>
@@ -36,167 +49,129 @@
         <w:t>Cloud</w:t>
       </w:r>
     </w:p>
-    <w:tbl>
-      <w:tblPr>
-        <w:tblStyle w:val="PlainTable1"/>
-        <w:tblW w:w="0" w:type="auto"/>
-        <w:tblLook w:val="0400" w:firstRow="0" w:lastRow="0" w:firstColumn="0" w:lastColumn="0" w:noHBand="0" w:noVBand="1"/>
-      </w:tblPr>
-      <w:tblGrid>
-        <w:gridCol w:w="5240"/>
-        <w:gridCol w:w="5240"/>
-      </w:tblGrid>
-      <w:tr>
-        <w:trPr>
-          <w:cnfStyle w:val="000000100000" w:firstRow="0" w:lastRow="0" w:firstColumn="0" w:lastColumn="0" w:oddVBand="0" w:evenVBand="0" w:oddHBand="1" w:evenHBand="0" w:firstRowFirstColumn="0" w:firstRowLastColumn="0" w:lastRowFirstColumn="0" w:lastRowLastColumn="0"/>
-          <w:trHeight w:val="144"/>
-        </w:trPr>
-        <w:tc>
-          <w:tcPr>
-            <w:tcW w:w="5240" w:type="dxa"/>
-          </w:tcPr>
-          <w:p>
-            <w:r>
-              <w:t>Email:</w:t>
-            </w:r>
-          </w:p>
-        </w:tc>
-        <w:tc>
-          <w:tcPr>
-            <w:tcW w:w="5240" w:type="dxa"/>
-          </w:tcPr>
-          <w:p>
-            <w:hyperlink r:id="rId5" w:history="1">
-              <w:r>
-                <w:rPr>
-                  <w:rStyle w:val="Hyperlink"/>
-                </w:rPr>
-                <w:t>dmitry.denisenko@hotmail.com</w:t>
-              </w:r>
-            </w:hyperlink>
-          </w:p>
-        </w:tc>
-      </w:tr>
-      <w:tr>
-        <w:trPr>
-          <w:trHeight w:val="144"/>
-        </w:trPr>
-        <w:tc>
-          <w:tcPr>
-            <w:tcW w:w="5240" w:type="dxa"/>
-          </w:tcPr>
-          <w:p>
-            <w:r>
-              <w:t>Website:</w:t>
-            </w:r>
-          </w:p>
-        </w:tc>
-        <w:tc>
-          <w:tcPr>
-            <w:tcW w:w="5240" w:type="dxa"/>
-          </w:tcPr>
-          <w:p>
-            <w:hyperlink r:id="rId6" w:history="1">
-              <w:r>
-                <w:rPr>
-                  <w:rStyle w:val="Hyperlink"/>
-                </w:rPr>
-                <w:t>www.dimdnk.com</w:t>
-              </w:r>
-            </w:hyperlink>
-          </w:p>
-        </w:tc>
-      </w:tr>
-      <w:tr>
-        <w:trPr>
-          <w:cnfStyle w:val="000000100000" w:firstRow="0" w:lastRow="0" w:firstColumn="0" w:lastColumn="0" w:oddVBand="0" w:evenVBand="0" w:oddHBand="1" w:evenHBand="0" w:firstRowFirstColumn="0" w:firstRowLastColumn="0" w:lastRowFirstColumn="0" w:lastRowLastColumn="0"/>
-          <w:trHeight w:val="144"/>
-        </w:trPr>
-        <w:tc>
-          <w:tcPr>
-            <w:tcW w:w="5240" w:type="dxa"/>
-          </w:tcPr>
-          <w:p>
-            <w:r>
-              <w:t>GitHub Profile:</w:t>
-            </w:r>
-          </w:p>
-        </w:tc>
-        <w:tc>
-          <w:tcPr>
-            <w:tcW w:w="5240" w:type="dxa"/>
-          </w:tcPr>
-          <w:p>
-            <w:hyperlink r:id="rId7" w:history="1">
-              <w:r>
-                <w:rPr>
-                  <w:rStyle w:val="Hyperlink"/>
-                </w:rPr>
-                <w:t>github.com/</w:t>
-              </w:r>
-              <w:proofErr w:type="spellStart"/>
-              <w:r>
-                <w:rPr>
-                  <w:rStyle w:val="Hyperlink"/>
-                </w:rPr>
-                <w:t>dimdnk</w:t>
-              </w:r>
-              <w:proofErr w:type="spellEnd"/>
-            </w:hyperlink>
-          </w:p>
-        </w:tc>
-      </w:tr>
-      <w:tr>
-        <w:trPr>
-          <w:trHeight w:val="144"/>
-        </w:trPr>
-        <w:tc>
-          <w:tcPr>
-            <w:tcW w:w="5240" w:type="dxa"/>
-          </w:tcPr>
-          <w:p>
-            <w:r>
-              <w:t>LinkedIn:</w:t>
-            </w:r>
-          </w:p>
-        </w:tc>
-        <w:tc>
-          <w:tcPr>
-            <w:tcW w:w="5240" w:type="dxa"/>
-          </w:tcPr>
-          <w:p>
-            <w:hyperlink r:id="rId8" w:history="1">
-              <w:r>
-                <w:rPr>
-                  <w:rStyle w:val="Hyperlink"/>
-                </w:rPr>
-                <w:t>linkedin.com/in/</w:t>
-              </w:r>
-              <w:proofErr w:type="spellStart"/>
-              <w:r>
-                <w:rPr>
-                  <w:rStyle w:val="Hyperlink"/>
-                </w:rPr>
-                <w:t>dimdnk</w:t>
-              </w:r>
-              <w:proofErr w:type="spellEnd"/>
-            </w:hyperlink>
-          </w:p>
-        </w:tc>
-      </w:tr>
-    </w:tbl>
+    <w:p>
+      <w:pPr>
+        <w:rPr>
+          <w:b/>
+          <w:bCs/>
+        </w:rPr>
+      </w:pPr>
+    </w:p>
+    <w:p>
+      <w:r>
+        <w:rPr>
+          <w:b/>
+          <w:bCs/>
+        </w:rPr>
+        <w:t>Email:</w:t>
+      </w:r>
+      <w:r>
+        <w:t xml:space="preserve"> </w:t>
+      </w:r>
+      <w:hyperlink r:id="rId5" w:history="1">
+        <w:r>
+          <w:rPr>
+            <w:rStyle w:val="Hyperlink"/>
+          </w:rPr>
+          <w:t>dmitry.denisenko@hotmail.com</w:t>
+        </w:r>
+      </w:hyperlink>
+      <w:r>
+        <w:br/>
+      </w:r>
+      <w:r>
+        <w:rPr>
+          <w:b/>
+          <w:bCs/>
+        </w:rPr>
+        <w:t>Website:</w:t>
+      </w:r>
+      <w:r>
+        <w:t xml:space="preserve"> </w:t>
+      </w:r>
+      <w:hyperlink r:id="rId6" w:history="1">
+        <w:r>
+          <w:rPr>
+            <w:rStyle w:val="Hyperlink"/>
+          </w:rPr>
+          <w:t>www.dimdnk.com</w:t>
+        </w:r>
+      </w:hyperlink>
+      <w:r>
+        <w:br/>
+      </w:r>
+      <w:r>
+        <w:rPr>
+          <w:b/>
+          <w:bCs/>
+        </w:rPr>
+        <w:t>GitHub Profile:</w:t>
+      </w:r>
+      <w:r>
+        <w:t xml:space="preserve"> </w:t>
+      </w:r>
+      <w:hyperlink r:id="rId7" w:history="1">
+        <w:r>
+          <w:rPr>
+            <w:rStyle w:val="Hyperlink"/>
+          </w:rPr>
+          <w:t>github.com/</w:t>
+        </w:r>
+        <w:proofErr w:type="spellStart"/>
+        <w:r>
+          <w:rPr>
+            <w:rStyle w:val="Hyperlink"/>
+          </w:rPr>
+          <w:t>dimdnk</w:t>
+        </w:r>
+        <w:proofErr w:type="spellEnd"/>
+      </w:hyperlink>
+      <w:r>
+        <w:br/>
+      </w:r>
+      <w:r>
+        <w:rPr>
+          <w:b/>
+          <w:bCs/>
+        </w:rPr>
+        <w:t>LinkedIn:</w:t>
+      </w:r>
+      <w:r>
+        <w:t xml:space="preserve"> </w:t>
+      </w:r>
+      <w:hyperlink r:id="rId8" w:history="1">
+        <w:r>
+          <w:rPr>
+            <w:rStyle w:val="Hyperlink"/>
+          </w:rPr>
+          <w:t>linkedin.com/in/</w:t>
+        </w:r>
+        <w:proofErr w:type="spellStart"/>
+        <w:r>
+          <w:rPr>
+            <w:rStyle w:val="Hyperlink"/>
+          </w:rPr>
+          <w:t>dimdnk</w:t>
+        </w:r>
+        <w:proofErr w:type="spellEnd"/>
+      </w:hyperlink>
+    </w:p>
     <w:p>
       <w:pPr>
         <w:pStyle w:val="Heading1"/>
         <w:rPr>
           <w:rFonts w:ascii="Calibri Light" w:hAnsi="Calibri Light" w:cs="Calibri Light"/>
           <w:color w:val="2E74B5"/>
+          <w:sz w:val="34"/>
+          <w:szCs w:val="34"/>
         </w:rPr>
       </w:pPr>
       <w:r>
         <w:rPr>
           <w:rFonts w:ascii="Calibri Light" w:hAnsi="Calibri Light" w:cs="Calibri Light"/>
           <w:color w:val="2E74B5"/>
+          <w:sz w:val="34"/>
+          <w:szCs w:val="34"/>
         </w:rPr>
         <w:t>Professional Summary</w:t>
       </w:r>
@@ -215,15 +190,13 @@
         </w:rPr>
         <w:t xml:space="preserve">Platform Engineer with 15+ years in IT, </w:t>
       </w:r>
-      <w:proofErr w:type="spellStart"/>
-      <w:r>
-        <w:rPr>
-          <w:rFonts w:ascii="Calibri" w:hAnsi="Calibri" w:cs="Calibri"/>
-          <w:color w:val="000000"/>
-        </w:rPr>
-        <w:t>specialising</w:t>
-      </w:r>
-      <w:proofErr w:type="spellEnd"/>
+      <w:r>
+        <w:rPr>
+          <w:rFonts w:ascii="Calibri" w:hAnsi="Calibri" w:cs="Calibri"/>
+          <w:color w:val="000000"/>
+        </w:rPr>
+        <w:t>specializing</w:t>
+      </w:r>
       <w:r>
         <w:rPr>
           <w:rFonts w:ascii="Calibri" w:hAnsi="Calibri" w:cs="Calibri"/>
@@ -275,331 +248,6 @@
           <w:color w:val="000000"/>
         </w:rPr>
         <w:t>Key Expertise:</w:t>
-      </w:r>
-    </w:p>
-    <w:p>
-      <w:pPr>
-        <w:ind w:left="1080"/>
-        <w:rPr>
-          <w:rFonts w:ascii="Calibri" w:hAnsi="Calibri" w:cs="Calibri"/>
-          <w:color w:val="000000"/>
-        </w:rPr>
-      </w:pPr>
-      <w:r>
-        <w:rPr>
-          <w:rFonts w:ascii="Calibri" w:hAnsi="Calibri" w:cs="Calibri"/>
-          <w:b/>
-          <w:color w:val="000000"/>
-        </w:rPr>
-        <w:t>Product Development:</w:t>
-      </w:r>
-      <w:r>
-        <w:rPr>
-          <w:rFonts w:ascii="Calibri" w:hAnsi="Calibri" w:cs="Calibri"/>
-          <w:color w:val="000000"/>
-        </w:rPr>
-        <w:t xml:space="preserve"> Delivers full-stack SaaS platforms with Java (17/21) and Spring Boot 3,</w:t>
-      </w:r>
-      <w:r>
-        <w:rPr>
-          <w:rFonts w:ascii="Calibri" w:hAnsi="Calibri" w:cs="Calibri"/>
-          <w:color w:val="000000"/>
-        </w:rPr>
-        <w:t xml:space="preserve"> React UI, sync and async communication architectures,</w:t>
-      </w:r>
-      <w:r>
-        <w:rPr>
-          <w:rFonts w:ascii="Calibri" w:hAnsi="Calibri" w:cs="Calibri"/>
-          <w:color w:val="000000"/>
-        </w:rPr>
-        <w:t xml:space="preserve"> aligning tech to business requirements.</w:t>
-      </w:r>
-      <w:r>
-        <w:rPr>
-          <w:rFonts w:ascii="Calibri" w:hAnsi="Calibri" w:cs="Calibri"/>
-          <w:color w:val="000000"/>
-        </w:rPr>
-        <w:br/>
-      </w:r>
-      <w:r>
-        <w:rPr>
-          <w:rFonts w:ascii="Calibri" w:hAnsi="Calibri" w:cs="Calibri"/>
-          <w:b/>
-          <w:color w:val="000000"/>
-        </w:rPr>
-        <w:t>Architecture:</w:t>
-      </w:r>
-      <w:r>
-        <w:rPr>
-          <w:rFonts w:ascii="Calibri" w:hAnsi="Calibri" w:cs="Calibri"/>
-          <w:color w:val="000000"/>
-        </w:rPr>
-        <w:t xml:space="preserve"> Designs reliable, event-driven systems using Kafka Streams, Apache Camel, and Saga/Event-Sourcing.</w:t>
-      </w:r>
-      <w:r>
-        <w:rPr>
-          <w:rFonts w:ascii="Calibri" w:hAnsi="Calibri" w:cs="Calibri"/>
-          <w:color w:val="000000"/>
-        </w:rPr>
-        <w:br/>
-      </w:r>
-      <w:r>
-        <w:rPr>
-          <w:rFonts w:ascii="Calibri" w:hAnsi="Calibri" w:cs="Calibri"/>
-          <w:b/>
-          <w:color w:val="000000"/>
-        </w:rPr>
-        <w:t>Cloud &amp; Infrastructure:</w:t>
-      </w:r>
-      <w:r>
-        <w:rPr>
-          <w:rFonts w:ascii="Calibri" w:hAnsi="Calibri" w:cs="Calibri"/>
-          <w:color w:val="000000"/>
-        </w:rPr>
-        <w:t xml:space="preserve"> Proficient in Kubernetes/OpenShift; led 20+ enterprise migrations and boosted CI/CD efficiency by 60%.</w:t>
-      </w:r>
-      <w:r>
-        <w:rPr>
-          <w:rFonts w:ascii="Calibri" w:hAnsi="Calibri" w:cs="Calibri"/>
-          <w:color w:val="000000"/>
-        </w:rPr>
-        <w:br/>
-      </w:r>
-      <w:r>
-        <w:rPr>
-          <w:rFonts w:ascii="Calibri" w:hAnsi="Calibri" w:cs="Calibri"/>
-          <w:b/>
-          <w:color w:val="000000"/>
-        </w:rPr>
-        <w:t>Data Engineering:</w:t>
-      </w:r>
-      <w:r>
-        <w:rPr>
-          <w:rFonts w:ascii="Calibri" w:hAnsi="Calibri" w:cs="Calibri"/>
-          <w:color w:val="000000"/>
-        </w:rPr>
-        <w:t xml:space="preserve"> Builds fast ETL and stream-processing engines for investment and retail data.</w:t>
-      </w:r>
-    </w:p>
-    <w:p>
-      <w:pPr>
-        <w:pStyle w:val="Heading1"/>
-        <w:rPr>
-          <w:rFonts w:ascii="Calibri Light" w:hAnsi="Calibri Light" w:cs="Calibri Light"/>
-          <w:color w:val="2E74B5"/>
-        </w:rPr>
-      </w:pPr>
-      <w:r>
-        <w:rPr>
-          <w:rFonts w:ascii="Calibri Light" w:hAnsi="Calibri Light" w:cs="Calibri Light"/>
-          <w:color w:val="2E74B5"/>
-        </w:rPr>
-        <w:t>Technical Skills</w:t>
-      </w:r>
-    </w:p>
-    <w:p>
-      <w:pPr>
-        <w:ind w:left="300"/>
-        <w:rPr>
-          <w:rFonts w:ascii="Calibri" w:hAnsi="Calibri" w:cs="Calibri"/>
-          <w:color w:val="000000"/>
-        </w:rPr>
-      </w:pPr>
-      <w:r>
-        <w:rPr>
-          <w:rFonts w:ascii="Calibri" w:hAnsi="Calibri" w:cs="Calibri"/>
-          <w:color w:val="000000"/>
-        </w:rPr>
-        <w:t>Languages: Java 17+, TypeScript/JavaScript, SQL (PostgreSQL/MySQL), PHP 8+, HTML5, CSS3</w:t>
-      </w:r>
-      <w:r>
-        <w:rPr>
-          <w:rFonts w:ascii="Calibri" w:hAnsi="Calibri" w:cs="Calibri"/>
-          <w:color w:val="000000"/>
-        </w:rPr>
-        <w:br/>
-      </w:r>
-      <w:r>
-        <w:rPr>
-          <w:rFonts w:ascii="Calibri" w:hAnsi="Calibri" w:cs="Calibri"/>
-          <w:color w:val="000000"/>
-        </w:rPr>
-        <w:t xml:space="preserve">Backend: Spring Boot 3+, Hibernate/JPA, </w:t>
-      </w:r>
-      <w:proofErr w:type="spellStart"/>
-      <w:r>
-        <w:rPr>
-          <w:rFonts w:ascii="Calibri" w:hAnsi="Calibri" w:cs="Calibri"/>
-          <w:color w:val="000000"/>
-        </w:rPr>
-        <w:t>MapStruct</w:t>
-      </w:r>
-      <w:proofErr w:type="spellEnd"/>
-      <w:r>
-        <w:rPr>
-          <w:rFonts w:ascii="Calibri" w:hAnsi="Calibri" w:cs="Calibri"/>
-          <w:color w:val="000000"/>
-        </w:rPr>
-        <w:t>, Apache Camel, Jackson, Laravel, Symfony, Doctrine ORM</w:t>
-      </w:r>
-      <w:r>
-        <w:rPr>
-          <w:rFonts w:ascii="Calibri" w:hAnsi="Calibri" w:cs="Calibri"/>
-          <w:color w:val="000000"/>
-        </w:rPr>
-        <w:br/>
-      </w:r>
-      <w:r>
-        <w:rPr>
-          <w:rFonts w:ascii="Calibri" w:hAnsi="Calibri" w:cs="Calibri"/>
-          <w:color w:val="000000"/>
-        </w:rPr>
-        <w:t xml:space="preserve">Frontend: Angular 13+, React 18+, MUI, </w:t>
-      </w:r>
-      <w:proofErr w:type="spellStart"/>
-      <w:r>
-        <w:rPr>
-          <w:rFonts w:ascii="Calibri" w:hAnsi="Calibri" w:cs="Calibri"/>
-          <w:color w:val="000000"/>
-        </w:rPr>
-        <w:t>Mantine</w:t>
-      </w:r>
-      <w:proofErr w:type="spellEnd"/>
-      <w:r>
-        <w:rPr>
-          <w:rFonts w:ascii="Calibri" w:hAnsi="Calibri" w:cs="Calibri"/>
-          <w:color w:val="000000"/>
-        </w:rPr>
-        <w:t xml:space="preserve">, Bootstrap, </w:t>
-      </w:r>
-      <w:proofErr w:type="spellStart"/>
-      <w:r>
-        <w:rPr>
-          <w:rFonts w:ascii="Calibri" w:hAnsi="Calibri" w:cs="Calibri"/>
-          <w:color w:val="000000"/>
-        </w:rPr>
-        <w:t>Vitest</w:t>
-      </w:r>
-      <w:proofErr w:type="spellEnd"/>
-      <w:r>
-        <w:rPr>
-          <w:rFonts w:ascii="Calibri" w:hAnsi="Calibri" w:cs="Calibri"/>
-          <w:color w:val="000000"/>
-        </w:rPr>
-        <w:t>, Cypress</w:t>
-      </w:r>
-      <w:r>
-        <w:rPr>
-          <w:rFonts w:ascii="Calibri" w:hAnsi="Calibri" w:cs="Calibri"/>
-          <w:color w:val="000000"/>
-        </w:rPr>
-        <w:br/>
-      </w:r>
-      <w:r>
-        <w:rPr>
-          <w:rFonts w:ascii="Calibri" w:hAnsi="Calibri" w:cs="Calibri"/>
-          <w:color w:val="000000"/>
-        </w:rPr>
-        <w:t>Data/Messaging: Kafka (Avro), RabbitMQ, MongoDB, Couchbase</w:t>
-      </w:r>
-      <w:r>
-        <w:rPr>
-          <w:rFonts w:ascii="Calibri" w:hAnsi="Calibri" w:cs="Calibri"/>
-          <w:color w:val="000000"/>
-        </w:rPr>
-        <w:br/>
-      </w:r>
-      <w:r>
-        <w:rPr>
-          <w:rFonts w:ascii="Calibri" w:hAnsi="Calibri" w:cs="Calibri"/>
-          <w:color w:val="000000"/>
-        </w:rPr>
-        <w:t>CI/CD &amp; DevOps: GitHub Actions, GitLab CI, Jenkins, Drone CI, Docker, Flyway/Liquibase</w:t>
-      </w:r>
-      <w:r>
-        <w:rPr>
-          <w:rFonts w:ascii="Calibri" w:hAnsi="Calibri" w:cs="Calibri"/>
-          <w:color w:val="000000"/>
-        </w:rPr>
-        <w:br/>
-      </w:r>
-      <w:r>
-        <w:rPr>
-          <w:rFonts w:ascii="Calibri" w:hAnsi="Calibri" w:cs="Calibri"/>
-          <w:color w:val="000000"/>
-        </w:rPr>
-        <w:t xml:space="preserve">Tools/Testing: JUnit 5, Mockito, </w:t>
-      </w:r>
-      <w:proofErr w:type="spellStart"/>
-      <w:r>
-        <w:rPr>
-          <w:rFonts w:ascii="Calibri" w:hAnsi="Calibri" w:cs="Calibri"/>
-          <w:color w:val="000000"/>
-        </w:rPr>
-        <w:t>WireMock</w:t>
-      </w:r>
-      <w:proofErr w:type="spellEnd"/>
-      <w:r>
-        <w:rPr>
-          <w:rFonts w:ascii="Calibri" w:hAnsi="Calibri" w:cs="Calibri"/>
-          <w:color w:val="000000"/>
-        </w:rPr>
-        <w:t xml:space="preserve">, Maven, Gradle, </w:t>
-      </w:r>
-      <w:proofErr w:type="spellStart"/>
-      <w:r>
-        <w:rPr>
-          <w:rFonts w:ascii="Calibri" w:hAnsi="Calibri" w:cs="Calibri"/>
-          <w:color w:val="000000"/>
-        </w:rPr>
-        <w:t>npm</w:t>
-      </w:r>
-      <w:proofErr w:type="spellEnd"/>
-      <w:r>
-        <w:rPr>
-          <w:rFonts w:ascii="Calibri" w:hAnsi="Calibri" w:cs="Calibri"/>
-          <w:color w:val="000000"/>
-        </w:rPr>
-        <w:t>, Swagger/</w:t>
-      </w:r>
-      <w:proofErr w:type="spellStart"/>
-      <w:r>
-        <w:rPr>
-          <w:rFonts w:ascii="Calibri" w:hAnsi="Calibri" w:cs="Calibri"/>
-          <w:color w:val="000000"/>
-        </w:rPr>
-        <w:t>OpenAPI</w:t>
-      </w:r>
-      <w:proofErr w:type="spellEnd"/>
-      <w:r>
-        <w:rPr>
-          <w:rFonts w:ascii="Calibri" w:hAnsi="Calibri" w:cs="Calibri"/>
-          <w:color w:val="000000"/>
-        </w:rPr>
-        <w:br/>
-      </w:r>
-      <w:r>
-        <w:rPr>
-          <w:rFonts w:ascii="Calibri" w:hAnsi="Calibri" w:cs="Calibri"/>
-          <w:color w:val="000000"/>
-        </w:rPr>
-        <w:t>Cloud/Orchestration: Kubernetes, OpenShift, AWS, Google Cloud Run, Docker</w:t>
-      </w:r>
-    </w:p>
-    <w:p>
-      <w:pPr>
-        <w:pStyle w:val="Heading1"/>
-        <w:rPr>
-          <w:rFonts w:ascii="Calibri Light" w:hAnsi="Calibri Light" w:cs="Calibri Light"/>
-          <w:color w:val="2E74B5"/>
-        </w:rPr>
-      </w:pPr>
-      <w:r>
-        <w:rPr>
-          <w:rFonts w:ascii="Calibri Light" w:hAnsi="Calibri Light" w:cs="Calibri Light"/>
-          <w:color w:val="2E74B5"/>
-        </w:rPr>
-        <w:t>Work Experience</w:t>
       </w:r>
     </w:p>
     <w:p>
@@ -607,7 +255,7 @@
         <w:pStyle w:val="ListParagraph"/>
         <w:numPr>
           <w:ilvl w:val="0"/>
-          <w:numId w:val="4"/>
+          <w:numId w:val="6"/>
         </w:numPr>
         <w:rPr>
           <w:rFonts w:ascii="Calibri" w:hAnsi="Calibri" w:cs="Calibri"/>
@@ -617,23 +265,45 @@
       <w:r>
         <w:rPr>
           <w:rFonts w:ascii="Calibri" w:hAnsi="Calibri" w:cs="Calibri"/>
-          <w:color w:val="000000"/>
-        </w:rPr>
-        <w:t>IQ Key Value Foundation – Founder/Technologist (2021</w:t>
-      </w:r>
-      <w:r>
-        <w:rPr>
-          <w:rFonts w:ascii="Calibri" w:hAnsi="Calibri" w:cs="Calibri"/>
-          <w:color w:val="000000"/>
-        </w:rPr>
-        <w:t>-</w:t>
-      </w:r>
-      <w:r>
-        <w:rPr>
-          <w:rFonts w:ascii="Calibri" w:hAnsi="Calibri" w:cs="Calibri"/>
-          <w:color w:val="000000"/>
-        </w:rPr>
-        <w:t>Present)</w:t>
+          <w:b/>
+          <w:color w:val="000000"/>
+        </w:rPr>
+        <w:t>Product Development:</w:t>
+      </w:r>
+      <w:r>
+        <w:rPr>
+          <w:rFonts w:ascii="Calibri" w:hAnsi="Calibri" w:cs="Calibri"/>
+          <w:color w:val="000000"/>
+        </w:rPr>
+        <w:t xml:space="preserve"> Delivers full-stack SaaS platforms with Java (17/21) and Spring Boot 3, React</w:t>
+      </w:r>
+      <w:r>
+        <w:rPr>
+          <w:rFonts w:ascii="Calibri" w:hAnsi="Calibri" w:cs="Calibri"/>
+          <w:color w:val="000000"/>
+        </w:rPr>
+        <w:t>JS 18</w:t>
+      </w:r>
+      <w:r>
+        <w:rPr>
+          <w:rFonts w:ascii="Calibri" w:hAnsi="Calibri" w:cs="Calibri"/>
+          <w:color w:val="000000"/>
+        </w:rPr>
+        <w:t>, sync and async communication</w:t>
+      </w:r>
+      <w:r>
+        <w:rPr>
+          <w:rFonts w:ascii="Calibri" w:hAnsi="Calibri" w:cs="Calibri"/>
+          <w:color w:val="000000"/>
+        </w:rPr>
+        <w:t>, supporting 12-factors;</w:t>
+      </w:r>
+      <w:r>
+        <w:rPr>
+          <w:rFonts w:ascii="Calibri" w:hAnsi="Calibri" w:cs="Calibri"/>
+          <w:color w:val="000000"/>
+        </w:rPr>
+        <w:t xml:space="preserve"> aligning tech to business requirements.</w:t>
       </w:r>
     </w:p>
     <w:p>
@@ -641,7 +311,7 @@
         <w:pStyle w:val="ListParagraph"/>
         <w:numPr>
           <w:ilvl w:val="0"/>
-          <w:numId w:val="4"/>
+          <w:numId w:val="6"/>
         </w:numPr>
         <w:rPr>
           <w:rFonts w:ascii="Calibri" w:hAnsi="Calibri" w:cs="Calibri"/>
@@ -651,23 +321,17 @@
       <w:r>
         <w:rPr>
           <w:rFonts w:ascii="Calibri" w:hAnsi="Calibri" w:cs="Calibri"/>
-          <w:color w:val="000000"/>
-        </w:rPr>
-        <w:t>DataArt Solutions, Inc. – Senior Software Engineer (2021</w:t>
-      </w:r>
-      <w:r>
-        <w:rPr>
-          <w:rFonts w:ascii="Calibri" w:hAnsi="Calibri" w:cs="Calibri"/>
-          <w:color w:val="000000"/>
-        </w:rPr>
-        <w:t>-</w:t>
-      </w:r>
-      <w:r>
-        <w:rPr>
-          <w:rFonts w:ascii="Calibri" w:hAnsi="Calibri" w:cs="Calibri"/>
-          <w:color w:val="000000"/>
-        </w:rPr>
-        <w:t>2025)</w:t>
+          <w:b/>
+          <w:color w:val="000000"/>
+        </w:rPr>
+        <w:t>Architecture:</w:t>
+      </w:r>
+      <w:r>
+        <w:rPr>
+          <w:rFonts w:ascii="Calibri" w:hAnsi="Calibri" w:cs="Calibri"/>
+          <w:color w:val="000000"/>
+        </w:rPr>
+        <w:t xml:space="preserve"> Designs reliable, event-driven systems using Kafka Streams, Apache Camel, and Saga/Event-Sourcing.</w:t>
       </w:r>
     </w:p>
     <w:p>
@@ -675,7 +339,7 @@
         <w:pStyle w:val="ListParagraph"/>
         <w:numPr>
           <w:ilvl w:val="0"/>
-          <w:numId w:val="4"/>
+          <w:numId w:val="6"/>
         </w:numPr>
         <w:rPr>
           <w:rFonts w:ascii="Calibri" w:hAnsi="Calibri" w:cs="Calibri"/>
@@ -685,23 +349,17 @@
       <w:r>
         <w:rPr>
           <w:rFonts w:ascii="Calibri" w:hAnsi="Calibri" w:cs="Calibri"/>
-          <w:color w:val="000000"/>
-        </w:rPr>
-        <w:t>Amadeus IT Group SA – Software Engineer (2016</w:t>
-      </w:r>
-      <w:r>
-        <w:rPr>
-          <w:rFonts w:ascii="Calibri" w:hAnsi="Calibri" w:cs="Calibri"/>
-          <w:color w:val="000000"/>
-        </w:rPr>
-        <w:t>-</w:t>
-      </w:r>
-      <w:r>
-        <w:rPr>
-          <w:rFonts w:ascii="Calibri" w:hAnsi="Calibri" w:cs="Calibri"/>
-          <w:color w:val="000000"/>
-        </w:rPr>
-        <w:t>2021)</w:t>
+          <w:b/>
+          <w:color w:val="000000"/>
+        </w:rPr>
+        <w:t>Cloud &amp; Infrastructure:</w:t>
+      </w:r>
+      <w:r>
+        <w:rPr>
+          <w:rFonts w:ascii="Calibri" w:hAnsi="Calibri" w:cs="Calibri"/>
+          <w:color w:val="000000"/>
+        </w:rPr>
+        <w:t xml:space="preserve"> Proficient in Kubernetes/OpenShift; led 20+ enterprise migrations and boosted CI/CD efficiency by 60%.</w:t>
       </w:r>
     </w:p>
     <w:p>
@@ -709,20 +367,103 @@
         <w:pStyle w:val="ListParagraph"/>
         <w:numPr>
           <w:ilvl w:val="0"/>
-          <w:numId w:val="4"/>
+          <w:numId w:val="6"/>
         </w:numPr>
         <w:rPr>
           <w:rFonts w:ascii="Calibri" w:hAnsi="Calibri" w:cs="Calibri"/>
           <w:color w:val="000000"/>
         </w:rPr>
       </w:pPr>
+      <w:r>
+        <w:rPr>
+          <w:rFonts w:ascii="Calibri" w:hAnsi="Calibri" w:cs="Calibri"/>
+          <w:b/>
+          <w:color w:val="000000"/>
+        </w:rPr>
+        <w:t>Data Engineering:</w:t>
+      </w:r>
+      <w:r>
+        <w:rPr>
+          <w:rFonts w:ascii="Calibri" w:hAnsi="Calibri" w:cs="Calibri"/>
+          <w:color w:val="000000"/>
+        </w:rPr>
+        <w:t xml:space="preserve"> Builds fast ETL and stream-processing engines for investment and retail data.</w:t>
+      </w:r>
+    </w:p>
+    <w:p>
+      <w:pPr>
+        <w:pStyle w:val="Heading1"/>
+        <w:rPr>
+          <w:rFonts w:ascii="Calibri Light" w:hAnsi="Calibri Light" w:cs="Calibri Light"/>
+          <w:color w:val="2E74B5"/>
+          <w:sz w:val="34"/>
+          <w:szCs w:val="34"/>
+        </w:rPr>
+      </w:pPr>
+      <w:r>
+        <w:rPr>
+          <w:rFonts w:ascii="Calibri Light" w:hAnsi="Calibri Light" w:cs="Calibri Light"/>
+          <w:color w:val="2E74B5"/>
+          <w:sz w:val="34"/>
+          <w:szCs w:val="34"/>
+        </w:rPr>
+        <w:t>Technical Skills</w:t>
+      </w:r>
+    </w:p>
+    <w:p>
+      <w:pPr>
+        <w:ind w:left="300"/>
+        <w:rPr>
+          <w:rFonts w:ascii="Calibri" w:hAnsi="Calibri" w:cs="Calibri"/>
+          <w:color w:val="000000"/>
+        </w:rPr>
+      </w:pPr>
+      <w:r>
+        <w:rPr>
+          <w:rFonts w:ascii="Calibri" w:hAnsi="Calibri" w:cs="Calibri"/>
+          <w:b/>
+          <w:bCs/>
+          <w:color w:val="000000"/>
+        </w:rPr>
+        <w:t>Languages:</w:t>
+      </w:r>
+      <w:r>
+        <w:rPr>
+          <w:rFonts w:ascii="Calibri" w:hAnsi="Calibri" w:cs="Calibri"/>
+          <w:color w:val="000000"/>
+        </w:rPr>
+        <w:t xml:space="preserve"> Java 17+, TypeScript/JavaScript, SQL (PostgreSQL/MySQL), PHP 8+, HTML5, CSS3</w:t>
+      </w:r>
+      <w:r>
+        <w:rPr>
+          <w:rFonts w:ascii="Calibri" w:hAnsi="Calibri" w:cs="Calibri"/>
+          <w:color w:val="000000"/>
+        </w:rPr>
+        <w:br/>
+      </w:r>
+      <w:r>
+        <w:rPr>
+          <w:rFonts w:ascii="Calibri" w:hAnsi="Calibri" w:cs="Calibri"/>
+          <w:b/>
+          <w:bCs/>
+          <w:color w:val="000000"/>
+        </w:rPr>
+        <w:t>Backend:</w:t>
+      </w:r>
+      <w:r>
+        <w:rPr>
+          <w:rFonts w:ascii="Calibri" w:hAnsi="Calibri" w:cs="Calibri"/>
+          <w:color w:val="000000"/>
+        </w:rPr>
+        <w:t xml:space="preserve"> Spring Boot 3+, Hibernate/JPA, </w:t>
+      </w:r>
       <w:proofErr w:type="spellStart"/>
       <w:r>
         <w:rPr>
           <w:rFonts w:ascii="Calibri" w:hAnsi="Calibri" w:cs="Calibri"/>
           <w:color w:val="000000"/>
         </w:rPr>
-        <w:t>WellCart</w:t>
+        <w:t>MapStruct</w:t>
       </w:r>
       <w:proofErr w:type="spellEnd"/>
       <w:r>
@@ -730,21 +471,215 @@
           <w:rFonts w:ascii="Calibri" w:hAnsi="Calibri" w:cs="Calibri"/>
           <w:color w:val="000000"/>
         </w:rPr>
-        <w:t xml:space="preserve"> – Tech Lead/Co-founder (2012</w:t>
-      </w:r>
-      <w:r>
-        <w:rPr>
-          <w:rFonts w:ascii="Calibri" w:hAnsi="Calibri" w:cs="Calibri"/>
-          <w:color w:val="000000"/>
-        </w:rPr>
-        <w:t>-</w:t>
-      </w:r>
-      <w:r>
-        <w:rPr>
-          <w:rFonts w:ascii="Calibri" w:hAnsi="Calibri" w:cs="Calibri"/>
-          <w:color w:val="000000"/>
-        </w:rPr>
-        <w:t>2016)</w:t>
+        <w:t>, Apache Camel, Jackson, Laravel, Symfony, Doctrine ORM</w:t>
+      </w:r>
+      <w:r>
+        <w:rPr>
+          <w:rFonts w:ascii="Calibri" w:hAnsi="Calibri" w:cs="Calibri"/>
+          <w:color w:val="000000"/>
+        </w:rPr>
+        <w:br/>
+      </w:r>
+      <w:r>
+        <w:rPr>
+          <w:rFonts w:ascii="Calibri" w:hAnsi="Calibri" w:cs="Calibri"/>
+          <w:b/>
+          <w:bCs/>
+          <w:color w:val="000000"/>
+        </w:rPr>
+        <w:t>Frontend:</w:t>
+      </w:r>
+      <w:r>
+        <w:rPr>
+          <w:rFonts w:ascii="Calibri" w:hAnsi="Calibri" w:cs="Calibri"/>
+          <w:color w:val="000000"/>
+        </w:rPr>
+        <w:t xml:space="preserve"> Angular 13+, React 18+, MUI, </w:t>
+      </w:r>
+      <w:proofErr w:type="spellStart"/>
+      <w:r>
+        <w:rPr>
+          <w:rFonts w:ascii="Calibri" w:hAnsi="Calibri" w:cs="Calibri"/>
+          <w:color w:val="000000"/>
+        </w:rPr>
+        <w:t>Mantine</w:t>
+      </w:r>
+      <w:proofErr w:type="spellEnd"/>
+      <w:r>
+        <w:rPr>
+          <w:rFonts w:ascii="Calibri" w:hAnsi="Calibri" w:cs="Calibri"/>
+          <w:color w:val="000000"/>
+        </w:rPr>
+        <w:t xml:space="preserve">, Bootstrap, </w:t>
+      </w:r>
+      <w:proofErr w:type="spellStart"/>
+      <w:r>
+        <w:rPr>
+          <w:rFonts w:ascii="Calibri" w:hAnsi="Calibri" w:cs="Calibri"/>
+          <w:color w:val="000000"/>
+        </w:rPr>
+        <w:t>Vitest</w:t>
+      </w:r>
+      <w:proofErr w:type="spellEnd"/>
+      <w:r>
+        <w:rPr>
+          <w:rFonts w:ascii="Calibri" w:hAnsi="Calibri" w:cs="Calibri"/>
+          <w:color w:val="000000"/>
+        </w:rPr>
+        <w:t>, Cypress</w:t>
+      </w:r>
+      <w:r>
+        <w:rPr>
+          <w:rFonts w:ascii="Calibri" w:hAnsi="Calibri" w:cs="Calibri"/>
+          <w:color w:val="000000"/>
+        </w:rPr>
+        <w:br/>
+      </w:r>
+      <w:r>
+        <w:rPr>
+          <w:rFonts w:ascii="Calibri" w:hAnsi="Calibri" w:cs="Calibri"/>
+          <w:b/>
+          <w:bCs/>
+          <w:color w:val="000000"/>
+        </w:rPr>
+        <w:t>Data/Messaging:</w:t>
+      </w:r>
+      <w:r>
+        <w:rPr>
+          <w:rFonts w:ascii="Calibri" w:hAnsi="Calibri" w:cs="Calibri"/>
+          <w:color w:val="000000"/>
+        </w:rPr>
+        <w:t xml:space="preserve"> Kafka (Avro), RabbitMQ, MongoDB, Couchbase</w:t>
+      </w:r>
+      <w:r>
+        <w:rPr>
+          <w:rFonts w:ascii="Calibri" w:hAnsi="Calibri" w:cs="Calibri"/>
+          <w:color w:val="000000"/>
+        </w:rPr>
+        <w:br/>
+      </w:r>
+      <w:r>
+        <w:rPr>
+          <w:rFonts w:ascii="Calibri" w:hAnsi="Calibri" w:cs="Calibri"/>
+          <w:b/>
+          <w:bCs/>
+          <w:color w:val="000000"/>
+        </w:rPr>
+        <w:t>CI/CD &amp; DevOps:</w:t>
+      </w:r>
+      <w:r>
+        <w:rPr>
+          <w:rFonts w:ascii="Calibri" w:hAnsi="Calibri" w:cs="Calibri"/>
+          <w:color w:val="000000"/>
+        </w:rPr>
+        <w:t xml:space="preserve"> GitHub Actions, GitLab CI, Jenkins, Drone CI, Docker, Flyway/Liquibase</w:t>
+      </w:r>
+      <w:r>
+        <w:rPr>
+          <w:rFonts w:ascii="Calibri" w:hAnsi="Calibri" w:cs="Calibri"/>
+          <w:color w:val="000000"/>
+        </w:rPr>
+        <w:br/>
+      </w:r>
+      <w:r>
+        <w:rPr>
+          <w:rFonts w:ascii="Calibri" w:hAnsi="Calibri" w:cs="Calibri"/>
+          <w:b/>
+          <w:bCs/>
+          <w:color w:val="000000"/>
+        </w:rPr>
+        <w:t>Tools/Testing:</w:t>
+      </w:r>
+      <w:r>
+        <w:rPr>
+          <w:rFonts w:ascii="Calibri" w:hAnsi="Calibri" w:cs="Calibri"/>
+          <w:color w:val="000000"/>
+        </w:rPr>
+        <w:t xml:space="preserve"> JUnit 5, Mockito, </w:t>
+      </w:r>
+      <w:proofErr w:type="spellStart"/>
+      <w:r>
+        <w:rPr>
+          <w:rFonts w:ascii="Calibri" w:hAnsi="Calibri" w:cs="Calibri"/>
+          <w:color w:val="000000"/>
+        </w:rPr>
+        <w:t>WireMock</w:t>
+      </w:r>
+      <w:proofErr w:type="spellEnd"/>
+      <w:r>
+        <w:rPr>
+          <w:rFonts w:ascii="Calibri" w:hAnsi="Calibri" w:cs="Calibri"/>
+          <w:color w:val="000000"/>
+        </w:rPr>
+        <w:t xml:space="preserve">, Maven, Gradle, </w:t>
+      </w:r>
+      <w:proofErr w:type="spellStart"/>
+      <w:r>
+        <w:rPr>
+          <w:rFonts w:ascii="Calibri" w:hAnsi="Calibri" w:cs="Calibri"/>
+          <w:color w:val="000000"/>
+        </w:rPr>
+        <w:t>npm</w:t>
+      </w:r>
+      <w:proofErr w:type="spellEnd"/>
+      <w:r>
+        <w:rPr>
+          <w:rFonts w:ascii="Calibri" w:hAnsi="Calibri" w:cs="Calibri"/>
+          <w:color w:val="000000"/>
+        </w:rPr>
+        <w:t>, Swagger/</w:t>
+      </w:r>
+      <w:proofErr w:type="spellStart"/>
+      <w:r>
+        <w:rPr>
+          <w:rFonts w:ascii="Calibri" w:hAnsi="Calibri" w:cs="Calibri"/>
+          <w:color w:val="000000"/>
+        </w:rPr>
+        <w:t>OpenAPI</w:t>
+      </w:r>
+      <w:proofErr w:type="spellEnd"/>
+      <w:r>
+        <w:rPr>
+          <w:rFonts w:ascii="Calibri" w:hAnsi="Calibri" w:cs="Calibri"/>
+          <w:color w:val="000000"/>
+        </w:rPr>
+        <w:br/>
+      </w:r>
+      <w:r>
+        <w:rPr>
+          <w:rFonts w:ascii="Calibri" w:hAnsi="Calibri" w:cs="Calibri"/>
+          <w:b/>
+          <w:bCs/>
+          <w:color w:val="000000"/>
+        </w:rPr>
+        <w:t>Cloud/Orchestration:</w:t>
+      </w:r>
+      <w:r>
+        <w:rPr>
+          <w:rFonts w:ascii="Calibri" w:hAnsi="Calibri" w:cs="Calibri"/>
+          <w:color w:val="000000"/>
+        </w:rPr>
+        <w:t xml:space="preserve"> Kubernetes, OpenShift, AWS, Google Cloud Run, Docker</w:t>
+      </w:r>
+    </w:p>
+    <w:p>
+      <w:pPr>
+        <w:pStyle w:val="Heading1"/>
+        <w:rPr>
+          <w:rFonts w:ascii="Calibri Light" w:hAnsi="Calibri Light" w:cs="Calibri Light"/>
+          <w:color w:val="2E74B5"/>
+          <w:sz w:val="34"/>
+          <w:szCs w:val="34"/>
+        </w:rPr>
+      </w:pPr>
+      <w:r>
+        <w:rPr>
+          <w:rFonts w:ascii="Calibri Light" w:hAnsi="Calibri Light" w:cs="Calibri Light"/>
+          <w:color w:val="2E74B5"/>
+          <w:sz w:val="34"/>
+          <w:szCs w:val="34"/>
+        </w:rPr>
+        <w:t>Work Experience</w:t>
       </w:r>
     </w:p>
     <w:p>
@@ -752,7 +687,194 @@
         <w:pStyle w:val="ListParagraph"/>
         <w:numPr>
           <w:ilvl w:val="0"/>
-          <w:numId w:val="4"/>
+          <w:numId w:val="7"/>
+        </w:numPr>
+        <w:rPr>
+          <w:rFonts w:ascii="Calibri" w:hAnsi="Calibri" w:cs="Calibri"/>
+          <w:color w:val="000000"/>
+        </w:rPr>
+      </w:pPr>
+      <w:r>
+        <w:rPr>
+          <w:rFonts w:ascii="Calibri" w:hAnsi="Calibri" w:cs="Calibri"/>
+          <w:color w:val="000000"/>
+        </w:rPr>
+        <w:t xml:space="preserve">IQ Key Value Foundation – </w:t>
+      </w:r>
+      <w:r>
+        <w:rPr>
+          <w:rFonts w:ascii="Calibri" w:hAnsi="Calibri" w:cs="Calibri"/>
+          <w:color w:val="000000"/>
+        </w:rPr>
+        <w:t>Open</w:t>
+      </w:r>
+      <w:r>
+        <w:rPr>
+          <w:rFonts w:ascii="Calibri" w:hAnsi="Calibri" w:cs="Calibri"/>
+          <w:color w:val="000000"/>
+        </w:rPr>
+        <w:t>-</w:t>
+      </w:r>
+      <w:r>
+        <w:rPr>
+          <w:rFonts w:ascii="Calibri" w:hAnsi="Calibri" w:cs="Calibri"/>
+          <w:color w:val="000000"/>
+        </w:rPr>
+        <w:t xml:space="preserve">Source, </w:t>
+      </w:r>
+      <w:r>
+        <w:rPr>
+          <w:rFonts w:ascii="Calibri" w:hAnsi="Calibri" w:cs="Calibri"/>
+          <w:color w:val="000000"/>
+        </w:rPr>
+        <w:t>Founder/Technologist (2021</w:t>
+      </w:r>
+      <w:r>
+        <w:rPr>
+          <w:rFonts w:ascii="Calibri" w:hAnsi="Calibri" w:cs="Calibri"/>
+          <w:color w:val="000000"/>
+        </w:rPr>
+        <w:t>-</w:t>
+      </w:r>
+      <w:r>
+        <w:rPr>
+          <w:rFonts w:ascii="Calibri" w:hAnsi="Calibri" w:cs="Calibri"/>
+          <w:color w:val="000000"/>
+        </w:rPr>
+        <w:t>Present)</w:t>
+      </w:r>
+    </w:p>
+    <w:p>
+      <w:pPr>
+        <w:pStyle w:val="ListParagraph"/>
+        <w:numPr>
+          <w:ilvl w:val="0"/>
+          <w:numId w:val="7"/>
+        </w:numPr>
+        <w:rPr>
+          <w:rFonts w:ascii="Calibri" w:hAnsi="Calibri" w:cs="Calibri"/>
+          <w:color w:val="000000"/>
+        </w:rPr>
+      </w:pPr>
+      <w:r>
+        <w:rPr>
+          <w:rFonts w:ascii="Calibri" w:hAnsi="Calibri" w:cs="Calibri"/>
+          <w:color w:val="000000"/>
+        </w:rPr>
+        <w:t>DataArt Solutions, Inc. – Senior Software Engineer (2021</w:t>
+      </w:r>
+      <w:r>
+        <w:rPr>
+          <w:rFonts w:ascii="Calibri" w:hAnsi="Calibri" w:cs="Calibri"/>
+          <w:color w:val="000000"/>
+        </w:rPr>
+        <w:t>-</w:t>
+      </w:r>
+      <w:r>
+        <w:rPr>
+          <w:rFonts w:ascii="Calibri" w:hAnsi="Calibri" w:cs="Calibri"/>
+          <w:color w:val="000000"/>
+        </w:rPr>
+        <w:t>2025)</w:t>
+      </w:r>
+    </w:p>
+    <w:p>
+      <w:pPr>
+        <w:pStyle w:val="ListParagraph"/>
+        <w:numPr>
+          <w:ilvl w:val="0"/>
+          <w:numId w:val="7"/>
+        </w:numPr>
+        <w:rPr>
+          <w:rFonts w:ascii="Calibri" w:hAnsi="Calibri" w:cs="Calibri"/>
+          <w:color w:val="000000"/>
+        </w:rPr>
+      </w:pPr>
+      <w:r>
+        <w:rPr>
+          <w:rFonts w:ascii="Calibri" w:hAnsi="Calibri" w:cs="Calibri"/>
+          <w:color w:val="000000"/>
+        </w:rPr>
+        <w:t>Amadeus IT Group SA – Software Engineer (2016</w:t>
+      </w:r>
+      <w:r>
+        <w:rPr>
+          <w:rFonts w:ascii="Calibri" w:hAnsi="Calibri" w:cs="Calibri"/>
+          <w:color w:val="000000"/>
+        </w:rPr>
+        <w:t>-</w:t>
+      </w:r>
+      <w:r>
+        <w:rPr>
+          <w:rFonts w:ascii="Calibri" w:hAnsi="Calibri" w:cs="Calibri"/>
+          <w:color w:val="000000"/>
+        </w:rPr>
+        <w:t>2021)</w:t>
+      </w:r>
+    </w:p>
+    <w:p>
+      <w:pPr>
+        <w:pStyle w:val="ListParagraph"/>
+        <w:numPr>
+          <w:ilvl w:val="0"/>
+          <w:numId w:val="7"/>
+        </w:numPr>
+        <w:rPr>
+          <w:rFonts w:ascii="Calibri" w:hAnsi="Calibri" w:cs="Calibri"/>
+          <w:color w:val="000000"/>
+        </w:rPr>
+      </w:pPr>
+      <w:proofErr w:type="spellStart"/>
+      <w:r>
+        <w:rPr>
+          <w:rFonts w:ascii="Calibri" w:hAnsi="Calibri" w:cs="Calibri"/>
+          <w:color w:val="000000"/>
+        </w:rPr>
+        <w:t>WellCart</w:t>
+      </w:r>
+      <w:proofErr w:type="spellEnd"/>
+      <w:r>
+        <w:rPr>
+          <w:rFonts w:ascii="Calibri" w:hAnsi="Calibri" w:cs="Calibri"/>
+          <w:color w:val="000000"/>
+        </w:rPr>
+        <w:t xml:space="preserve"> – Tech Lead/</w:t>
+      </w:r>
+      <w:r>
+        <w:rPr>
+          <w:rFonts w:ascii="Calibri" w:hAnsi="Calibri" w:cs="Calibri"/>
+          <w:color w:val="000000"/>
+        </w:rPr>
+        <w:t>F</w:t>
+      </w:r>
+      <w:r>
+        <w:rPr>
+          <w:rFonts w:ascii="Calibri" w:hAnsi="Calibri" w:cs="Calibri"/>
+          <w:color w:val="000000"/>
+        </w:rPr>
+        <w:t>ounder (2012</w:t>
+      </w:r>
+      <w:r>
+        <w:rPr>
+          <w:rFonts w:ascii="Calibri" w:hAnsi="Calibri" w:cs="Calibri"/>
+          <w:color w:val="000000"/>
+        </w:rPr>
+        <w:t>-</w:t>
+      </w:r>
+      <w:r>
+        <w:rPr>
+          <w:rFonts w:ascii="Calibri" w:hAnsi="Calibri" w:cs="Calibri"/>
+          <w:color w:val="000000"/>
+        </w:rPr>
+        <w:t>2016)</w:t>
+      </w:r>
+    </w:p>
+    <w:p>
+      <w:pPr>
+        <w:pStyle w:val="ListParagraph"/>
+        <w:numPr>
+          <w:ilvl w:val="0"/>
+          <w:numId w:val="7"/>
         </w:numPr>
         <w:rPr>
           <w:rFonts w:ascii="Calibri" w:hAnsi="Calibri" w:cs="Calibri"/>
@@ -1191,8 +1313,8 @@
     <w:p>
       <w:pPr>
         <w:rPr>
-          <w:rFonts w:ascii="Calibri" w:hAnsi="Calibri" w:cs="Calibri"/>
-          <w:color w:val="000000"/>
+          <w:rFonts w:ascii="Calibri Light" w:hAnsi="Calibri Light" w:cs="Calibri Light"/>
+          <w:color w:val="2E74B5"/>
         </w:rPr>
       </w:pPr>
       <w:r>
@@ -1416,6 +1538,15 @@
         </w:rPr>
         <w:t>Monitored processes using Prometheus, Grafana, ELK Stack, and OpenShift dashboards</w:t>
       </w:r>
+    </w:p>
+    <w:p>
+      <w:pPr>
+        <w:pStyle w:val="Heading2"/>
+        <w:rPr>
+          <w:rFonts w:ascii="Calibri Light" w:hAnsi="Calibri Light" w:cs="Calibri Light"/>
+          <w:color w:val="2E74B5"/>
+        </w:rPr>
+      </w:pPr>
     </w:p>
     <w:p>
       <w:pPr>
@@ -1786,6 +1917,119 @@
     </w:lvl>
   </w:abstractNum>
   <w:abstractNum w:abstractNumId="1" w15:restartNumberingAfterBreak="0">
+    <w:nsid w:val="03B02F95"/>
+    <w:multiLevelType w:val="hybridMultilevel"/>
+    <w:tmpl w:val="663A56A8"/>
+    <w:lvl w:ilvl="0" w:tplc="0409000D">
+      <w:start w:val="1"/>
+      <w:numFmt w:val="bullet"/>
+      <w:lvlText w:val=""/>
+      <w:lvlJc w:val="left"/>
+      <w:pPr>
+        <w:ind w:left="1800" w:hanging="360"/>
+      </w:pPr>
+      <w:rPr>
+        <w:rFonts w:ascii="Wingdings" w:hAnsi="Wingdings" w:hint="default"/>
+      </w:rPr>
+    </w:lvl>
+    <w:lvl w:ilvl="1" w:tplc="04090003" w:tentative="1">
+      <w:start w:val="1"/>
+      <w:numFmt w:val="bullet"/>
+      <w:lvlText w:val="o"/>
+      <w:lvlJc w:val="left"/>
+      <w:pPr>
+        <w:ind w:left="2520" w:hanging="360"/>
+      </w:pPr>
+      <w:rPr>
+        <w:rFonts w:ascii="Courier New" w:hAnsi="Courier New" w:cs="Courier New" w:hint="default"/>
+      </w:rPr>
+    </w:lvl>
+    <w:lvl w:ilvl="2" w:tplc="04090005" w:tentative="1">
+      <w:start w:val="1"/>
+      <w:numFmt w:val="bullet"/>
+      <w:lvlText w:val=""/>
+      <w:lvlJc w:val="left"/>
+      <w:pPr>
+        <w:ind w:left="3240" w:hanging="360"/>
+      </w:pPr>
+      <w:rPr>
+        <w:rFonts w:ascii="Wingdings" w:hAnsi="Wingdings" w:hint="default"/>
+      </w:rPr>
+    </w:lvl>
+    <w:lvl w:ilvl="3" w:tplc="04090001" w:tentative="1">
+      <w:start w:val="1"/>
+      <w:numFmt w:val="bullet"/>
+      <w:lvlText w:val=""/>
+      <w:lvlJc w:val="left"/>
+      <w:pPr>
+        <w:ind w:left="3960" w:hanging="360"/>
+      </w:pPr>
+      <w:rPr>
+        <w:rFonts w:ascii="Symbol" w:hAnsi="Symbol" w:hint="default"/>
+      </w:rPr>
+    </w:lvl>
+    <w:lvl w:ilvl="4" w:tplc="04090003" w:tentative="1">
+      <w:start w:val="1"/>
+      <w:numFmt w:val="bullet"/>
+      <w:lvlText w:val="o"/>
+      <w:lvlJc w:val="left"/>
+      <w:pPr>
+        <w:ind w:left="4680" w:hanging="360"/>
+      </w:pPr>
+      <w:rPr>
+        <w:rFonts w:ascii="Courier New" w:hAnsi="Courier New" w:cs="Courier New" w:hint="default"/>
+      </w:rPr>
+    </w:lvl>
+    <w:lvl w:ilvl="5" w:tplc="04090005" w:tentative="1">
+      <w:start w:val="1"/>
+      <w:numFmt w:val="bullet"/>
+      <w:lvlText w:val=""/>
+      <w:lvlJc w:val="left"/>
+      <w:pPr>
+        <w:ind w:left="5400" w:hanging="360"/>
+      </w:pPr>
+      <w:rPr>
+        <w:rFonts w:ascii="Wingdings" w:hAnsi="Wingdings" w:hint="default"/>
+      </w:rPr>
+    </w:lvl>
+    <w:lvl w:ilvl="6" w:tplc="04090001" w:tentative="1">
+      <w:start w:val="1"/>
+      <w:numFmt w:val="bullet"/>
+      <w:lvlText w:val=""/>
+      <w:lvlJc w:val="left"/>
+      <w:pPr>
+        <w:ind w:left="6120" w:hanging="360"/>
+      </w:pPr>
+      <w:rPr>
+        <w:rFonts w:ascii="Symbol" w:hAnsi="Symbol" w:hint="default"/>
+      </w:rPr>
+    </w:lvl>
+    <w:lvl w:ilvl="7" w:tplc="04090003" w:tentative="1">
+      <w:start w:val="1"/>
+      <w:numFmt w:val="bullet"/>
+      <w:lvlText w:val="o"/>
+      <w:lvlJc w:val="left"/>
+      <w:pPr>
+        <w:ind w:left="6840" w:hanging="360"/>
+      </w:pPr>
+      <w:rPr>
+        <w:rFonts w:ascii="Courier New" w:hAnsi="Courier New" w:cs="Courier New" w:hint="default"/>
+      </w:rPr>
+    </w:lvl>
+    <w:lvl w:ilvl="8" w:tplc="04090005" w:tentative="1">
+      <w:start w:val="1"/>
+      <w:numFmt w:val="bullet"/>
+      <w:lvlText w:val=""/>
+      <w:lvlJc w:val="left"/>
+      <w:pPr>
+        <w:ind w:left="7560" w:hanging="360"/>
+      </w:pPr>
+      <w:rPr>
+        <w:rFonts w:ascii="Wingdings" w:hAnsi="Wingdings" w:hint="default"/>
+      </w:rPr>
+    </w:lvl>
+  </w:abstractNum>
+  <w:abstractNum w:abstractNumId="2" w15:restartNumberingAfterBreak="0">
     <w:nsid w:val="38D20937"/>
     <w:multiLevelType w:val="hybridMultilevel"/>
     <w:tmpl w:val="7B8E8A78"/>
@@ -1898,7 +2142,233 @@
       </w:rPr>
     </w:lvl>
   </w:abstractNum>
-  <w:abstractNum w:abstractNumId="2" w15:restartNumberingAfterBreak="0">
+  <w:abstractNum w:abstractNumId="3" w15:restartNumberingAfterBreak="0">
+    <w:nsid w:val="3BA26DB0"/>
+    <w:multiLevelType w:val="hybridMultilevel"/>
+    <w:tmpl w:val="A3A8DB0A"/>
+    <w:lvl w:ilvl="0" w:tplc="04090001">
+      <w:start w:val="1"/>
+      <w:numFmt w:val="bullet"/>
+      <w:lvlText w:val=""/>
+      <w:lvlJc w:val="left"/>
+      <w:pPr>
+        <w:ind w:left="1800" w:hanging="360"/>
+      </w:pPr>
+      <w:rPr>
+        <w:rFonts w:ascii="Symbol" w:hAnsi="Symbol" w:hint="default"/>
+      </w:rPr>
+    </w:lvl>
+    <w:lvl w:ilvl="1" w:tplc="04090003" w:tentative="1">
+      <w:start w:val="1"/>
+      <w:numFmt w:val="bullet"/>
+      <w:lvlText w:val="o"/>
+      <w:lvlJc w:val="left"/>
+      <w:pPr>
+        <w:ind w:left="2520" w:hanging="360"/>
+      </w:pPr>
+      <w:rPr>
+        <w:rFonts w:ascii="Courier New" w:hAnsi="Courier New" w:cs="Courier New" w:hint="default"/>
+      </w:rPr>
+    </w:lvl>
+    <w:lvl w:ilvl="2" w:tplc="04090005" w:tentative="1">
+      <w:start w:val="1"/>
+      <w:numFmt w:val="bullet"/>
+      <w:lvlText w:val=""/>
+      <w:lvlJc w:val="left"/>
+      <w:pPr>
+        <w:ind w:left="3240" w:hanging="360"/>
+      </w:pPr>
+      <w:rPr>
+        <w:rFonts w:ascii="Wingdings" w:hAnsi="Wingdings" w:hint="default"/>
+      </w:rPr>
+    </w:lvl>
+    <w:lvl w:ilvl="3" w:tplc="04090001" w:tentative="1">
+      <w:start w:val="1"/>
+      <w:numFmt w:val="bullet"/>
+      <w:lvlText w:val=""/>
+      <w:lvlJc w:val="left"/>
+      <w:pPr>
+        <w:ind w:left="3960" w:hanging="360"/>
+      </w:pPr>
+      <w:rPr>
+        <w:rFonts w:ascii="Symbol" w:hAnsi="Symbol" w:hint="default"/>
+      </w:rPr>
+    </w:lvl>
+    <w:lvl w:ilvl="4" w:tplc="04090003" w:tentative="1">
+      <w:start w:val="1"/>
+      <w:numFmt w:val="bullet"/>
+      <w:lvlText w:val="o"/>
+      <w:lvlJc w:val="left"/>
+      <w:pPr>
+        <w:ind w:left="4680" w:hanging="360"/>
+      </w:pPr>
+      <w:rPr>
+        <w:rFonts w:ascii="Courier New" w:hAnsi="Courier New" w:cs="Courier New" w:hint="default"/>
+      </w:rPr>
+    </w:lvl>
+    <w:lvl w:ilvl="5" w:tplc="04090005" w:tentative="1">
+      <w:start w:val="1"/>
+      <w:numFmt w:val="bullet"/>
+      <w:lvlText w:val=""/>
+      <w:lvlJc w:val="left"/>
+      <w:pPr>
+        <w:ind w:left="5400" w:hanging="360"/>
+      </w:pPr>
+      <w:rPr>
+        <w:rFonts w:ascii="Wingdings" w:hAnsi="Wingdings" w:hint="default"/>
+      </w:rPr>
+    </w:lvl>
+    <w:lvl w:ilvl="6" w:tplc="04090001" w:tentative="1">
+      <w:start w:val="1"/>
+      <w:numFmt w:val="bullet"/>
+      <w:lvlText w:val=""/>
+      <w:lvlJc w:val="left"/>
+      <w:pPr>
+        <w:ind w:left="6120" w:hanging="360"/>
+      </w:pPr>
+      <w:rPr>
+        <w:rFonts w:ascii="Symbol" w:hAnsi="Symbol" w:hint="default"/>
+      </w:rPr>
+    </w:lvl>
+    <w:lvl w:ilvl="7" w:tplc="04090003" w:tentative="1">
+      <w:start w:val="1"/>
+      <w:numFmt w:val="bullet"/>
+      <w:lvlText w:val="o"/>
+      <w:lvlJc w:val="left"/>
+      <w:pPr>
+        <w:ind w:left="6840" w:hanging="360"/>
+      </w:pPr>
+      <w:rPr>
+        <w:rFonts w:ascii="Courier New" w:hAnsi="Courier New" w:cs="Courier New" w:hint="default"/>
+      </w:rPr>
+    </w:lvl>
+    <w:lvl w:ilvl="8" w:tplc="04090005" w:tentative="1">
+      <w:start w:val="1"/>
+      <w:numFmt w:val="bullet"/>
+      <w:lvlText w:val=""/>
+      <w:lvlJc w:val="left"/>
+      <w:pPr>
+        <w:ind w:left="7560" w:hanging="360"/>
+      </w:pPr>
+      <w:rPr>
+        <w:rFonts w:ascii="Wingdings" w:hAnsi="Wingdings" w:hint="default"/>
+      </w:rPr>
+    </w:lvl>
+  </w:abstractNum>
+  <w:abstractNum w:abstractNumId="4" w15:restartNumberingAfterBreak="0">
+    <w:nsid w:val="3BE21D11"/>
+    <w:multiLevelType w:val="hybridMultilevel"/>
+    <w:tmpl w:val="EDDA8890"/>
+    <w:lvl w:ilvl="0" w:tplc="04090005">
+      <w:start w:val="1"/>
+      <w:numFmt w:val="bullet"/>
+      <w:lvlText w:val=""/>
+      <w:lvlJc w:val="left"/>
+      <w:pPr>
+        <w:ind w:left="1440" w:hanging="360"/>
+      </w:pPr>
+      <w:rPr>
+        <w:rFonts w:ascii="Wingdings" w:hAnsi="Wingdings" w:hint="default"/>
+      </w:rPr>
+    </w:lvl>
+    <w:lvl w:ilvl="1" w:tplc="FFFFFFFF">
+      <w:start w:val="1"/>
+      <w:numFmt w:val="bullet"/>
+      <w:lvlText w:val="o"/>
+      <w:lvlJc w:val="left"/>
+      <w:pPr>
+        <w:ind w:left="2160" w:hanging="360"/>
+      </w:pPr>
+      <w:rPr>
+        <w:rFonts w:ascii="Courier New" w:hAnsi="Courier New" w:cs="Courier New" w:hint="default"/>
+      </w:rPr>
+    </w:lvl>
+    <w:lvl w:ilvl="2" w:tplc="FFFFFFFF" w:tentative="1">
+      <w:start w:val="1"/>
+      <w:numFmt w:val="bullet"/>
+      <w:lvlText w:val=""/>
+      <w:lvlJc w:val="left"/>
+      <w:pPr>
+        <w:ind w:left="2880" w:hanging="360"/>
+      </w:pPr>
+      <w:rPr>
+        <w:rFonts w:ascii="Wingdings" w:hAnsi="Wingdings" w:hint="default"/>
+      </w:rPr>
+    </w:lvl>
+    <w:lvl w:ilvl="3" w:tplc="FFFFFFFF">
+      <w:start w:val="1"/>
+      <w:numFmt w:val="bullet"/>
+      <w:lvlText w:val=""/>
+      <w:lvlJc w:val="left"/>
+      <w:pPr>
+        <w:ind w:left="3600" w:hanging="360"/>
+      </w:pPr>
+      <w:rPr>
+        <w:rFonts w:ascii="Symbol" w:hAnsi="Symbol" w:hint="default"/>
+      </w:rPr>
+    </w:lvl>
+    <w:lvl w:ilvl="4" w:tplc="FFFFFFFF" w:tentative="1">
+      <w:start w:val="1"/>
+      <w:numFmt w:val="bullet"/>
+      <w:lvlText w:val="o"/>
+      <w:lvlJc w:val="left"/>
+      <w:pPr>
+        <w:ind w:left="4320" w:hanging="360"/>
+      </w:pPr>
+      <w:rPr>
+        <w:rFonts w:ascii="Courier New" w:hAnsi="Courier New" w:cs="Courier New" w:hint="default"/>
+      </w:rPr>
+    </w:lvl>
+    <w:lvl w:ilvl="5" w:tplc="FFFFFFFF" w:tentative="1">
+      <w:start w:val="1"/>
+      <w:numFmt w:val="bullet"/>
+      <w:lvlText w:val=""/>
+      <w:lvlJc w:val="left"/>
+      <w:pPr>
+        <w:ind w:left="5040" w:hanging="360"/>
+      </w:pPr>
+      <w:rPr>
+        <w:rFonts w:ascii="Wingdings" w:hAnsi="Wingdings" w:hint="default"/>
+      </w:rPr>
+    </w:lvl>
+    <w:lvl w:ilvl="6" w:tplc="FFFFFFFF" w:tentative="1">
+      <w:start w:val="1"/>
+      <w:numFmt w:val="bullet"/>
+      <w:lvlText w:val=""/>
+      <w:lvlJc w:val="left"/>
+      <w:pPr>
+        <w:ind w:left="5760" w:hanging="360"/>
+      </w:pPr>
+      <w:rPr>
+        <w:rFonts w:ascii="Symbol" w:hAnsi="Symbol" w:hint="default"/>
+      </w:rPr>
+    </w:lvl>
+    <w:lvl w:ilvl="7" w:tplc="FFFFFFFF" w:tentative="1">
+      <w:start w:val="1"/>
+      <w:numFmt w:val="bullet"/>
+      <w:lvlText w:val="o"/>
+      <w:lvlJc w:val="left"/>
+      <w:pPr>
+        <w:ind w:left="6480" w:hanging="360"/>
+      </w:pPr>
+      <w:rPr>
+        <w:rFonts w:ascii="Courier New" w:hAnsi="Courier New" w:cs="Courier New" w:hint="default"/>
+      </w:rPr>
+    </w:lvl>
+    <w:lvl w:ilvl="8" w:tplc="FFFFFFFF" w:tentative="1">
+      <w:start w:val="1"/>
+      <w:numFmt w:val="bullet"/>
+      <w:lvlText w:val=""/>
+      <w:lvlJc w:val="left"/>
+      <w:pPr>
+        <w:ind w:left="7200" w:hanging="360"/>
+      </w:pPr>
+      <w:rPr>
+        <w:rFonts w:ascii="Wingdings" w:hAnsi="Wingdings" w:hint="default"/>
+      </w:rPr>
+    </w:lvl>
+  </w:abstractNum>
+  <w:abstractNum w:abstractNumId="5" w15:restartNumberingAfterBreak="0">
     <w:nsid w:val="4AE869C1"/>
     <w:multiLevelType w:val="hybridMultilevel"/>
     <w:tmpl w:val="F934EF6C"/>
@@ -2011,7 +2481,7 @@
       </w:rPr>
     </w:lvl>
   </w:abstractNum>
-  <w:abstractNum w:abstractNumId="3" w15:restartNumberingAfterBreak="0">
+  <w:abstractNum w:abstractNumId="6" w15:restartNumberingAfterBreak="0">
     <w:nsid w:val="4B763A71"/>
     <w:multiLevelType w:val="hybridMultilevel"/>
     <w:tmpl w:val="116E2E88"/>
@@ -2125,16 +2595,25 @@
     </w:lvl>
   </w:abstractNum>
   <w:num w:numId="1" w16cid:durableId="828983495">
-    <w:abstractNumId w:val="1"/>
+    <w:abstractNumId w:val="2"/>
   </w:num>
   <w:num w:numId="2" w16cid:durableId="1430586510">
-    <w:abstractNumId w:val="2"/>
+    <w:abstractNumId w:val="5"/>
   </w:num>
   <w:num w:numId="3" w16cid:durableId="1255551966">
-    <w:abstractNumId w:val="3"/>
+    <w:abstractNumId w:val="6"/>
   </w:num>
   <w:num w:numId="4" w16cid:durableId="277488804">
     <w:abstractNumId w:val="0"/>
+  </w:num>
+  <w:num w:numId="5" w16cid:durableId="622157060">
+    <w:abstractNumId w:val="3"/>
+  </w:num>
+  <w:num w:numId="6" w16cid:durableId="1491410301">
+    <w:abstractNumId w:val="1"/>
+  </w:num>
+  <w:num w:numId="7" w16cid:durableId="1091124580">
+    <w:abstractNumId w:val="4"/>
   </w:num>
   <w:numIdMacAtCleanup w:val="4"/>
 </w:numbering>

</xml_diff>

<commit_message>
chore: update CV files
</commit_message>
<xml_diff>
--- a/Denisenko_Dmitry_CV.docx
+++ b/Denisenko_Dmitry_CV.docx
@@ -25,7 +25,14 @@
           <w:sz w:val="44"/>
           <w:szCs w:val="44"/>
         </w:rPr>
-        <w:t xml:space="preserve"> – Platform Engineer</w:t>
+        <w:t xml:space="preserve"> </w:t>
+      </w:r>
+      <w:r>
+        <w:rPr>
+          <w:sz w:val="36"/>
+          <w:szCs w:val="36"/>
+        </w:rPr>
+        <w:t>– Platform Engineer</w:t>
       </w:r>
     </w:p>
     <w:p>
@@ -162,16 +169,16 @@
         <w:rPr>
           <w:rFonts w:ascii="Calibri Light" w:hAnsi="Calibri Light" w:cs="Calibri Light"/>
           <w:color w:val="2E74B5"/>
-          <w:sz w:val="34"/>
-          <w:szCs w:val="34"/>
+          <w:sz w:val="36"/>
+          <w:szCs w:val="36"/>
         </w:rPr>
       </w:pPr>
       <w:r>
         <w:rPr>
           <w:rFonts w:ascii="Calibri Light" w:hAnsi="Calibri Light" w:cs="Calibri Light"/>
           <w:color w:val="2E74B5"/>
-          <w:sz w:val="34"/>
-          <w:szCs w:val="34"/>
+          <w:sz w:val="36"/>
+          <w:szCs w:val="36"/>
         </w:rPr>
         <w:t>Professional Summary</w:t>
       </w:r>
@@ -255,7 +262,7 @@
         <w:pStyle w:val="ListParagraph"/>
         <w:numPr>
           <w:ilvl w:val="0"/>
-          <w:numId w:val="6"/>
+          <w:numId w:val="11"/>
         </w:numPr>
         <w:rPr>
           <w:rFonts w:ascii="Calibri" w:hAnsi="Calibri" w:cs="Calibri"/>
@@ -311,7 +318,7 @@
         <w:pStyle w:val="ListParagraph"/>
         <w:numPr>
           <w:ilvl w:val="0"/>
-          <w:numId w:val="6"/>
+          <w:numId w:val="11"/>
         </w:numPr>
         <w:rPr>
           <w:rFonts w:ascii="Calibri" w:hAnsi="Calibri" w:cs="Calibri"/>
@@ -339,7 +346,7 @@
         <w:pStyle w:val="ListParagraph"/>
         <w:numPr>
           <w:ilvl w:val="0"/>
-          <w:numId w:val="6"/>
+          <w:numId w:val="11"/>
         </w:numPr>
         <w:rPr>
           <w:rFonts w:ascii="Calibri" w:hAnsi="Calibri" w:cs="Calibri"/>
@@ -367,7 +374,7 @@
         <w:pStyle w:val="ListParagraph"/>
         <w:numPr>
           <w:ilvl w:val="0"/>
-          <w:numId w:val="6"/>
+          <w:numId w:val="11"/>
         </w:numPr>
         <w:rPr>
           <w:rFonts w:ascii="Calibri" w:hAnsi="Calibri" w:cs="Calibri"/>
@@ -396,16 +403,12 @@
         <w:rPr>
           <w:rFonts w:ascii="Calibri Light" w:hAnsi="Calibri Light" w:cs="Calibri Light"/>
           <w:color w:val="2E74B5"/>
-          <w:sz w:val="34"/>
-          <w:szCs w:val="34"/>
         </w:rPr>
       </w:pPr>
       <w:r>
         <w:rPr>
           <w:rFonts w:ascii="Calibri Light" w:hAnsi="Calibri Light" w:cs="Calibri Light"/>
           <w:color w:val="2E74B5"/>
-          <w:sz w:val="34"/>
-          <w:szCs w:val="34"/>
         </w:rPr>
         <w:t>Technical Skills</w:t>
       </w:r>
@@ -668,16 +671,12 @@
         <w:rPr>
           <w:rFonts w:ascii="Calibri Light" w:hAnsi="Calibri Light" w:cs="Calibri Light"/>
           <w:color w:val="2E74B5"/>
-          <w:sz w:val="34"/>
-          <w:szCs w:val="34"/>
         </w:rPr>
       </w:pPr>
       <w:r>
         <w:rPr>
           <w:rFonts w:ascii="Calibri Light" w:hAnsi="Calibri Light" w:cs="Calibri Light"/>
           <w:color w:val="2E74B5"/>
-          <w:sz w:val="34"/>
-          <w:szCs w:val="34"/>
         </w:rPr>
         <w:t>Work Experience</w:t>
       </w:r>
@@ -687,7 +686,7 @@
         <w:pStyle w:val="ListParagraph"/>
         <w:numPr>
           <w:ilvl w:val="0"/>
-          <w:numId w:val="7"/>
+          <w:numId w:val="12"/>
         </w:numPr>
         <w:rPr>
           <w:rFonts w:ascii="Calibri" w:hAnsi="Calibri" w:cs="Calibri"/>
@@ -699,7 +698,22 @@
           <w:rFonts w:ascii="Calibri" w:hAnsi="Calibri" w:cs="Calibri"/>
           <w:color w:val="000000"/>
         </w:rPr>
-        <w:t xml:space="preserve">IQ Key Value Foundation – </w:t>
+        <w:t xml:space="preserve">IQ Key Value Foundation </w:t>
+      </w:r>
+      <w:r>
+        <w:rPr>
+          <w:rFonts w:ascii="Calibri" w:hAnsi="Calibri" w:cs="Calibri"/>
+          <w:color w:val="000000"/>
+          <w:lang w:val="uk-UA"/>
+        </w:rPr>
+        <w:t>-</w:t>
+      </w:r>
+      <w:r>
+        <w:rPr>
+          <w:rFonts w:ascii="Calibri" w:hAnsi="Calibri" w:cs="Calibri"/>
+          <w:color w:val="000000"/>
+        </w:rPr>
+        <w:t xml:space="preserve"> </w:t>
       </w:r>
       <w:r>
         <w:rPr>
@@ -749,7 +763,7 @@
         <w:pStyle w:val="ListParagraph"/>
         <w:numPr>
           <w:ilvl w:val="0"/>
-          <w:numId w:val="7"/>
+          <w:numId w:val="12"/>
         </w:numPr>
         <w:rPr>
           <w:rFonts w:ascii="Calibri" w:hAnsi="Calibri" w:cs="Calibri"/>
@@ -761,7 +775,22 @@
           <w:rFonts w:ascii="Calibri" w:hAnsi="Calibri" w:cs="Calibri"/>
           <w:color w:val="000000"/>
         </w:rPr>
-        <w:t>DataArt Solutions, Inc. – Senior Software Engineer (2021</w:t>
+        <w:t xml:space="preserve">DataArt Solutions, Inc. </w:t>
+      </w:r>
+      <w:r>
+        <w:rPr>
+          <w:rFonts w:ascii="Calibri" w:hAnsi="Calibri" w:cs="Calibri"/>
+          <w:color w:val="000000"/>
+          <w:lang w:val="uk-UA"/>
+        </w:rPr>
+        <w:t>-</w:t>
+      </w:r>
+      <w:r>
+        <w:rPr>
+          <w:rFonts w:ascii="Calibri" w:hAnsi="Calibri" w:cs="Calibri"/>
+          <w:color w:val="000000"/>
+        </w:rPr>
+        <w:t xml:space="preserve"> Senior Software Engineer (2021</w:t>
       </w:r>
       <w:r>
         <w:rPr>
@@ -783,7 +812,7 @@
         <w:pStyle w:val="ListParagraph"/>
         <w:numPr>
           <w:ilvl w:val="0"/>
-          <w:numId w:val="7"/>
+          <w:numId w:val="12"/>
         </w:numPr>
         <w:rPr>
           <w:rFonts w:ascii="Calibri" w:hAnsi="Calibri" w:cs="Calibri"/>
@@ -795,7 +824,22 @@
           <w:rFonts w:ascii="Calibri" w:hAnsi="Calibri" w:cs="Calibri"/>
           <w:color w:val="000000"/>
         </w:rPr>
-        <w:t>Amadeus IT Group SA – Software Engineer (2016</w:t>
+        <w:t xml:space="preserve">Amadeus IT Group SA </w:t>
+      </w:r>
+      <w:r>
+        <w:rPr>
+          <w:rFonts w:ascii="Calibri" w:hAnsi="Calibri" w:cs="Calibri"/>
+          <w:color w:val="000000"/>
+          <w:lang w:val="uk-UA"/>
+        </w:rPr>
+        <w:t>-</w:t>
+      </w:r>
+      <w:r>
+        <w:rPr>
+          <w:rFonts w:ascii="Calibri" w:hAnsi="Calibri" w:cs="Calibri"/>
+          <w:color w:val="000000"/>
+        </w:rPr>
+        <w:t xml:space="preserve"> Software Engineer (2016</w:t>
       </w:r>
       <w:r>
         <w:rPr>
@@ -817,7 +861,7 @@
         <w:pStyle w:val="ListParagraph"/>
         <w:numPr>
           <w:ilvl w:val="0"/>
-          <w:numId w:val="7"/>
+          <w:numId w:val="12"/>
         </w:numPr>
         <w:rPr>
           <w:rFonts w:ascii="Calibri" w:hAnsi="Calibri" w:cs="Calibri"/>
@@ -838,7 +882,22 @@
           <w:rFonts w:ascii="Calibri" w:hAnsi="Calibri" w:cs="Calibri"/>
           <w:color w:val="000000"/>
         </w:rPr>
-        <w:t xml:space="preserve"> – Tech Lead/</w:t>
+        <w:t xml:space="preserve"> </w:t>
+      </w:r>
+      <w:r>
+        <w:rPr>
+          <w:rFonts w:ascii="Calibri" w:hAnsi="Calibri" w:cs="Calibri"/>
+          <w:color w:val="000000"/>
+          <w:lang w:val="uk-UA"/>
+        </w:rPr>
+        <w:t>-</w:t>
+      </w:r>
+      <w:r>
+        <w:rPr>
+          <w:rFonts w:ascii="Calibri" w:hAnsi="Calibri" w:cs="Calibri"/>
+          <w:color w:val="000000"/>
+        </w:rPr>
+        <w:t xml:space="preserve"> Tech Lead/</w:t>
       </w:r>
       <w:r>
         <w:rPr>
@@ -874,7 +933,7 @@
         <w:pStyle w:val="ListParagraph"/>
         <w:numPr>
           <w:ilvl w:val="0"/>
-          <w:numId w:val="7"/>
+          <w:numId w:val="12"/>
         </w:numPr>
         <w:rPr>
           <w:rFonts w:ascii="Calibri" w:hAnsi="Calibri" w:cs="Calibri"/>
@@ -886,12 +945,13 @@
           <w:rFonts w:ascii="Calibri" w:hAnsi="Calibri" w:cs="Calibri"/>
           <w:color w:val="000000"/>
         </w:rPr>
-        <w:t>Magento – Software Developer (2009</w:t>
-      </w:r>
-      <w:r>
-        <w:rPr>
-          <w:rFonts w:ascii="Calibri" w:hAnsi="Calibri" w:cs="Calibri"/>
-          <w:color w:val="000000"/>
+        <w:t xml:space="preserve">Magento </w:t>
+      </w:r>
+      <w:r>
+        <w:rPr>
+          <w:rFonts w:ascii="Calibri" w:hAnsi="Calibri" w:cs="Calibri"/>
+          <w:color w:val="000000"/>
+          <w:lang w:val="uk-UA"/>
         </w:rPr>
         <w:t>-</w:t>
       </w:r>
@@ -900,23 +960,26 @@
           <w:rFonts w:ascii="Calibri" w:hAnsi="Calibri" w:cs="Calibri"/>
           <w:color w:val="000000"/>
         </w:rPr>
+        <w:t xml:space="preserve"> Software Developer (2009</w:t>
+      </w:r>
+      <w:r>
+        <w:rPr>
+          <w:rFonts w:ascii="Calibri" w:hAnsi="Calibri" w:cs="Calibri"/>
+          <w:color w:val="000000"/>
+        </w:rPr>
+        <w:t>-</w:t>
+      </w:r>
+      <w:r>
+        <w:rPr>
+          <w:rFonts w:ascii="Calibri" w:hAnsi="Calibri" w:cs="Calibri"/>
+          <w:color w:val="000000"/>
+        </w:rPr>
         <w:t>2011)</w:t>
       </w:r>
     </w:p>
     <w:p>
       <w:pPr>
         <w:pStyle w:val="Heading1"/>
-      </w:pPr>
-      <w:r>
-        <w:t>Recent Notable</w:t>
-      </w:r>
-      <w:r>
-        <w:t xml:space="preserve"> Projects</w:t>
-      </w:r>
-    </w:p>
-    <w:p>
-      <w:pPr>
-        <w:pStyle w:val="Heading2"/>
         <w:rPr>
           <w:rFonts w:ascii="Calibri Light" w:hAnsi="Calibri Light" w:cs="Calibri Light"/>
           <w:color w:val="1F4D78"/>
@@ -924,8 +987,30 @@
       </w:pPr>
       <w:r>
         <w:rPr>
+          <w:sz w:val="36"/>
+          <w:szCs w:val="36"/>
+        </w:rPr>
+        <w:t xml:space="preserve">Recent </w:t>
+      </w:r>
+      <w:r>
+        <w:rPr>
+          <w:sz w:val="36"/>
+          <w:szCs w:val="36"/>
+        </w:rPr>
+        <w:t>Projects</w:t>
+      </w:r>
+      <w:r>
+        <w:rPr>
+          <w:lang w:val="uk-UA"/>
+        </w:rPr>
+        <w:br/>
+      </w:r>
+      <w:r>
+        <w:rPr>
           <w:rFonts w:ascii="Calibri Light" w:hAnsi="Calibri Light" w:cs="Calibri Light"/>
           <w:color w:val="1F4D78"/>
+          <w:sz w:val="28"/>
+          <w:szCs w:val="28"/>
         </w:rPr>
         <w:t>Founder &amp; Lead at IQ Key Value Platform</w:t>
       </w:r>
@@ -935,6 +1020,7 @@
         <w:rPr>
           <w:rFonts w:ascii="Calibri" w:hAnsi="Calibri" w:cs="Calibri"/>
           <w:color w:val="000000"/>
+          <w:lang w:val="uk-UA"/>
         </w:rPr>
       </w:pPr>
       <w:r>
@@ -967,20 +1053,22 @@
         <w:rPr>
           <w:rFonts w:ascii="Calibri Light" w:hAnsi="Calibri Light" w:cs="Calibri Light"/>
           <w:color w:val="2E74B5"/>
+          <w:sz w:val="28"/>
+          <w:szCs w:val="28"/>
         </w:rPr>
       </w:pPr>
       <w:r>
         <w:rPr>
           <w:rFonts w:ascii="Calibri Light" w:hAnsi="Calibri Light" w:cs="Calibri Light"/>
           <w:color w:val="2E74B5"/>
+          <w:sz w:val="28"/>
+          <w:szCs w:val="28"/>
         </w:rPr>
         <w:t>Complex ETL Engine on Top of Kafka Streams</w:t>
       </w:r>
     </w:p>
     <w:p>
       <w:pPr>
-        <w:pStyle w:val="ListParagraph"/>
-        <w:ind w:left="660"/>
         <w:rPr>
           <w:rFonts w:ascii="Calibri" w:hAnsi="Calibri" w:cs="Calibri"/>
           <w:color w:val="000000"/>
@@ -993,16 +1081,14 @@
         </w:rPr>
         <w:t>Client: Major European asset manager</w:t>
       </w:r>
-    </w:p>
-    <w:p>
-      <w:pPr>
-        <w:pStyle w:val="ListParagraph"/>
-        <w:ind w:left="660"/>
-        <w:rPr>
-          <w:rFonts w:ascii="Calibri" w:hAnsi="Calibri" w:cs="Calibri"/>
-          <w:color w:val="000000"/>
-        </w:rPr>
-      </w:pPr>
+      <w:r>
+        <w:rPr>
+          <w:rFonts w:ascii="Calibri" w:hAnsi="Calibri" w:cs="Calibri"/>
+          <w:color w:val="000000"/>
+          <w:lang w:val="uk-UA"/>
+        </w:rPr>
+        <w:br/>
+      </w:r>
       <w:r>
         <w:rPr>
           <w:rFonts w:ascii="Calibri" w:hAnsi="Calibri" w:cs="Calibri"/>
@@ -1015,8 +1101,8 @@
       <w:pPr>
         <w:pStyle w:val="ListParagraph"/>
         <w:numPr>
-          <w:ilvl w:val="0"/>
-          <w:numId w:val="1"/>
+          <w:ilvl w:val="1"/>
+          <w:numId w:val="10"/>
         </w:numPr>
         <w:rPr>
           <w:rFonts w:ascii="Calibri" w:hAnsi="Calibri" w:cs="Calibri"/>
@@ -1035,8 +1121,8 @@
       <w:pPr>
         <w:pStyle w:val="ListParagraph"/>
         <w:numPr>
-          <w:ilvl w:val="0"/>
-          <w:numId w:val="1"/>
+          <w:ilvl w:val="1"/>
+          <w:numId w:val="10"/>
         </w:numPr>
         <w:rPr>
           <w:rFonts w:ascii="Calibri" w:hAnsi="Calibri" w:cs="Calibri"/>
@@ -1055,8 +1141,8 @@
       <w:pPr>
         <w:pStyle w:val="ListParagraph"/>
         <w:numPr>
-          <w:ilvl w:val="0"/>
-          <w:numId w:val="1"/>
+          <w:ilvl w:val="1"/>
+          <w:numId w:val="10"/>
         </w:numPr>
         <w:rPr>
           <w:rFonts w:ascii="Calibri" w:hAnsi="Calibri" w:cs="Calibri"/>
@@ -1076,8 +1162,8 @@
       <w:pPr>
         <w:pStyle w:val="ListParagraph"/>
         <w:numPr>
-          <w:ilvl w:val="0"/>
-          <w:numId w:val="1"/>
+          <w:ilvl w:val="1"/>
+          <w:numId w:val="10"/>
         </w:numPr>
         <w:rPr>
           <w:rFonts w:ascii="Calibri" w:hAnsi="Calibri" w:cs="Calibri"/>
@@ -1096,8 +1182,8 @@
       <w:pPr>
         <w:pStyle w:val="ListParagraph"/>
         <w:numPr>
-          <w:ilvl w:val="0"/>
-          <w:numId w:val="1"/>
+          <w:ilvl w:val="1"/>
+          <w:numId w:val="10"/>
         </w:numPr>
         <w:rPr>
           <w:rFonts w:ascii="Calibri" w:hAnsi="Calibri" w:cs="Calibri"/>
@@ -1132,8 +1218,8 @@
       <w:pPr>
         <w:pStyle w:val="ListParagraph"/>
         <w:numPr>
-          <w:ilvl w:val="0"/>
-          <w:numId w:val="1"/>
+          <w:ilvl w:val="1"/>
+          <w:numId w:val="10"/>
         </w:numPr>
         <w:rPr>
           <w:rFonts w:ascii="Calibri" w:hAnsi="Calibri" w:cs="Calibri"/>
@@ -1154,20 +1240,22 @@
         <w:rPr>
           <w:rFonts w:ascii="Calibri Light" w:hAnsi="Calibri Light" w:cs="Calibri Light"/>
           <w:color w:val="2E74B5"/>
+          <w:sz w:val="28"/>
+          <w:szCs w:val="28"/>
         </w:rPr>
       </w:pPr>
       <w:r>
         <w:rPr>
           <w:rFonts w:ascii="Calibri Light" w:hAnsi="Calibri Light" w:cs="Calibri Light"/>
           <w:color w:val="2E74B5"/>
+          <w:sz w:val="28"/>
+          <w:szCs w:val="28"/>
         </w:rPr>
         <w:t>Product Information Management Solution</w:t>
       </w:r>
     </w:p>
     <w:p>
       <w:pPr>
-        <w:pStyle w:val="ListParagraph"/>
-        <w:ind w:left="660"/>
         <w:rPr>
           <w:rFonts w:ascii="Calibri" w:hAnsi="Calibri" w:cs="Calibri"/>
           <w:color w:val="000000"/>
@@ -1315,6 +1403,7 @@
         <w:rPr>
           <w:rFonts w:ascii="Calibri Light" w:hAnsi="Calibri Light" w:cs="Calibri Light"/>
           <w:color w:val="2E74B5"/>
+          <w:lang w:val="uk-UA"/>
         </w:rPr>
       </w:pPr>
       <w:r>
@@ -1323,6 +1412,14 @@
           <w:color w:val="000000"/>
         </w:rPr>
         <w:t>Designed and tested Java microservices, gathered requirements, and supported development, testing, code reviews, and releases to align with business goals.</w:t>
+      </w:r>
+      <w:r>
+        <w:rPr>
+          <w:rFonts w:ascii="Calibri" w:hAnsi="Calibri" w:cs="Calibri"/>
+          <w:color w:val="000000"/>
+          <w:lang w:val="uk-UA"/>
+        </w:rPr>
+        <w:br/>
       </w:r>
     </w:p>
     <w:p>
@@ -1331,20 +1428,22 @@
         <w:rPr>
           <w:rFonts w:ascii="Calibri Light" w:hAnsi="Calibri Light" w:cs="Calibri Light"/>
           <w:color w:val="2E74B5"/>
+          <w:sz w:val="28"/>
+          <w:szCs w:val="28"/>
         </w:rPr>
       </w:pPr>
       <w:r>
         <w:rPr>
           <w:rFonts w:ascii="Calibri Light" w:hAnsi="Calibri Light" w:cs="Calibri Light"/>
           <w:color w:val="2E74B5"/>
+          <w:sz w:val="28"/>
+          <w:szCs w:val="28"/>
         </w:rPr>
         <w:t>ETL Engine for Processing Hotel Content</w:t>
       </w:r>
     </w:p>
     <w:p>
       <w:pPr>
-        <w:pStyle w:val="ListParagraph"/>
-        <w:ind w:left="660"/>
         <w:rPr>
           <w:rFonts w:ascii="Calibri" w:hAnsi="Calibri" w:cs="Calibri"/>
           <w:color w:val="000000"/>
@@ -1394,8 +1493,8 @@
       <w:pPr>
         <w:pStyle w:val="ListParagraph"/>
         <w:numPr>
-          <w:ilvl w:val="0"/>
-          <w:numId w:val="2"/>
+          <w:ilvl w:val="1"/>
+          <w:numId w:val="9"/>
         </w:numPr>
         <w:rPr>
           <w:rFonts w:ascii="Calibri" w:hAnsi="Calibri" w:cs="Calibri"/>
@@ -1414,8 +1513,8 @@
       <w:pPr>
         <w:pStyle w:val="ListParagraph"/>
         <w:numPr>
-          <w:ilvl w:val="0"/>
-          <w:numId w:val="2"/>
+          <w:ilvl w:val="1"/>
+          <w:numId w:val="9"/>
         </w:numPr>
         <w:rPr>
           <w:rFonts w:ascii="Calibri" w:hAnsi="Calibri" w:cs="Calibri"/>
@@ -1434,8 +1533,8 @@
       <w:pPr>
         <w:pStyle w:val="ListParagraph"/>
         <w:numPr>
-          <w:ilvl w:val="0"/>
-          <w:numId w:val="2"/>
+          <w:ilvl w:val="1"/>
+          <w:numId w:val="9"/>
         </w:numPr>
         <w:rPr>
           <w:rFonts w:ascii="Calibri" w:hAnsi="Calibri" w:cs="Calibri"/>
@@ -1454,8 +1553,8 @@
       <w:pPr>
         <w:pStyle w:val="ListParagraph"/>
         <w:numPr>
-          <w:ilvl w:val="0"/>
-          <w:numId w:val="2"/>
+          <w:ilvl w:val="1"/>
+          <w:numId w:val="9"/>
         </w:numPr>
         <w:rPr>
           <w:rFonts w:ascii="Calibri" w:hAnsi="Calibri" w:cs="Calibri"/>
@@ -1474,8 +1573,8 @@
       <w:pPr>
         <w:pStyle w:val="ListParagraph"/>
         <w:numPr>
-          <w:ilvl w:val="0"/>
-          <w:numId w:val="2"/>
+          <w:ilvl w:val="1"/>
+          <w:numId w:val="9"/>
         </w:numPr>
         <w:rPr>
           <w:rFonts w:ascii="Calibri" w:hAnsi="Calibri" w:cs="Calibri"/>
@@ -1503,8 +1602,8 @@
       <w:pPr>
         <w:pStyle w:val="ListParagraph"/>
         <w:numPr>
-          <w:ilvl w:val="0"/>
-          <w:numId w:val="2"/>
+          <w:ilvl w:val="1"/>
+          <w:numId w:val="9"/>
         </w:numPr>
         <w:rPr>
           <w:rFonts w:ascii="Calibri" w:hAnsi="Calibri" w:cs="Calibri"/>
@@ -1523,8 +1622,8 @@
       <w:pPr>
         <w:pStyle w:val="ListParagraph"/>
         <w:numPr>
-          <w:ilvl w:val="0"/>
-          <w:numId w:val="2"/>
+          <w:ilvl w:val="1"/>
+          <w:numId w:val="9"/>
         </w:numPr>
         <w:rPr>
           <w:rFonts w:ascii="Calibri" w:hAnsi="Calibri" w:cs="Calibri"/>
@@ -1537,6 +1636,14 @@
           <w:color w:val="000000"/>
         </w:rPr>
         <w:t>Monitored processes using Prometheus, Grafana, ELK Stack, and OpenShift dashboards</w:t>
+      </w:r>
+      <w:r>
+        <w:rPr>
+          <w:rFonts w:ascii="Calibri" w:hAnsi="Calibri" w:cs="Calibri"/>
+          <w:color w:val="000000"/>
+          <w:lang w:val="uk-UA"/>
+        </w:rPr>
+        <w:br/>
       </w:r>
     </w:p>
     <w:p>
@@ -1545,28 +1652,22 @@
         <w:rPr>
           <w:rFonts w:ascii="Calibri Light" w:hAnsi="Calibri Light" w:cs="Calibri Light"/>
           <w:color w:val="2E74B5"/>
-        </w:rPr>
-      </w:pPr>
-    </w:p>
-    <w:p>
-      <w:pPr>
-        <w:pStyle w:val="Heading2"/>
+          <w:sz w:val="28"/>
+          <w:szCs w:val="28"/>
+        </w:rPr>
+      </w:pPr>
+      <w:r>
         <w:rPr>
           <w:rFonts w:ascii="Calibri Light" w:hAnsi="Calibri Light" w:cs="Calibri Light"/>
           <w:color w:val="2E74B5"/>
-        </w:rPr>
-      </w:pPr>
-      <w:r>
-        <w:rPr>
-          <w:rFonts w:ascii="Calibri Light" w:hAnsi="Calibri Light" w:cs="Calibri Light"/>
-          <w:color w:val="2E74B5"/>
+          <w:sz w:val="28"/>
+          <w:szCs w:val="28"/>
         </w:rPr>
         <w:t>B2B Hotel Booking Platform</w:t>
       </w:r>
     </w:p>
     <w:p>
       <w:pPr>
-        <w:ind w:left="720"/>
         <w:rPr>
           <w:rFonts w:ascii="Calibri" w:hAnsi="Calibri" w:cs="Calibri"/>
           <w:color w:val="000000"/>
@@ -1665,8 +1766,8 @@
       <w:pPr>
         <w:pStyle w:val="ListParagraph"/>
         <w:numPr>
-          <w:ilvl w:val="0"/>
-          <w:numId w:val="3"/>
+          <w:ilvl w:val="1"/>
+          <w:numId w:val="8"/>
         </w:numPr>
         <w:rPr>
           <w:rFonts w:ascii="Calibri" w:hAnsi="Calibri" w:cs="Calibri"/>
@@ -1685,8 +1786,8 @@
       <w:pPr>
         <w:pStyle w:val="ListParagraph"/>
         <w:numPr>
-          <w:ilvl w:val="0"/>
-          <w:numId w:val="3"/>
+          <w:ilvl w:val="1"/>
+          <w:numId w:val="8"/>
         </w:numPr>
         <w:rPr>
           <w:rFonts w:ascii="Calibri" w:hAnsi="Calibri" w:cs="Calibri"/>
@@ -1705,8 +1806,8 @@
       <w:pPr>
         <w:pStyle w:val="ListParagraph"/>
         <w:numPr>
-          <w:ilvl w:val="0"/>
-          <w:numId w:val="3"/>
+          <w:ilvl w:val="1"/>
+          <w:numId w:val="8"/>
         </w:numPr>
         <w:rPr>
           <w:rFonts w:ascii="Calibri" w:hAnsi="Calibri" w:cs="Calibri"/>
@@ -1725,8 +1826,8 @@
       <w:pPr>
         <w:pStyle w:val="ListParagraph"/>
         <w:numPr>
-          <w:ilvl w:val="0"/>
-          <w:numId w:val="3"/>
+          <w:ilvl w:val="1"/>
+          <w:numId w:val="8"/>
         </w:numPr>
         <w:rPr>
           <w:rFonts w:ascii="Calibri" w:hAnsi="Calibri" w:cs="Calibri"/>
@@ -1754,8 +1855,8 @@
       <w:pPr>
         <w:pStyle w:val="ListParagraph"/>
         <w:numPr>
-          <w:ilvl w:val="0"/>
-          <w:numId w:val="3"/>
+          <w:ilvl w:val="1"/>
+          <w:numId w:val="8"/>
         </w:numPr>
         <w:rPr>
           <w:rFonts w:ascii="Calibri" w:hAnsi="Calibri" w:cs="Calibri"/>
@@ -1774,8 +1875,8 @@
       <w:pPr>
         <w:pStyle w:val="ListParagraph"/>
         <w:numPr>
-          <w:ilvl w:val="0"/>
-          <w:numId w:val="3"/>
+          <w:ilvl w:val="1"/>
+          <w:numId w:val="8"/>
         </w:numPr>
         <w:rPr>
           <w:rFonts w:ascii="Calibri" w:hAnsi="Calibri" w:cs="Calibri"/>
@@ -2030,6 +2131,345 @@
     </w:lvl>
   </w:abstractNum>
   <w:abstractNum w:abstractNumId="2" w15:restartNumberingAfterBreak="0">
+    <w:nsid w:val="172112D2"/>
+    <w:multiLevelType w:val="multilevel"/>
+    <w:tmpl w:val="04090021"/>
+    <w:lvl w:ilvl="0">
+      <w:start w:val="1"/>
+      <w:numFmt w:val="bullet"/>
+      <w:lvlText w:val=""/>
+      <w:lvlJc w:val="left"/>
+      <w:pPr>
+        <w:ind w:left="360" w:hanging="360"/>
+      </w:pPr>
+      <w:rPr>
+        <w:rFonts w:ascii="Wingdings" w:hAnsi="Wingdings" w:hint="default"/>
+      </w:rPr>
+    </w:lvl>
+    <w:lvl w:ilvl="1">
+      <w:start w:val="1"/>
+      <w:numFmt w:val="bullet"/>
+      <w:lvlText w:val=""/>
+      <w:lvlJc w:val="left"/>
+      <w:pPr>
+        <w:ind w:left="720" w:hanging="360"/>
+      </w:pPr>
+      <w:rPr>
+        <w:rFonts w:ascii="Wingdings" w:hAnsi="Wingdings" w:hint="default"/>
+      </w:rPr>
+    </w:lvl>
+    <w:lvl w:ilvl="2">
+      <w:start w:val="1"/>
+      <w:numFmt w:val="bullet"/>
+      <w:lvlText w:val=""/>
+      <w:lvlJc w:val="left"/>
+      <w:pPr>
+        <w:ind w:left="1080" w:hanging="360"/>
+      </w:pPr>
+      <w:rPr>
+        <w:rFonts w:ascii="Wingdings" w:hAnsi="Wingdings" w:hint="default"/>
+      </w:rPr>
+    </w:lvl>
+    <w:lvl w:ilvl="3">
+      <w:start w:val="1"/>
+      <w:numFmt w:val="bullet"/>
+      <w:lvlText w:val=""/>
+      <w:lvlJc w:val="left"/>
+      <w:pPr>
+        <w:ind w:left="1440" w:hanging="360"/>
+      </w:pPr>
+      <w:rPr>
+        <w:rFonts w:ascii="Symbol" w:hAnsi="Symbol" w:hint="default"/>
+      </w:rPr>
+    </w:lvl>
+    <w:lvl w:ilvl="4">
+      <w:start w:val="1"/>
+      <w:numFmt w:val="bullet"/>
+      <w:lvlText w:val=""/>
+      <w:lvlJc w:val="left"/>
+      <w:pPr>
+        <w:ind w:left="1800" w:hanging="360"/>
+      </w:pPr>
+      <w:rPr>
+        <w:rFonts w:ascii="Symbol" w:hAnsi="Symbol" w:hint="default"/>
+      </w:rPr>
+    </w:lvl>
+    <w:lvl w:ilvl="5">
+      <w:start w:val="1"/>
+      <w:numFmt w:val="bullet"/>
+      <w:lvlText w:val=""/>
+      <w:lvlJc w:val="left"/>
+      <w:pPr>
+        <w:ind w:left="2160" w:hanging="360"/>
+      </w:pPr>
+      <w:rPr>
+        <w:rFonts w:ascii="Wingdings" w:hAnsi="Wingdings" w:hint="default"/>
+      </w:rPr>
+    </w:lvl>
+    <w:lvl w:ilvl="6">
+      <w:start w:val="1"/>
+      <w:numFmt w:val="bullet"/>
+      <w:lvlText w:val=""/>
+      <w:lvlJc w:val="left"/>
+      <w:pPr>
+        <w:ind w:left="2520" w:hanging="360"/>
+      </w:pPr>
+      <w:rPr>
+        <w:rFonts w:ascii="Wingdings" w:hAnsi="Wingdings" w:hint="default"/>
+      </w:rPr>
+    </w:lvl>
+    <w:lvl w:ilvl="7">
+      <w:start w:val="1"/>
+      <w:numFmt w:val="bullet"/>
+      <w:lvlText w:val=""/>
+      <w:lvlJc w:val="left"/>
+      <w:pPr>
+        <w:ind w:left="2880" w:hanging="360"/>
+      </w:pPr>
+      <w:rPr>
+        <w:rFonts w:ascii="Symbol" w:hAnsi="Symbol" w:hint="default"/>
+      </w:rPr>
+    </w:lvl>
+    <w:lvl w:ilvl="8">
+      <w:start w:val="1"/>
+      <w:numFmt w:val="bullet"/>
+      <w:lvlText w:val=""/>
+      <w:lvlJc w:val="left"/>
+      <w:pPr>
+        <w:ind w:left="3240" w:hanging="360"/>
+      </w:pPr>
+      <w:rPr>
+        <w:rFonts w:ascii="Symbol" w:hAnsi="Symbol" w:hint="default"/>
+      </w:rPr>
+    </w:lvl>
+  </w:abstractNum>
+  <w:abstractNum w:abstractNumId="3" w15:restartNumberingAfterBreak="0">
+    <w:nsid w:val="30A86104"/>
+    <w:multiLevelType w:val="multilevel"/>
+    <w:tmpl w:val="04090021"/>
+    <w:lvl w:ilvl="0">
+      <w:start w:val="1"/>
+      <w:numFmt w:val="bullet"/>
+      <w:lvlText w:val=""/>
+      <w:lvlJc w:val="left"/>
+      <w:pPr>
+        <w:ind w:left="360" w:hanging="360"/>
+      </w:pPr>
+      <w:rPr>
+        <w:rFonts w:ascii="Wingdings" w:hAnsi="Wingdings" w:hint="default"/>
+      </w:rPr>
+    </w:lvl>
+    <w:lvl w:ilvl="1">
+      <w:start w:val="1"/>
+      <w:numFmt w:val="bullet"/>
+      <w:lvlText w:val=""/>
+      <w:lvlJc w:val="left"/>
+      <w:pPr>
+        <w:ind w:left="720" w:hanging="360"/>
+      </w:pPr>
+      <w:rPr>
+        <w:rFonts w:ascii="Wingdings" w:hAnsi="Wingdings" w:hint="default"/>
+      </w:rPr>
+    </w:lvl>
+    <w:lvl w:ilvl="2">
+      <w:start w:val="1"/>
+      <w:numFmt w:val="bullet"/>
+      <w:lvlText w:val=""/>
+      <w:lvlJc w:val="left"/>
+      <w:pPr>
+        <w:ind w:left="1080" w:hanging="360"/>
+      </w:pPr>
+      <w:rPr>
+        <w:rFonts w:ascii="Wingdings" w:hAnsi="Wingdings" w:hint="default"/>
+      </w:rPr>
+    </w:lvl>
+    <w:lvl w:ilvl="3">
+      <w:start w:val="1"/>
+      <w:numFmt w:val="bullet"/>
+      <w:lvlText w:val=""/>
+      <w:lvlJc w:val="left"/>
+      <w:pPr>
+        <w:ind w:left="1440" w:hanging="360"/>
+      </w:pPr>
+      <w:rPr>
+        <w:rFonts w:ascii="Symbol" w:hAnsi="Symbol" w:hint="default"/>
+      </w:rPr>
+    </w:lvl>
+    <w:lvl w:ilvl="4">
+      <w:start w:val="1"/>
+      <w:numFmt w:val="bullet"/>
+      <w:lvlText w:val=""/>
+      <w:lvlJc w:val="left"/>
+      <w:pPr>
+        <w:ind w:left="1800" w:hanging="360"/>
+      </w:pPr>
+      <w:rPr>
+        <w:rFonts w:ascii="Symbol" w:hAnsi="Symbol" w:hint="default"/>
+      </w:rPr>
+    </w:lvl>
+    <w:lvl w:ilvl="5">
+      <w:start w:val="1"/>
+      <w:numFmt w:val="bullet"/>
+      <w:lvlText w:val=""/>
+      <w:lvlJc w:val="left"/>
+      <w:pPr>
+        <w:ind w:left="2160" w:hanging="360"/>
+      </w:pPr>
+      <w:rPr>
+        <w:rFonts w:ascii="Wingdings" w:hAnsi="Wingdings" w:hint="default"/>
+      </w:rPr>
+    </w:lvl>
+    <w:lvl w:ilvl="6">
+      <w:start w:val="1"/>
+      <w:numFmt w:val="bullet"/>
+      <w:lvlText w:val=""/>
+      <w:lvlJc w:val="left"/>
+      <w:pPr>
+        <w:ind w:left="2520" w:hanging="360"/>
+      </w:pPr>
+      <w:rPr>
+        <w:rFonts w:ascii="Wingdings" w:hAnsi="Wingdings" w:hint="default"/>
+      </w:rPr>
+    </w:lvl>
+    <w:lvl w:ilvl="7">
+      <w:start w:val="1"/>
+      <w:numFmt w:val="bullet"/>
+      <w:lvlText w:val=""/>
+      <w:lvlJc w:val="left"/>
+      <w:pPr>
+        <w:ind w:left="2880" w:hanging="360"/>
+      </w:pPr>
+      <w:rPr>
+        <w:rFonts w:ascii="Symbol" w:hAnsi="Symbol" w:hint="default"/>
+      </w:rPr>
+    </w:lvl>
+    <w:lvl w:ilvl="8">
+      <w:start w:val="1"/>
+      <w:numFmt w:val="bullet"/>
+      <w:lvlText w:val=""/>
+      <w:lvlJc w:val="left"/>
+      <w:pPr>
+        <w:ind w:left="3240" w:hanging="360"/>
+      </w:pPr>
+      <w:rPr>
+        <w:rFonts w:ascii="Symbol" w:hAnsi="Symbol" w:hint="default"/>
+      </w:rPr>
+    </w:lvl>
+  </w:abstractNum>
+  <w:abstractNum w:abstractNumId="4" w15:restartNumberingAfterBreak="0">
+    <w:nsid w:val="329D74BD"/>
+    <w:multiLevelType w:val="multilevel"/>
+    <w:tmpl w:val="04090021"/>
+    <w:lvl w:ilvl="0">
+      <w:start w:val="1"/>
+      <w:numFmt w:val="bullet"/>
+      <w:lvlText w:val=""/>
+      <w:lvlJc w:val="left"/>
+      <w:pPr>
+        <w:ind w:left="360" w:hanging="360"/>
+      </w:pPr>
+      <w:rPr>
+        <w:rFonts w:ascii="Wingdings" w:hAnsi="Wingdings" w:hint="default"/>
+      </w:rPr>
+    </w:lvl>
+    <w:lvl w:ilvl="1">
+      <w:start w:val="1"/>
+      <w:numFmt w:val="bullet"/>
+      <w:lvlText w:val=""/>
+      <w:lvlJc w:val="left"/>
+      <w:pPr>
+        <w:ind w:left="720" w:hanging="360"/>
+      </w:pPr>
+      <w:rPr>
+        <w:rFonts w:ascii="Wingdings" w:hAnsi="Wingdings" w:hint="default"/>
+      </w:rPr>
+    </w:lvl>
+    <w:lvl w:ilvl="2">
+      <w:start w:val="1"/>
+      <w:numFmt w:val="bullet"/>
+      <w:lvlText w:val=""/>
+      <w:lvlJc w:val="left"/>
+      <w:pPr>
+        <w:ind w:left="1080" w:hanging="360"/>
+      </w:pPr>
+      <w:rPr>
+        <w:rFonts w:ascii="Wingdings" w:hAnsi="Wingdings" w:hint="default"/>
+      </w:rPr>
+    </w:lvl>
+    <w:lvl w:ilvl="3">
+      <w:start w:val="1"/>
+      <w:numFmt w:val="bullet"/>
+      <w:lvlText w:val=""/>
+      <w:lvlJc w:val="left"/>
+      <w:pPr>
+        <w:ind w:left="1440" w:hanging="360"/>
+      </w:pPr>
+      <w:rPr>
+        <w:rFonts w:ascii="Symbol" w:hAnsi="Symbol" w:hint="default"/>
+      </w:rPr>
+    </w:lvl>
+    <w:lvl w:ilvl="4">
+      <w:start w:val="1"/>
+      <w:numFmt w:val="bullet"/>
+      <w:lvlText w:val=""/>
+      <w:lvlJc w:val="left"/>
+      <w:pPr>
+        <w:ind w:left="1800" w:hanging="360"/>
+      </w:pPr>
+      <w:rPr>
+        <w:rFonts w:ascii="Symbol" w:hAnsi="Symbol" w:hint="default"/>
+      </w:rPr>
+    </w:lvl>
+    <w:lvl w:ilvl="5">
+      <w:start w:val="1"/>
+      <w:numFmt w:val="bullet"/>
+      <w:lvlText w:val=""/>
+      <w:lvlJc w:val="left"/>
+      <w:pPr>
+        <w:ind w:left="2160" w:hanging="360"/>
+      </w:pPr>
+      <w:rPr>
+        <w:rFonts w:ascii="Wingdings" w:hAnsi="Wingdings" w:hint="default"/>
+      </w:rPr>
+    </w:lvl>
+    <w:lvl w:ilvl="6">
+      <w:start w:val="1"/>
+      <w:numFmt w:val="bullet"/>
+      <w:lvlText w:val=""/>
+      <w:lvlJc w:val="left"/>
+      <w:pPr>
+        <w:ind w:left="2520" w:hanging="360"/>
+      </w:pPr>
+      <w:rPr>
+        <w:rFonts w:ascii="Wingdings" w:hAnsi="Wingdings" w:hint="default"/>
+      </w:rPr>
+    </w:lvl>
+    <w:lvl w:ilvl="7">
+      <w:start w:val="1"/>
+      <w:numFmt w:val="bullet"/>
+      <w:lvlText w:val=""/>
+      <w:lvlJc w:val="left"/>
+      <w:pPr>
+        <w:ind w:left="2880" w:hanging="360"/>
+      </w:pPr>
+      <w:rPr>
+        <w:rFonts w:ascii="Symbol" w:hAnsi="Symbol" w:hint="default"/>
+      </w:rPr>
+    </w:lvl>
+    <w:lvl w:ilvl="8">
+      <w:start w:val="1"/>
+      <w:numFmt w:val="bullet"/>
+      <w:lvlText w:val=""/>
+      <w:lvlJc w:val="left"/>
+      <w:pPr>
+        <w:ind w:left="3240" w:hanging="360"/>
+      </w:pPr>
+      <w:rPr>
+        <w:rFonts w:ascii="Symbol" w:hAnsi="Symbol" w:hint="default"/>
+      </w:rPr>
+    </w:lvl>
+  </w:abstractNum>
+  <w:abstractNum w:abstractNumId="5" w15:restartNumberingAfterBreak="0">
     <w:nsid w:val="38D20937"/>
     <w:multiLevelType w:val="hybridMultilevel"/>
     <w:tmpl w:val="7B8E8A78"/>
@@ -2142,7 +2582,7 @@
       </w:rPr>
     </w:lvl>
   </w:abstractNum>
-  <w:abstractNum w:abstractNumId="3" w15:restartNumberingAfterBreak="0">
+  <w:abstractNum w:abstractNumId="6" w15:restartNumberingAfterBreak="0">
     <w:nsid w:val="3BA26DB0"/>
     <w:multiLevelType w:val="hybridMultilevel"/>
     <w:tmpl w:val="A3A8DB0A"/>
@@ -2255,7 +2695,7 @@
       </w:rPr>
     </w:lvl>
   </w:abstractNum>
-  <w:abstractNum w:abstractNumId="4" w15:restartNumberingAfterBreak="0">
+  <w:abstractNum w:abstractNumId="7" w15:restartNumberingAfterBreak="0">
     <w:nsid w:val="3BE21D11"/>
     <w:multiLevelType w:val="hybridMultilevel"/>
     <w:tmpl w:val="EDDA8890"/>
@@ -2368,7 +2808,7 @@
       </w:rPr>
     </w:lvl>
   </w:abstractNum>
-  <w:abstractNum w:abstractNumId="5" w15:restartNumberingAfterBreak="0">
+  <w:abstractNum w:abstractNumId="8" w15:restartNumberingAfterBreak="0">
     <w:nsid w:val="4AE869C1"/>
     <w:multiLevelType w:val="hybridMultilevel"/>
     <w:tmpl w:val="F934EF6C"/>
@@ -2481,7 +2921,7 @@
       </w:rPr>
     </w:lvl>
   </w:abstractNum>
-  <w:abstractNum w:abstractNumId="6" w15:restartNumberingAfterBreak="0">
+  <w:abstractNum w:abstractNumId="9" w15:restartNumberingAfterBreak="0">
     <w:nsid w:val="4B763A71"/>
     <w:multiLevelType w:val="hybridMultilevel"/>
     <w:tmpl w:val="116E2E88"/>
@@ -2594,26 +3034,267 @@
       </w:rPr>
     </w:lvl>
   </w:abstractNum>
+  <w:abstractNum w:abstractNumId="10" w15:restartNumberingAfterBreak="0">
+    <w:nsid w:val="76057E86"/>
+    <w:multiLevelType w:val="multilevel"/>
+    <w:tmpl w:val="04090021"/>
+    <w:lvl w:ilvl="0">
+      <w:start w:val="1"/>
+      <w:numFmt w:val="bullet"/>
+      <w:lvlText w:val=""/>
+      <w:lvlJc w:val="left"/>
+      <w:pPr>
+        <w:ind w:left="360" w:hanging="360"/>
+      </w:pPr>
+      <w:rPr>
+        <w:rFonts w:ascii="Wingdings" w:hAnsi="Wingdings" w:hint="default"/>
+      </w:rPr>
+    </w:lvl>
+    <w:lvl w:ilvl="1">
+      <w:start w:val="1"/>
+      <w:numFmt w:val="bullet"/>
+      <w:lvlText w:val=""/>
+      <w:lvlJc w:val="left"/>
+      <w:pPr>
+        <w:ind w:left="720" w:hanging="360"/>
+      </w:pPr>
+      <w:rPr>
+        <w:rFonts w:ascii="Wingdings" w:hAnsi="Wingdings" w:hint="default"/>
+      </w:rPr>
+    </w:lvl>
+    <w:lvl w:ilvl="2">
+      <w:start w:val="1"/>
+      <w:numFmt w:val="bullet"/>
+      <w:lvlText w:val=""/>
+      <w:lvlJc w:val="left"/>
+      <w:pPr>
+        <w:ind w:left="1080" w:hanging="360"/>
+      </w:pPr>
+      <w:rPr>
+        <w:rFonts w:ascii="Wingdings" w:hAnsi="Wingdings" w:hint="default"/>
+      </w:rPr>
+    </w:lvl>
+    <w:lvl w:ilvl="3">
+      <w:start w:val="1"/>
+      <w:numFmt w:val="bullet"/>
+      <w:lvlText w:val=""/>
+      <w:lvlJc w:val="left"/>
+      <w:pPr>
+        <w:ind w:left="1440" w:hanging="360"/>
+      </w:pPr>
+      <w:rPr>
+        <w:rFonts w:ascii="Symbol" w:hAnsi="Symbol" w:hint="default"/>
+      </w:rPr>
+    </w:lvl>
+    <w:lvl w:ilvl="4">
+      <w:start w:val="1"/>
+      <w:numFmt w:val="bullet"/>
+      <w:lvlText w:val=""/>
+      <w:lvlJc w:val="left"/>
+      <w:pPr>
+        <w:ind w:left="1800" w:hanging="360"/>
+      </w:pPr>
+      <w:rPr>
+        <w:rFonts w:ascii="Symbol" w:hAnsi="Symbol" w:hint="default"/>
+      </w:rPr>
+    </w:lvl>
+    <w:lvl w:ilvl="5">
+      <w:start w:val="1"/>
+      <w:numFmt w:val="bullet"/>
+      <w:lvlText w:val=""/>
+      <w:lvlJc w:val="left"/>
+      <w:pPr>
+        <w:ind w:left="2160" w:hanging="360"/>
+      </w:pPr>
+      <w:rPr>
+        <w:rFonts w:ascii="Wingdings" w:hAnsi="Wingdings" w:hint="default"/>
+      </w:rPr>
+    </w:lvl>
+    <w:lvl w:ilvl="6">
+      <w:start w:val="1"/>
+      <w:numFmt w:val="bullet"/>
+      <w:lvlText w:val=""/>
+      <w:lvlJc w:val="left"/>
+      <w:pPr>
+        <w:ind w:left="2520" w:hanging="360"/>
+      </w:pPr>
+      <w:rPr>
+        <w:rFonts w:ascii="Wingdings" w:hAnsi="Wingdings" w:hint="default"/>
+      </w:rPr>
+    </w:lvl>
+    <w:lvl w:ilvl="7">
+      <w:start w:val="1"/>
+      <w:numFmt w:val="bullet"/>
+      <w:lvlText w:val=""/>
+      <w:lvlJc w:val="left"/>
+      <w:pPr>
+        <w:ind w:left="2880" w:hanging="360"/>
+      </w:pPr>
+      <w:rPr>
+        <w:rFonts w:ascii="Symbol" w:hAnsi="Symbol" w:hint="default"/>
+      </w:rPr>
+    </w:lvl>
+    <w:lvl w:ilvl="8">
+      <w:start w:val="1"/>
+      <w:numFmt w:val="bullet"/>
+      <w:lvlText w:val=""/>
+      <w:lvlJc w:val="left"/>
+      <w:pPr>
+        <w:ind w:left="3240" w:hanging="360"/>
+      </w:pPr>
+      <w:rPr>
+        <w:rFonts w:ascii="Symbol" w:hAnsi="Symbol" w:hint="default"/>
+      </w:rPr>
+    </w:lvl>
+  </w:abstractNum>
+  <w:abstractNum w:abstractNumId="11" w15:restartNumberingAfterBreak="0">
+    <w:nsid w:val="7D3C411C"/>
+    <w:multiLevelType w:val="multilevel"/>
+    <w:tmpl w:val="04090021"/>
+    <w:lvl w:ilvl="0">
+      <w:start w:val="1"/>
+      <w:numFmt w:val="bullet"/>
+      <w:lvlText w:val=""/>
+      <w:lvlJc w:val="left"/>
+      <w:pPr>
+        <w:ind w:left="360" w:hanging="360"/>
+      </w:pPr>
+      <w:rPr>
+        <w:rFonts w:ascii="Wingdings" w:hAnsi="Wingdings" w:hint="default"/>
+      </w:rPr>
+    </w:lvl>
+    <w:lvl w:ilvl="1">
+      <w:start w:val="1"/>
+      <w:numFmt w:val="bullet"/>
+      <w:lvlText w:val=""/>
+      <w:lvlJc w:val="left"/>
+      <w:pPr>
+        <w:ind w:left="720" w:hanging="360"/>
+      </w:pPr>
+      <w:rPr>
+        <w:rFonts w:ascii="Wingdings" w:hAnsi="Wingdings" w:hint="default"/>
+      </w:rPr>
+    </w:lvl>
+    <w:lvl w:ilvl="2">
+      <w:start w:val="1"/>
+      <w:numFmt w:val="bullet"/>
+      <w:lvlText w:val=""/>
+      <w:lvlJc w:val="left"/>
+      <w:pPr>
+        <w:ind w:left="1080" w:hanging="360"/>
+      </w:pPr>
+      <w:rPr>
+        <w:rFonts w:ascii="Wingdings" w:hAnsi="Wingdings" w:hint="default"/>
+      </w:rPr>
+    </w:lvl>
+    <w:lvl w:ilvl="3">
+      <w:start w:val="1"/>
+      <w:numFmt w:val="bullet"/>
+      <w:lvlText w:val=""/>
+      <w:lvlJc w:val="left"/>
+      <w:pPr>
+        <w:ind w:left="1440" w:hanging="360"/>
+      </w:pPr>
+      <w:rPr>
+        <w:rFonts w:ascii="Symbol" w:hAnsi="Symbol" w:hint="default"/>
+      </w:rPr>
+    </w:lvl>
+    <w:lvl w:ilvl="4">
+      <w:start w:val="1"/>
+      <w:numFmt w:val="bullet"/>
+      <w:lvlText w:val=""/>
+      <w:lvlJc w:val="left"/>
+      <w:pPr>
+        <w:ind w:left="1800" w:hanging="360"/>
+      </w:pPr>
+      <w:rPr>
+        <w:rFonts w:ascii="Symbol" w:hAnsi="Symbol" w:hint="default"/>
+      </w:rPr>
+    </w:lvl>
+    <w:lvl w:ilvl="5">
+      <w:start w:val="1"/>
+      <w:numFmt w:val="bullet"/>
+      <w:lvlText w:val=""/>
+      <w:lvlJc w:val="left"/>
+      <w:pPr>
+        <w:ind w:left="2160" w:hanging="360"/>
+      </w:pPr>
+      <w:rPr>
+        <w:rFonts w:ascii="Wingdings" w:hAnsi="Wingdings" w:hint="default"/>
+      </w:rPr>
+    </w:lvl>
+    <w:lvl w:ilvl="6">
+      <w:start w:val="1"/>
+      <w:numFmt w:val="bullet"/>
+      <w:lvlText w:val=""/>
+      <w:lvlJc w:val="left"/>
+      <w:pPr>
+        <w:ind w:left="2520" w:hanging="360"/>
+      </w:pPr>
+      <w:rPr>
+        <w:rFonts w:ascii="Wingdings" w:hAnsi="Wingdings" w:hint="default"/>
+      </w:rPr>
+    </w:lvl>
+    <w:lvl w:ilvl="7">
+      <w:start w:val="1"/>
+      <w:numFmt w:val="bullet"/>
+      <w:lvlText w:val=""/>
+      <w:lvlJc w:val="left"/>
+      <w:pPr>
+        <w:ind w:left="2880" w:hanging="360"/>
+      </w:pPr>
+      <w:rPr>
+        <w:rFonts w:ascii="Symbol" w:hAnsi="Symbol" w:hint="default"/>
+      </w:rPr>
+    </w:lvl>
+    <w:lvl w:ilvl="8">
+      <w:start w:val="1"/>
+      <w:numFmt w:val="bullet"/>
+      <w:lvlText w:val=""/>
+      <w:lvlJc w:val="left"/>
+      <w:pPr>
+        <w:ind w:left="3240" w:hanging="360"/>
+      </w:pPr>
+      <w:rPr>
+        <w:rFonts w:ascii="Symbol" w:hAnsi="Symbol" w:hint="default"/>
+      </w:rPr>
+    </w:lvl>
+  </w:abstractNum>
   <w:num w:numId="1" w16cid:durableId="828983495">
-    <w:abstractNumId w:val="2"/>
+    <w:abstractNumId w:val="5"/>
   </w:num>
   <w:num w:numId="2" w16cid:durableId="1430586510">
-    <w:abstractNumId w:val="5"/>
+    <w:abstractNumId w:val="8"/>
   </w:num>
   <w:num w:numId="3" w16cid:durableId="1255551966">
-    <w:abstractNumId w:val="6"/>
+    <w:abstractNumId w:val="9"/>
   </w:num>
   <w:num w:numId="4" w16cid:durableId="277488804">
     <w:abstractNumId w:val="0"/>
   </w:num>
   <w:num w:numId="5" w16cid:durableId="622157060">
-    <w:abstractNumId w:val="3"/>
+    <w:abstractNumId w:val="6"/>
   </w:num>
   <w:num w:numId="6" w16cid:durableId="1491410301">
     <w:abstractNumId w:val="1"/>
   </w:num>
   <w:num w:numId="7" w16cid:durableId="1091124580">
+    <w:abstractNumId w:val="7"/>
+  </w:num>
+  <w:num w:numId="8" w16cid:durableId="1757289571">
+    <w:abstractNumId w:val="3"/>
+  </w:num>
+  <w:num w:numId="9" w16cid:durableId="882055674">
     <w:abstractNumId w:val="4"/>
+  </w:num>
+  <w:num w:numId="10" w16cid:durableId="204148729">
+    <w:abstractNumId w:val="10"/>
+  </w:num>
+  <w:num w:numId="11" w16cid:durableId="422185087">
+    <w:abstractNumId w:val="2"/>
+  </w:num>
+  <w:num w:numId="12" w16cid:durableId="1672827428">
+    <w:abstractNumId w:val="11"/>
   </w:num>
   <w:numIdMacAtCleanup w:val="4"/>
 </w:numbering>

</xml_diff>